<commit_message>
Added some more textual changes.
</commit_message>
<xml_diff>
--- a/Thesis Draft - Daan Luttik - MBA.docx
+++ b/Thesis Draft - Daan Luttik - MBA.docx
@@ -16852,34 +16852,104 @@
     </w:p>
     <w:p>
       <w:r>
-        <w:t>The most consistently identified barrier to adopting agentic AI is not technical but organizational: the capacity to change. This encompasses the level of AI understanding within the organization, employees’ openness to new ways of working, and the organizational ability to act quickly under uncertainty.</w:t>
-      </w:r>
-    </w:p>
-    <w:p>
-      <w:r>
-        <w:t>Resistance emerged as the dominant theme across the data (28 code applications, 14 documents). Interviewee 12 described organizational change as inherently difficult:</w:t>
-      </w:r>
-    </w:p>
-    <w:p>
-      <w:pPr>
-        <w:ind w:left="720"/>
-      </w:pPr>
-      <w:r>
-        <w:t>“Change is frigging hard. It’s hard for us as individuals. Generally speaking, individuals don’t like to change, particularly if they’ve been doing something a certain way, and it works well.”</w:t>
-      </w:r>
-    </w:p>
-    <w:p>
+        <w:t xml:space="preserve">The most consistently identified barrier to adopting agentic AI is not technical but organizational: the capacity to change. This encompasses </w:t>
+      </w:r>
+      <w:r>
+        <w:t>the e</w:t>
+      </w:r>
+      <w:r>
+        <w:t>mployees’ openness to new ways of working</w:t>
+      </w:r>
+      <w:r>
+        <w:t xml:space="preserve">, </w:t>
+      </w:r>
+      <w:r>
+        <w:t>the level of AI understanding</w:t>
+      </w:r>
+      <w:r>
+        <w:t xml:space="preserve"> (typically referred to as AI literacy)</w:t>
+      </w:r>
+      <w:r>
+        <w:t xml:space="preserve"> within the organization</w:t>
+      </w:r>
+      <w:r>
+        <w:t xml:space="preserve">, </w:t>
+      </w:r>
+      <w:r>
+        <w:t xml:space="preserve">and the </w:t>
+      </w:r>
+      <w:commentRangeStart w:id="185"/>
+      <w:r>
+        <w:t>organizational ability to act quickly</w:t>
+      </w:r>
+      <w:r>
+        <w:t xml:space="preserve"> under </w:t>
+      </w:r>
+      <w:r>
+        <w:t>uncertainty</w:t>
+      </w:r>
+      <w:commentRangeEnd w:id="185"/>
+      <w:r>
+        <w:rPr>
+          <w:rStyle w:val="CommentReference"/>
+          <w:sz w:val="22"/>
+          <w:szCs w:val="22"/>
+        </w:rPr>
+        <w:commentReference w:id="185"/>
+      </w:r>
+      <w:r>
+        <w:t>.</w:t>
+      </w:r>
+    </w:p>
+    <w:p>
+      <w:r>
+        <w:t xml:space="preserve">Resistance emerged as </w:t>
+      </w:r>
+      <w:r>
+        <w:t>a</w:t>
+      </w:r>
+      <w:r>
+        <w:t xml:space="preserve"> dominant theme across the data. Interviewee 12 described organizational change as inherently difficult:</w:t>
+      </w:r>
+    </w:p>
+    <w:p>
+      <w:pPr>
+        <w:pStyle w:val="Quote"/>
+      </w:pPr>
+      <w:r>
+        <w:t>“Change is frigging hard. It’s hard for us as individuals. Generally speaking, individuals don’t like to change, particularly if they’ve been doing something a certain way, and it works well</w:t>
+      </w:r>
+      <w:r>
+        <w:t xml:space="preserve">, and it works well, and they know it, and they’re </w:t>
+      </w:r>
       <w:r>
         <w:lastRenderedPageBreak/>
-        <w:t>This resistance intensifies at the organizational level. Interviewee 12 continued:</w:t>
-      </w:r>
-    </w:p>
-    <w:p>
-      <w:pPr>
-        <w:ind w:left="720"/>
-      </w:pPr>
-      <w:r>
-        <w:t>“That challenge gets multiplied when you start talking about an organization … you’ve got all multiple people, you’ve got politics, existing incentives, existing processes.”</w:t>
+        <w:t>comfortable.</w:t>
+      </w:r>
+      <w:r>
+        <w:t xml:space="preserve"> […] </w:t>
+      </w:r>
+      <w:r>
+        <w:t>That challenge gets multiplied when you start talking about an organization … you’ve got all multiple people, you’ve got politics, existing incentives, existing processes.”</w:t>
+      </w:r>
+    </w:p>
+    <w:p>
+      <w:r>
+        <w:t>Providing a complementary perspective interviewee 4 noted the resistance to learning how to work with AI:</w:t>
+      </w:r>
+    </w:p>
+    <w:p>
+      <w:pPr>
+        <w:pStyle w:val="Quote"/>
+      </w:pPr>
+      <w:r>
+        <w:t>“T</w:t>
+      </w:r>
+      <w:r>
+        <w:t>hey</w:t>
+      </w:r>
+      <w:r>
+        <w:t xml:space="preserve"> were very skeptical. Uh, “Oh, I need to learn a new thing while running my business.” Well, if you learn these new things, you can do ten times, ten times besides the things that you do. Uh, so got a lot of pushback there.</w:t>
       </w:r>
     </w:p>
     <w:p>
@@ -16893,7 +16963,7 @@
       </w:r>
     </w:p>
     <w:p>
-      <w:ins w:id="185" w:author="Claude" w:date="2026-06-01T00:00:00Z">
+      <w:ins w:id="186" w:author="Claude" w:date="2026-06-01T00:00:00Z">
         <w:r>
           <w:rPr>
             <w:i/>
@@ -16916,12 +16986,15 @@
     </w:p>
     <w:p>
       <w:r>
-        <w:t>In response to these barriers, the data shows that experimenting with AI (37 code applications, 17 documents) and educating and training (28 code applications, 14 documents) are the two dominant mechanisms through which managers build organizational capacity to change. Rather than waiting for perfect conditions, effective managers create structured opportunities to learn through doing. Interviewee 6 summarized this orientation: “I’d rather have something live and test and improve than have two years down the road and then finally have something live.” Interviewee 13 described enabling this at the team level: “Provide freedom to experiment and don’t set this atmosphere of fear that AI is going to replace you.”</w:t>
-      </w:r>
-    </w:p>
-    <w:p>
+        <w:t xml:space="preserve">In response to these barriers, the data shows that experimenting with AI (37 code applications, 17 documents) and educating and training (28 code applications, 14 documents) are the two dominant mechanisms through which managers build organizational capacity to </w:t>
+      </w:r>
       <w:r>
         <w:lastRenderedPageBreak/>
+        <w:t>change. Rather than waiting for perfect conditions, effective managers create structured opportunities to learn through doing. Interviewee 6 summarized this orientation: “I’d rather have something live and test and improve than have two years down the road and then finally have something live.” Interviewee 13 described enabling this at the team level: “Provide freedom to experiment and don’t set this atmosphere of fear that AI is going to replace you.”</w:t>
+      </w:r>
+    </w:p>
+    <w:p>
+      <w:r>
         <w:t>However, education alone is insufficient to sustain change. Interviewee 17 observed a common pattern encountered in her training work: “After two or three trainings companies basically stop, because then they go back to what they started with.” Sustained capacity-building requires not just initial education but ongoing structural embedding of learning.</w:t>
       </w:r>
     </w:p>
@@ -16932,8 +17005,8 @@
           <w:color w:val="24292E"/>
         </w:rPr>
       </w:pPr>
-      <w:bookmarkStart w:id="186" w:name="_xw6d9a4ef7wu" w:colFirst="0" w:colLast="0"/>
-      <w:bookmarkEnd w:id="186"/>
+      <w:bookmarkStart w:id="187" w:name="_xw6d9a4ef7wu" w:colFirst="0" w:colLast="0"/>
+      <w:bookmarkEnd w:id="187"/>
       <w:r>
         <w:rPr>
           <w:color w:val="24292E"/>
@@ -16968,16 +17041,16 @@
         <w:ind w:left="720"/>
       </w:pPr>
       <w:r>
-        <w:t>“The stupidest example is … people want to understand their marketing data better. And it’s really just like you have 20 different sources, you don’t know how to connect them, you don’t know how to put this all together. … The culprit is really still they don’t understand what the issues are.”</w:t>
-      </w:r>
-    </w:p>
-    <w:p>
-      <w:r>
-        <w:t xml:space="preserve">The problem is not data access per se, but the analytical capacity to know what data is needed, in what form, and for what purpose. Interviewee 1 noted that this type of deep process </w:t>
+        <w:t xml:space="preserve">“The stupidest example is … people want to understand their marketing data better. And it’s really just like you have 20 different sources, you don’t know how to </w:t>
       </w:r>
       <w:r>
         <w:lastRenderedPageBreak/>
-        <w:t>knowledge — a feel for system logic — is precisely what is hardest to augment with AI, because it requires a level of structured thinking that many teams have not yet developed.</w:t>
+        <w:t>connect them, you don’t know how to put this all together. … The culprit is really still they don’t understand what the issues are.”</w:t>
+      </w:r>
+    </w:p>
+    <w:p>
+      <w:r>
+        <w:t>The problem is not data access per se, but the analytical capacity to know what data is needed, in what form, and for what purpose. Interviewee 1 noted that this type of deep process knowledge — a feel for system logic — is precisely what is hardest to augment with AI, because it requires a level of structured thinking that many teams have not yet developed.</w:t>
       </w:r>
     </w:p>
     <w:p>
@@ -16994,8 +17067,8 @@
       <w:pPr>
         <w:pStyle w:val="Heading3"/>
       </w:pPr>
-      <w:bookmarkStart w:id="187" w:name="_qy9fnmmddxdy" w:colFirst="0" w:colLast="0"/>
-      <w:bookmarkEnd w:id="187"/>
+      <w:bookmarkStart w:id="188" w:name="_qy9fnmmddxdy" w:colFirst="0" w:colLast="0"/>
+      <w:bookmarkEnd w:id="188"/>
       <w:r>
         <w:t>4.2.3</w:t>
       </w:r>
@@ -17012,7 +17085,11 @@
     </w:p>
     <w:p>
       <w:r>
-        <w:t>Individual AI champions emerged as a disproportionately influential factor (5 code applications but high narrative weight across the corpus). An AI champion is a person who, often without formal mandate, drives AI initiatives forward through personal initiative, visible results, and internal advocacy. Interviewee 9 described a vivid example from her organization:</w:t>
+        <w:t xml:space="preserve">Individual AI champions emerged as a disproportionately influential factor (5 code applications but high narrative weight across the corpus). An AI champion is a person who, </w:t>
+      </w:r>
+      <w:r>
+        <w:lastRenderedPageBreak/>
+        <w:t>often without formal mandate, drives AI initiatives forward through personal initiative, visible results, and internal advocacy. Interviewee 9 described a vivid example from her organization:</w:t>
       </w:r>
     </w:p>
     <w:p>
@@ -17020,7 +17097,6 @@
         <w:ind w:left="720"/>
       </w:pPr>
       <w:r>
-        <w:lastRenderedPageBreak/>
         <w:t>“Affinity Hub was created originally by … our global creative director that dabbles in dev, and he created it, and it’s like blown up, and so now there’s millions of dollars of funding.”</w:t>
       </w:r>
     </w:p>
@@ -17035,7 +17111,7 @@
       </w:r>
     </w:p>
     <w:p>
-      <w:ins w:id="188" w:author="Claude" w:date="2026-06-01T00:00:00Z">
+      <w:ins w:id="189" w:author="Claude" w:date="2026-06-01T00:00:00Z">
         <w:r>
           <w:rPr>
             <w:i/>
@@ -17049,12 +17125,15 @@
     </w:p>
     <w:p>
       <w:r>
-        <w:t>The process of bringing people along — change management at the team and organizational level — was one of the most richly coded themes in this block (24 code applications, 13 documents). Interviewee 6 captured the essential managerial move: “This is the vision. This is where we’re going. Help me get there.” Interviewee 13 described a practical approach: using lighthouse projects as demonstration cases that make the value of AI tangible to skeptical colleagues. “Show them the first one that can be automated or made a lot quicker … then, well, then often they understand much better what the use cases would be.”</w:t>
-      </w:r>
-    </w:p>
-    <w:p>
+        <w:t xml:space="preserve">The process of bringing people along — change management at the team and organizational level — was one of the most richly coded themes in this block (24 code applications, 13 documents). Interviewee 6 captured the essential managerial move: “This is the vision. This is where we’re going. Help me get there.” Interviewee 13 described a practical approach: using lighthouse projects as demonstration cases that make the value of AI tangible to </w:t>
+      </w:r>
       <w:r>
         <w:lastRenderedPageBreak/>
+        <w:t>skeptical colleagues. “Show them the first one that can be automated or made a lot quicker … then, well, then often they understand much better what the use cases would be.”</w:t>
+      </w:r>
+    </w:p>
+    <w:p>
+      <w:r>
         <w:t>Alongside these enabling behaviors, bureaucratic governance emerged as a significant opposing force (21 code applications, 13 documents). Governance friction appeared in several forms: IT security and procurement processes slowing deployment, legal and compliance concerns blocking tool use, and organizational politics preventing experimentation. Interviewee 13 observed a pattern in large enterprises:</w:t>
       </w:r>
     </w:p>
@@ -17083,8 +17162,8 @@
           <w:color w:val="00312A"/>
         </w:rPr>
       </w:pPr>
-      <w:bookmarkStart w:id="189" w:name="_hojo1f9yxiy" w:colFirst="0" w:colLast="0"/>
-      <w:bookmarkEnd w:id="189"/>
+      <w:bookmarkStart w:id="190" w:name="_hojo1f9yxiy" w:colFirst="0" w:colLast="0"/>
+      <w:bookmarkEnd w:id="190"/>
       <w:r>
         <w:rPr>
           <w:color w:val="00312A"/>
@@ -17106,8 +17185,8 @@
           <w:color w:val="00312A"/>
         </w:rPr>
       </w:pPr>
-      <w:bookmarkStart w:id="190" w:name="_iuvuby6hzug8" w:colFirst="0" w:colLast="0"/>
-      <w:bookmarkEnd w:id="190"/>
+      <w:bookmarkStart w:id="191" w:name="_iuvuby6hzug8" w:colFirst="0" w:colLast="0"/>
+      <w:bookmarkEnd w:id="191"/>
       <w:r>
         <w:rPr>
           <w:color w:val="00312A"/>
@@ -17432,8 +17511,8 @@
           <w:color w:val="00312A"/>
         </w:rPr>
       </w:pPr>
-      <w:bookmarkStart w:id="191" w:name="_niqmcast9jsc" w:colFirst="0" w:colLast="0"/>
-      <w:bookmarkEnd w:id="191"/>
+      <w:bookmarkStart w:id="192" w:name="_niqmcast9jsc" w:colFirst="0" w:colLast="0"/>
+      <w:bookmarkEnd w:id="192"/>
       <w:r>
         <w:rPr>
           <w:color w:val="00312A"/>
@@ -17541,8 +17620,8 @@
           <w:color w:val="00312A"/>
         </w:rPr>
       </w:pPr>
-      <w:bookmarkStart w:id="192" w:name="_d3o8hfs61axc" w:colFirst="0" w:colLast="0"/>
-      <w:bookmarkEnd w:id="192"/>
+      <w:bookmarkStart w:id="193" w:name="_d3o8hfs61axc" w:colFirst="0" w:colLast="0"/>
+      <w:bookmarkEnd w:id="193"/>
       <w:r>
         <w:rPr>
           <w:color w:val="00312A"/>
@@ -17556,14 +17635,14 @@
         <w:tab/>
         <w:t xml:space="preserve">Value </w:t>
       </w:r>
-      <w:commentRangeStart w:id="193"/>
+      <w:commentRangeStart w:id="194"/>
       <w:r>
         <w:rPr>
           <w:color w:val="00312A"/>
         </w:rPr>
         <w:t>Outcomes</w:t>
       </w:r>
-      <w:commentRangeEnd w:id="193"/>
+      <w:commentRangeEnd w:id="194"/>
       <w:r>
         <w:rPr>
           <w:rStyle w:val="CommentReference"/>
@@ -17571,7 +17650,7 @@
           <w:sz w:val="22"/>
           <w:szCs w:val="22"/>
         </w:rPr>
-        <w:commentReference w:id="193"/>
+        <w:commentReference w:id="194"/>
       </w:r>
     </w:p>
     <w:p>
@@ -17614,8 +17693,8 @@
           <w:color w:val="00312A"/>
         </w:rPr>
       </w:pPr>
-      <w:bookmarkStart w:id="194" w:name="_psp9v76zeahl" w:colFirst="0" w:colLast="0"/>
-      <w:bookmarkEnd w:id="194"/>
+      <w:bookmarkStart w:id="195" w:name="_psp9v76zeahl" w:colFirst="0" w:colLast="0"/>
+      <w:bookmarkEnd w:id="195"/>
       <w:r>
         <w:rPr>
           <w:color w:val="00312A"/>
@@ -17831,8 +17910,8 @@
           <w:color w:val="00312A"/>
         </w:rPr>
       </w:pPr>
-      <w:bookmarkStart w:id="195" w:name="_vkh433kqk3oi" w:colFirst="0" w:colLast="0"/>
-      <w:bookmarkEnd w:id="195"/>
+      <w:bookmarkStart w:id="196" w:name="_vkh433kqk3oi" w:colFirst="0" w:colLast="0"/>
+      <w:bookmarkEnd w:id="196"/>
       <w:r>
         <w:rPr>
           <w:color w:val="00312A"/>
@@ -17947,8 +18026,8 @@
           <w:highlight w:val="yellow"/>
         </w:rPr>
       </w:pPr>
-      <w:bookmarkStart w:id="196" w:name="_i62wq5quevoe" w:colFirst="0" w:colLast="0"/>
-      <w:bookmarkEnd w:id="196"/>
+      <w:bookmarkStart w:id="197" w:name="_i62wq5quevoe" w:colFirst="0" w:colLast="0"/>
+      <w:bookmarkEnd w:id="197"/>
       <w:r>
         <w:rPr>
           <w:color w:val="00312A"/>
@@ -18411,9 +18490,9 @@
           <w:color w:val="00312A"/>
         </w:rPr>
       </w:pPr>
-      <w:bookmarkStart w:id="197" w:name="_bi3ndv3n11ww" w:colFirst="0" w:colLast="0"/>
-      <w:bookmarkEnd w:id="197"/>
-      <w:commentRangeStart w:id="198"/>
+      <w:bookmarkStart w:id="198" w:name="_bi3ndv3n11ww" w:colFirst="0" w:colLast="0"/>
+      <w:bookmarkEnd w:id="198"/>
+      <w:commentRangeStart w:id="199"/>
       <w:r>
         <w:rPr>
           <w:color w:val="00312A"/>
@@ -18441,7 +18520,7 @@
         </w:rPr>
         <w:t>(</w:t>
       </w:r>
-      <w:hyperlink r:id="rId19">
+      <w:hyperlink r:id="rId20">
         <w:r>
           <w:rPr>
             <w:color w:val="00312A"/>
@@ -18456,7 +18535,7 @@
         </w:rPr>
         <w:t>)... seek additional data</w:t>
       </w:r>
-      <w:commentRangeEnd w:id="198"/>
+      <w:commentRangeEnd w:id="199"/>
       <w:r>
         <w:rPr>
           <w:rStyle w:val="CommentReference"/>
@@ -18464,7 +18543,7 @@
           <w:sz w:val="22"/>
           <w:szCs w:val="22"/>
         </w:rPr>
-        <w:commentReference w:id="198"/>
+        <w:commentReference w:id="199"/>
       </w:r>
     </w:p>
     <w:p>
@@ -18475,8 +18554,8 @@
           <w:color w:val="00312A"/>
         </w:rPr>
       </w:pPr>
-      <w:bookmarkStart w:id="199" w:name="_q5epuhs454bw" w:colFirst="0" w:colLast="0"/>
-      <w:bookmarkEnd w:id="199"/>
+      <w:bookmarkStart w:id="200" w:name="_q5epuhs454bw" w:colFirst="0" w:colLast="0"/>
+      <w:bookmarkEnd w:id="200"/>
       <w:r>
         <w:br w:type="page"/>
       </w:r>
@@ -18527,8 +18606,8 @@
           <w:color w:val="00312A"/>
         </w:rPr>
       </w:pPr>
-      <w:bookmarkStart w:id="200" w:name="_7rbdabewznnc" w:colFirst="0" w:colLast="0"/>
-      <w:bookmarkEnd w:id="200"/>
+      <w:bookmarkStart w:id="201" w:name="_7rbdabewznnc" w:colFirst="0" w:colLast="0"/>
+      <w:bookmarkEnd w:id="201"/>
       <w:r>
         <w:rPr>
           <w:color w:val="00312A"/>
@@ -18557,8 +18636,8 @@
           <w:color w:val="00312A"/>
         </w:rPr>
       </w:pPr>
-      <w:bookmarkStart w:id="201" w:name="_vqcghgtkedix" w:colFirst="0" w:colLast="0"/>
-      <w:bookmarkEnd w:id="201"/>
+      <w:bookmarkStart w:id="202" w:name="_vqcghgtkedix" w:colFirst="0" w:colLast="0"/>
+      <w:bookmarkEnd w:id="202"/>
       <w:r>
         <w:rPr>
           <w:color w:val="00312A"/>
@@ -18631,8 +18710,8 @@
           <w:color w:val="00312A"/>
         </w:rPr>
       </w:pPr>
-      <w:bookmarkStart w:id="202" w:name="_mnyukkjx9iq" w:colFirst="0" w:colLast="0"/>
-      <w:bookmarkEnd w:id="202"/>
+      <w:bookmarkStart w:id="203" w:name="_mnyukkjx9iq" w:colFirst="0" w:colLast="0"/>
+      <w:bookmarkEnd w:id="203"/>
       <w:r>
         <w:rPr>
           <w:color w:val="00312A"/>
@@ -18711,8 +18790,8 @@
       <w:pPr>
         <w:pStyle w:val="Heading1"/>
       </w:pPr>
-      <w:bookmarkStart w:id="203" w:name="_dd6zel2y4t5x" w:colFirst="0" w:colLast="0"/>
-      <w:bookmarkEnd w:id="203"/>
+      <w:bookmarkStart w:id="204" w:name="_dd6zel2y4t5x" w:colFirst="0" w:colLast="0"/>
+      <w:bookmarkEnd w:id="204"/>
       <w:r>
         <w:t>6.</w:t>
       </w:r>
@@ -18725,8 +18804,8 @@
       <w:pPr>
         <w:pStyle w:val="Heading1"/>
       </w:pPr>
-      <w:bookmarkStart w:id="204" w:name="_9375lqp6ztft" w:colFirst="0" w:colLast="0"/>
-      <w:bookmarkEnd w:id="204"/>
+      <w:bookmarkStart w:id="205" w:name="_9375lqp6ztft" w:colFirst="0" w:colLast="0"/>
+      <w:bookmarkEnd w:id="205"/>
       <w:r>
         <w:br w:type="page"/>
       </w:r>
@@ -18739,8 +18818,8 @@
           <w:highlight w:val="white"/>
         </w:rPr>
       </w:pPr>
-      <w:bookmarkStart w:id="205" w:name="_kgmnd1ymad1c" w:colFirst="0" w:colLast="0"/>
-      <w:bookmarkEnd w:id="205"/>
+      <w:bookmarkStart w:id="206" w:name="_kgmnd1ymad1c" w:colFirst="0" w:colLast="0"/>
+      <w:bookmarkEnd w:id="206"/>
       <w:r>
         <w:lastRenderedPageBreak/>
         <w:t>7.</w:t>
@@ -18850,7 +18929,7 @@
         </w:rPr>
         <w:t xml:space="preserve">. Anthropic. </w:t>
       </w:r>
-      <w:hyperlink r:id="rId20">
+      <w:hyperlink r:id="rId21">
         <w:r>
           <w:rPr>
             <w:color w:val="1155CC"/>
@@ -18889,7 +18968,7 @@
         </w:rPr>
         <w:t xml:space="preserve">. Anthropic Engineering.  </w:t>
       </w:r>
-      <w:hyperlink r:id="rId21">
+      <w:hyperlink r:id="rId22">
         <w:r>
           <w:rPr>
             <w:color w:val="1155CC"/>
@@ -19134,7 +19213,7 @@
         </w:rPr>
         <w:t xml:space="preserve">. Claude. </w:t>
       </w:r>
-      <w:hyperlink r:id="rId22">
+      <w:hyperlink r:id="rId23">
         <w:r>
           <w:rPr>
             <w:color w:val="1155CC"/>
@@ -19200,7 +19279,7 @@
         </w:rPr>
         <w:t xml:space="preserve"> ChatGPT. </w:t>
       </w:r>
-      <w:hyperlink r:id="rId23">
+      <w:hyperlink r:id="rId24">
         <w:r>
           <w:rPr>
             <w:color w:val="1155CC"/>
@@ -19221,7 +19300,7 @@
           <w:highlight w:val="white"/>
         </w:rPr>
       </w:pPr>
-      <w:commentRangeStart w:id="206"/>
+      <w:commentRangeStart w:id="207"/>
       <w:r>
         <w:rPr>
           <w:strike/>
@@ -19258,7 +19337,7 @@
         </w:rPr>
         <w:t xml:space="preserve">. </w:t>
       </w:r>
-      <w:hyperlink r:id="rId24">
+      <w:hyperlink r:id="rId25">
         <w:r>
           <w:rPr>
             <w:strike/>
@@ -19286,7 +19365,7 @@
         </w:rPr>
         <w:t xml:space="preserve"> </w:t>
       </w:r>
-      <w:commentRangeEnd w:id="206"/>
+      <w:commentRangeEnd w:id="207"/>
       <w:r>
         <w:rPr>
           <w:rStyle w:val="CommentReference"/>
@@ -19295,7 +19374,7 @@
           <w:szCs w:val="20"/>
           <w:highlight w:val="white"/>
         </w:rPr>
-        <w:commentReference w:id="206"/>
+        <w:commentReference w:id="207"/>
       </w:r>
     </w:p>
     <w:p>
@@ -19308,7 +19387,7 @@
           <w:highlight w:val="white"/>
         </w:rPr>
       </w:pPr>
-      <w:commentRangeStart w:id="207"/>
+      <w:commentRangeStart w:id="208"/>
       <w:r>
         <w:rPr>
           <w:strike/>
@@ -19356,7 +19435,7 @@
         </w:rPr>
         <w:t xml:space="preserve">(1), 38-68. </w:t>
       </w:r>
-      <w:commentRangeEnd w:id="207"/>
+      <w:commentRangeEnd w:id="208"/>
       <w:r>
         <w:rPr>
           <w:rStyle w:val="CommentReference"/>
@@ -19365,7 +19444,7 @@
           <w:szCs w:val="20"/>
           <w:highlight w:val="white"/>
         </w:rPr>
-        <w:commentReference w:id="207"/>
+        <w:commentReference w:id="208"/>
       </w:r>
     </w:p>
     <w:p>
@@ -19395,7 +19474,7 @@
         </w:rPr>
         <w:t xml:space="preserve">. </w:t>
       </w:r>
-      <w:hyperlink r:id="rId25">
+      <w:hyperlink r:id="rId26">
         <w:r>
           <w:rPr>
             <w:color w:val="1155CC"/>
@@ -19831,7 +19910,7 @@
       <w:r>
         <w:t>Holmström, J. (2022). From AI to digital transformation: The AI readiness framework. Business Horizons, 65(3), 329–339.</w:t>
       </w:r>
-      <w:hyperlink r:id="rId26">
+      <w:hyperlink r:id="rId27">
         <w:r>
           <w:rPr>
             <w:u w:val="single"/>
@@ -19839,7 +19918,7 @@
           <w:t xml:space="preserve"> </w:t>
         </w:r>
       </w:hyperlink>
-      <w:hyperlink r:id="rId27">
+      <w:hyperlink r:id="rId28">
         <w:r>
           <w:rPr>
             <w:color w:val="1155CC"/>
@@ -19856,7 +19935,7 @@
           <w:strike/>
         </w:rPr>
       </w:pPr>
-      <w:commentRangeStart w:id="208"/>
+      <w:commentRangeStart w:id="209"/>
       <w:r>
         <w:rPr>
           <w:strike/>
@@ -19883,7 +19962,7 @@
         </w:rPr>
         <w:t xml:space="preserve">, 30 - 50. </w:t>
       </w:r>
-      <w:hyperlink r:id="rId28">
+      <w:hyperlink r:id="rId29">
         <w:r>
           <w:rPr>
             <w:strike/>
@@ -19908,7 +19987,7 @@
         </w:rPr>
         <w:t xml:space="preserve"> </w:t>
       </w:r>
-      <w:commentRangeEnd w:id="208"/>
+      <w:commentRangeEnd w:id="209"/>
       <w:r>
         <w:rPr>
           <w:rStyle w:val="CommentReference"/>
@@ -19916,7 +19995,7 @@
           <w:sz w:val="22"/>
           <w:szCs w:val="22"/>
         </w:rPr>
-        <w:commentReference w:id="208"/>
+        <w:commentReference w:id="209"/>
       </w:r>
     </w:p>
     <w:p>
@@ -20310,7 +20389,7 @@
           <w:highlight w:val="white"/>
         </w:rPr>
       </w:pPr>
-      <w:commentRangeStart w:id="209"/>
+      <w:commentRangeStart w:id="210"/>
       <w:r>
         <w:rPr>
           <w:strike/>
@@ -20334,7 +20413,7 @@
         </w:rPr>
         <w:t>, (2019), 20-33.</w:t>
       </w:r>
-      <w:commentRangeEnd w:id="209"/>
+      <w:commentRangeEnd w:id="210"/>
       <w:r>
         <w:rPr>
           <w:rStyle w:val="CommentReference"/>
@@ -20343,7 +20422,7 @@
           <w:szCs w:val="22"/>
           <w:highlight w:val="white"/>
         </w:rPr>
-        <w:commentReference w:id="209"/>
+        <w:commentReference w:id="210"/>
       </w:r>
     </w:p>
     <w:p>
@@ -20353,7 +20432,7 @@
       <w:r>
         <w:t>Mayer, H., Yee, L., Chui, M., &amp; Roberts, R. (2025). AI in the workplace: A report for 2025. McKinsey &amp; Company.</w:t>
       </w:r>
-      <w:hyperlink r:id="rId29">
+      <w:hyperlink r:id="rId30">
         <w:r>
           <w:rPr>
             <w:u w:val="single"/>
@@ -20361,7 +20440,7 @@
           <w:t xml:space="preserve"> </w:t>
         </w:r>
       </w:hyperlink>
-      <w:hyperlink r:id="rId30">
+      <w:hyperlink r:id="rId31">
         <w:r>
           <w:rPr>
             <w:color w:val="1155CC"/>
@@ -20542,7 +20621,7 @@
       <w:r>
         <w:t xml:space="preserve">.  </w:t>
       </w:r>
-      <w:hyperlink r:id="rId31">
+      <w:hyperlink r:id="rId32">
         <w:r>
           <w:rPr>
             <w:color w:val="1155CC"/>
@@ -20572,7 +20651,7 @@
       <w:r>
         <w:t xml:space="preserve">. OpenAI.  </w:t>
       </w:r>
-      <w:hyperlink r:id="rId32">
+      <w:hyperlink r:id="rId33">
         <w:r>
           <w:rPr>
             <w:color w:val="1155CC"/>
@@ -20618,7 +20697,7 @@
           <w:highlight w:val="white"/>
         </w:rPr>
       </w:pPr>
-      <w:commentRangeStart w:id="210"/>
+      <w:commentRangeStart w:id="211"/>
       <w:r>
         <w:rPr>
           <w:strike/>
@@ -20642,7 +20721,7 @@
         </w:rPr>
         <w:t>.</w:t>
       </w:r>
-      <w:commentRangeEnd w:id="210"/>
+      <w:commentRangeEnd w:id="211"/>
       <w:r>
         <w:rPr>
           <w:rStyle w:val="CommentReference"/>
@@ -20651,7 +20730,7 @@
           <w:szCs w:val="22"/>
           <w:highlight w:val="white"/>
         </w:rPr>
-        <w:commentReference w:id="210"/>
+        <w:commentReference w:id="211"/>
       </w:r>
     </w:p>
     <w:p>
@@ -20783,7 +20862,7 @@
       <w:r>
         <w:t>Sidorchuk, R. (2015). The concept of "value" in the theory of marketing. Asian Social Science, 11(9), 320–325.</w:t>
       </w:r>
-      <w:hyperlink r:id="rId33">
+      <w:hyperlink r:id="rId34">
         <w:r>
           <w:rPr>
             <w:u w:val="single"/>
@@ -20791,7 +20870,7 @@
           <w:t xml:space="preserve"> </w:t>
         </w:r>
       </w:hyperlink>
-      <w:hyperlink r:id="rId34">
+      <w:hyperlink r:id="rId35">
         <w:r>
           <w:rPr>
             <w:color w:val="1155CC"/>
@@ -20808,7 +20887,7 @@
       <w:r>
         <w:t>Teece, D., Pisano, G., &amp; Shuen, A. (1997). Dynamic capabilities and strategic management. Strategic Management Journal, 18(7), 509–533.</w:t>
       </w:r>
-      <w:hyperlink r:id="rId35">
+      <w:hyperlink r:id="rId36">
         <w:r>
           <w:rPr>
             <w:u w:val="single"/>
@@ -20816,7 +20895,7 @@
           <w:t xml:space="preserve"> </w:t>
         </w:r>
       </w:hyperlink>
-      <w:hyperlink r:id="rId36">
+      <w:hyperlink r:id="rId37">
         <w:r>
           <w:rPr>
             <w:color w:val="1155CC"/>
@@ -20875,7 +20954,7 @@
           <w:strike/>
         </w:rPr>
       </w:pPr>
-      <w:commentRangeStart w:id="211"/>
+      <w:commentRangeStart w:id="212"/>
       <w:r>
         <w:rPr>
           <w:strike/>
@@ -20890,7 +20969,7 @@
         </w:rPr>
         <w:t>Managing digital transformation: The view from the top. Journal of Business Research, 152, 29–41.</w:t>
       </w:r>
-      <w:hyperlink r:id="rId37">
+      <w:hyperlink r:id="rId38">
         <w:r>
           <w:rPr>
             <w:strike/>
@@ -20899,7 +20978,7 @@
           <w:t xml:space="preserve"> </w:t>
         </w:r>
       </w:hyperlink>
-      <w:hyperlink r:id="rId38">
+      <w:hyperlink r:id="rId39">
         <w:r>
           <w:rPr>
             <w:strike/>
@@ -20909,7 +20988,7 @@
           <w:t>https://doi.org/10.1016/j.jbusres.2022.07.0200</w:t>
         </w:r>
       </w:hyperlink>
-      <w:commentRangeEnd w:id="211"/>
+      <w:commentRangeEnd w:id="212"/>
       <w:r>
         <w:rPr>
           <w:rStyle w:val="CommentReference"/>
@@ -20917,7 +20996,7 @@
           <w:sz w:val="22"/>
           <w:szCs w:val="22"/>
         </w:rPr>
-        <w:commentReference w:id="211"/>
+        <w:commentReference w:id="212"/>
       </w:r>
     </w:p>
     <w:p>
@@ -21038,8 +21117,8 @@
       <w:pPr>
         <w:pStyle w:val="Heading1"/>
       </w:pPr>
-      <w:bookmarkStart w:id="212" w:name="_icpp6ljm25yc" w:colFirst="0" w:colLast="0"/>
-      <w:bookmarkEnd w:id="212"/>
+      <w:bookmarkStart w:id="213" w:name="_icpp6ljm25yc" w:colFirst="0" w:colLast="0"/>
+      <w:bookmarkEnd w:id="213"/>
       <w:r>
         <w:lastRenderedPageBreak/>
         <w:t>Appendix A. Interview Guide and Protocol</w:t>
@@ -21054,8 +21133,8 @@
       <w:pPr>
         <w:pStyle w:val="Heading2"/>
       </w:pPr>
-      <w:bookmarkStart w:id="213" w:name="_yaxctkjupl5f" w:colFirst="0" w:colLast="0"/>
-      <w:bookmarkEnd w:id="213"/>
+      <w:bookmarkStart w:id="214" w:name="_yaxctkjupl5f" w:colFirst="0" w:colLast="0"/>
+      <w:bookmarkEnd w:id="214"/>
       <w:r>
         <w:t>A.1.</w:t>
       </w:r>
@@ -21068,8 +21147,8 @@
       <w:pPr>
         <w:pStyle w:val="Heading3"/>
       </w:pPr>
-      <w:bookmarkStart w:id="214" w:name="_fso8dir40043" w:colFirst="0" w:colLast="0"/>
-      <w:bookmarkEnd w:id="214"/>
+      <w:bookmarkStart w:id="215" w:name="_fso8dir40043" w:colFirst="0" w:colLast="0"/>
+      <w:bookmarkEnd w:id="215"/>
       <w:r>
         <w:t>A.1.1.</w:t>
       </w:r>
@@ -21335,8 +21414,8 @@
       <w:pPr>
         <w:pStyle w:val="Heading3"/>
       </w:pPr>
-      <w:bookmarkStart w:id="215" w:name="_xu7tl6fyia16" w:colFirst="0" w:colLast="0"/>
-      <w:bookmarkEnd w:id="215"/>
+      <w:bookmarkStart w:id="216" w:name="_xu7tl6fyia16" w:colFirst="0" w:colLast="0"/>
+      <w:bookmarkEnd w:id="216"/>
       <w:r>
         <w:t>A.1.2.</w:t>
       </w:r>
@@ -21402,8 +21481,8 @@
       <w:pPr>
         <w:pStyle w:val="Heading3"/>
       </w:pPr>
-      <w:bookmarkStart w:id="216" w:name="_uslcrode5spj" w:colFirst="0" w:colLast="0"/>
-      <w:bookmarkEnd w:id="216"/>
+      <w:bookmarkStart w:id="217" w:name="_uslcrode5spj" w:colFirst="0" w:colLast="0"/>
+      <w:bookmarkEnd w:id="217"/>
       <w:r>
         <w:t>A.1.3.</w:t>
       </w:r>
@@ -21563,8 +21642,8 @@
       <w:pPr>
         <w:pStyle w:val="Heading2"/>
       </w:pPr>
-      <w:bookmarkStart w:id="217" w:name="_4i48gt7nuy87" w:colFirst="0" w:colLast="0"/>
-      <w:bookmarkEnd w:id="217"/>
+      <w:bookmarkStart w:id="218" w:name="_4i48gt7nuy87" w:colFirst="0" w:colLast="0"/>
+      <w:bookmarkEnd w:id="218"/>
       <w:r>
         <w:t>A.2.</w:t>
       </w:r>
@@ -21594,15 +21673,15 @@
           <w:cols w:space="708"/>
         </w:sectPr>
       </w:pPr>
-      <w:bookmarkStart w:id="218" w:name="_i4eri4z2mseg" w:colFirst="0" w:colLast="0"/>
-      <w:bookmarkEnd w:id="218"/>
+      <w:bookmarkStart w:id="219" w:name="_i4eri4z2mseg" w:colFirst="0" w:colLast="0"/>
+      <w:bookmarkEnd w:id="219"/>
     </w:p>
     <w:p>
       <w:pPr>
         <w:pStyle w:val="Heading1"/>
       </w:pPr>
-      <w:bookmarkStart w:id="219" w:name="_n4q94a2ei39t" w:colFirst="0" w:colLast="0"/>
-      <w:bookmarkEnd w:id="219"/>
+      <w:bookmarkStart w:id="220" w:name="_n4q94a2ei39t" w:colFirst="0" w:colLast="0"/>
+      <w:bookmarkEnd w:id="220"/>
       <w:r>
         <w:lastRenderedPageBreak/>
         <w:t>Appendix C. The process of constructive grounded theory</w:t>
@@ -21662,7 +21741,7 @@
                     <pic:cNvPicPr preferRelativeResize="0"/>
                   </pic:nvPicPr>
                   <pic:blipFill>
-                    <a:blip r:embed="rId39"/>
+                    <a:blip r:embed="rId40"/>
                     <a:srcRect/>
                     <a:stretch>
                       <a:fillRect/>
@@ -21704,8 +21783,8 @@
       <w:pPr>
         <w:pStyle w:val="Heading1"/>
       </w:pPr>
-      <w:bookmarkStart w:id="220" w:name="_z0nzv114icat" w:colFirst="0" w:colLast="0"/>
-      <w:bookmarkEnd w:id="220"/>
+      <w:bookmarkStart w:id="221" w:name="_z0nzv114icat" w:colFirst="0" w:colLast="0"/>
+      <w:bookmarkEnd w:id="221"/>
       <w:r>
         <w:br w:type="page"/>
       </w:r>
@@ -21714,8 +21793,8 @@
       <w:pPr>
         <w:pStyle w:val="Heading1"/>
       </w:pPr>
-      <w:bookmarkStart w:id="221" w:name="_8iomnw571gh6" w:colFirst="0" w:colLast="0"/>
-      <w:bookmarkEnd w:id="221"/>
+      <w:bookmarkStart w:id="222" w:name="_8iomnw571gh6" w:colFirst="0" w:colLast="0"/>
+      <w:bookmarkEnd w:id="222"/>
       <w:r>
         <w:lastRenderedPageBreak/>
         <w:t>Appendix D. Supporting Quotes</w:t>
@@ -21725,7 +21804,7 @@
       <w:r>
         <w:t>Placeholder (</w:t>
       </w:r>
-      <w:hyperlink r:id="rId40">
+      <w:hyperlink r:id="rId41">
         <w:r>
           <w:rPr>
             <w:color w:val="1155CC"/>
@@ -21748,8 +21827,8 @@
         <w:pStyle w:val="Heading1"/>
         <w:ind w:firstLine="0"/>
       </w:pPr>
-      <w:bookmarkStart w:id="222" w:name="_a7k3h3b6oqi2" w:colFirst="0" w:colLast="0"/>
-      <w:bookmarkEnd w:id="222"/>
+      <w:bookmarkStart w:id="223" w:name="_a7k3h3b6oqi2" w:colFirst="0" w:colLast="0"/>
+      <w:bookmarkEnd w:id="223"/>
       <w:r>
         <w:lastRenderedPageBreak/>
         <w:t>Appendix E. What to include?</w:t>
@@ -25836,7 +25915,27 @@
       </w:r>
     </w:p>
   </w:comment>
-  <w:comment w:id="193" w:author="Daan Luttik" w:date="2026-05-25T16:35:00Z" w:initials="">
+  <w:comment w:id="185" w:author="Luttik, Daan" w:date="2026-06-05T19:34:00Z" w:initials="DL">
+    <w:p>
+      <w:pPr>
+        <w:pStyle w:val="CommentText"/>
+        <w:ind w:firstLine="0"/>
+      </w:pPr>
+      <w:r>
+        <w:rPr>
+          <w:rStyle w:val="CommentReference"/>
+        </w:rPr>
+        <w:annotationRef/>
+      </w:r>
+      <w:r>
+        <w:rPr>
+          <w:lang w:val="en-GB"/>
+        </w:rPr>
+        <w:t>Im not sure about this..</w:t>
+      </w:r>
+    </w:p>
+  </w:comment>
+  <w:comment w:id="194" w:author="Daan Luttik" w:date="2026-05-25T16:35:00Z" w:initials="">
     <w:p>
       <w:pPr>
         <w:widowControl w:val="0"/>
@@ -25869,7 +25968,7 @@
       </w:r>
     </w:p>
   </w:comment>
-  <w:comment w:id="198" w:author="Daan Luttik" w:date="2026-05-25T16:47:00Z" w:initials="">
+  <w:comment w:id="199" w:author="Daan Luttik" w:date="2026-05-25T16:47:00Z" w:initials="">
     <w:p>
       <w:pPr>
         <w:widowControl w:val="0"/>
@@ -25902,7 +26001,7 @@
       </w:r>
     </w:p>
   </w:comment>
-  <w:comment w:id="206" w:author="Daan Luttik" w:date="2026-05-03T19:36:00Z" w:initials="">
+  <w:comment w:id="207" w:author="Daan Luttik" w:date="2026-05-03T19:36:00Z" w:initials="">
     <w:p>
       <w:pPr>
         <w:widowControl w:val="0"/>
@@ -25935,7 +26034,7 @@
       </w:r>
     </w:p>
   </w:comment>
-  <w:comment w:id="207" w:author="Daan Luttik" w:date="2026-05-03T19:41:00Z" w:initials="">
+  <w:comment w:id="208" w:author="Daan Luttik" w:date="2026-05-03T19:41:00Z" w:initials="">
     <w:p>
       <w:pPr>
         <w:widowControl w:val="0"/>
@@ -25968,7 +26067,7 @@
       </w:r>
     </w:p>
   </w:comment>
-  <w:comment w:id="208" w:author="Daan Luttik" w:date="2026-05-03T19:38:00Z" w:initials="">
+  <w:comment w:id="209" w:author="Daan Luttik" w:date="2026-05-03T19:38:00Z" w:initials="">
     <w:p>
       <w:pPr>
         <w:widowControl w:val="0"/>
@@ -26001,7 +26100,7 @@
       </w:r>
     </w:p>
   </w:comment>
-  <w:comment w:id="209" w:author="Daan Luttik" w:date="2026-05-03T19:40:00Z" w:initials="">
+  <w:comment w:id="210" w:author="Daan Luttik" w:date="2026-05-03T19:40:00Z" w:initials="">
     <w:p>
       <w:pPr>
         <w:widowControl w:val="0"/>
@@ -26034,7 +26133,7 @@
       </w:r>
     </w:p>
   </w:comment>
-  <w:comment w:id="210" w:author="Daan Luttik" w:date="2026-05-03T19:43:00Z" w:initials="">
+  <w:comment w:id="211" w:author="Daan Luttik" w:date="2026-05-03T19:43:00Z" w:initials="">
     <w:p>
       <w:pPr>
         <w:widowControl w:val="0"/>
@@ -26067,7 +26166,7 @@
       </w:r>
     </w:p>
   </w:comment>
-  <w:comment w:id="211" w:author="Daan Luttik" w:date="2026-05-03T19:44:00Z" w:initials="">
+  <w:comment w:id="212" w:author="Daan Luttik" w:date="2026-05-03T19:44:00Z" w:initials="">
     <w:p>
       <w:pPr>
         <w:widowControl w:val="0"/>
@@ -26222,6 +26321,7 @@
   <w15:commentEx w15:paraId="69ACE959" w15:done="0"/>
   <w15:commentEx w15:paraId="2980F578" w15:done="0"/>
   <w15:commentEx w15:paraId="5355B2EA" w15:done="0"/>
+  <w15:commentEx w15:paraId="323EB003" w15:done="0"/>
   <w15:commentEx w15:paraId="19BDAF4D" w15:done="0"/>
   <w15:commentEx w15:paraId="1CFACCDB" w15:done="0"/>
   <w15:commentEx w15:paraId="5C91A3A8" w15:done="0"/>
@@ -26231,6 +26331,12 @@
   <w15:commentEx w15:paraId="30A0D809" w15:done="0"/>
   <w15:commentEx w15:paraId="258CABEF" w15:done="0"/>
 </w15:commentsEx>
+</file>
+
+<file path=word/commentsExtensible.xml><?xml version="1.0" encoding="utf-8"?>
+<w16cex:commentsExtensible xmlns:wpc="http://schemas.microsoft.com/office/word/2010/wordprocessingCanvas" xmlns:cx="http://schemas.microsoft.com/office/drawing/2014/chartex" xmlns:cx1="http://schemas.microsoft.com/office/drawing/2015/9/8/chartex" xmlns:cx2="http://schemas.microsoft.com/office/drawing/2015/10/21/chartex" xmlns:cx3="http://schemas.microsoft.com/office/drawing/2016/5/9/chartex" xmlns:cx4="http://schemas.microsoft.com/office/drawing/2016/5/10/chartex" xmlns:cx5="http://schemas.microsoft.com/office/drawing/2016/5/11/chartex" xmlns:cx6="http://schemas.microsoft.com/office/drawing/2016/5/12/chartex" xmlns:cx7="http://schemas.microsoft.com/office/drawing/2016/5/13/chartex" xmlns:cx8="http://schemas.microsoft.com/office/drawing/2016/5/14/chartex" xmlns:cr="http://schemas.microsoft.com/office/comments/2020/reactions" xmlns:mc="http://schemas.openxmlformats.org/markup-compatibility/2006" xmlns:aink="http://schemas.microsoft.com/office/drawing/2016/ink" xmlns:am3d="http://schemas.microsoft.com/office/drawing/2017/model3d" xmlns:o="urn:schemas-microsoft-com:office:office" xmlns:oel="http://schemas.microsoft.com/office/2019/extlst" xmlns:r="http://schemas.openxmlformats.org/officeDocument/2006/relationships" xmlns:m="http://schemas.openxmlformats.org/officeDocument/2006/math" xmlns:v="urn:schemas-microsoft-com:vml" xmlns:wp14="http://schemas.microsoft.com/office/word/2010/wordprocessingDrawing" xmlns:wp="http://schemas.openxmlformats.org/drawingml/2006/wordprocessingDrawing" xmlns:w10="urn:schemas-microsoft-com:office:word" xmlns:w="http://schemas.openxmlformats.org/wordprocessingml/2006/main" xmlns:w14="http://schemas.microsoft.com/office/word/2010/wordml" xmlns:w15="http://schemas.microsoft.com/office/word/2012/wordml" xmlns:w16cex="http://schemas.microsoft.com/office/word/2018/wordml/cex" xmlns:w16cid="http://schemas.microsoft.com/office/word/2016/wordml/cid" xmlns:w16="http://schemas.microsoft.com/office/word/2018/wordml" xmlns:w16du="http://schemas.microsoft.com/office/word/2023/wordml/word16du" xmlns:w16sdtdh="http://schemas.microsoft.com/office/word/2020/wordml/sdtdatahash" xmlns:w16sdtfl="http://schemas.microsoft.com/office/word/2024/wordml/sdtformatlock" xmlns:w16se="http://schemas.microsoft.com/office/word/2015/wordml/symex" xmlns:wpg="http://schemas.microsoft.com/office/word/2010/wordprocessingGroup" xmlns:wpi="http://schemas.microsoft.com/office/word/2010/wordprocessingInk" xmlns:wne="http://schemas.microsoft.com/office/word/2006/wordml" xmlns:wps="http://schemas.microsoft.com/office/word/2010/wordprocessingShape" mc:Ignorable="w14 w15 w16se w16cid w16 w16cex w16sdtdh w16sdtfl cr w16du wp14">
+  <w16cex:commentExtensible w16cex:durableId="0FBFE4F7" w16cex:dateUtc="2026-06-05T17:34:00Z"/>
+</w16cex:commentsExtensible>
 </file>
 
 <file path=word/commentsIds.xml><?xml version="1.0" encoding="utf-8"?>
@@ -26352,6 +26458,7 @@
   <w16cid:commentId w16cid:paraId="69ACE959" w16cid:durableId="505D8706"/>
   <w16cid:commentId w16cid:paraId="2980F578" w16cid:durableId="6E082F65"/>
   <w16cid:commentId w16cid:paraId="5355B2EA" w16cid:durableId="1C973F00"/>
+  <w16cid:commentId w16cid:paraId="323EB003" w16cid:durableId="0FBFE4F7"/>
   <w16cid:commentId w16cid:paraId="19BDAF4D" w16cid:durableId="07F25AA7"/>
   <w16cid:commentId w16cid:paraId="1CFACCDB" w16cid:durableId="487522C6"/>
   <w16cid:commentId w16cid:paraId="5C91A3A8" w16cid:durableId="2DB6B5CB"/>
@@ -27906,6 +28013,14 @@
     <w:abstractNumId w:val="8"/>
   </w:num>
 </w:numbering>
+</file>
+
+<file path=word/people.xml><?xml version="1.0" encoding="utf-8"?>
+<w15:people xmlns:wpc="http://schemas.microsoft.com/office/word/2010/wordprocessingCanvas" xmlns:cx="http://schemas.microsoft.com/office/drawing/2014/chartex" xmlns:cx1="http://schemas.microsoft.com/office/drawing/2015/9/8/chartex" xmlns:cx2="http://schemas.microsoft.com/office/drawing/2015/10/21/chartex" xmlns:cx3="http://schemas.microsoft.com/office/drawing/2016/5/9/chartex" xmlns:cx4="http://schemas.microsoft.com/office/drawing/2016/5/10/chartex" xmlns:cx5="http://schemas.microsoft.com/office/drawing/2016/5/11/chartex" xmlns:cx6="http://schemas.microsoft.com/office/drawing/2016/5/12/chartex" xmlns:cx7="http://schemas.microsoft.com/office/drawing/2016/5/13/chartex" xmlns:cx8="http://schemas.microsoft.com/office/drawing/2016/5/14/chartex" xmlns:mc="http://schemas.openxmlformats.org/markup-compatibility/2006" xmlns:aink="http://schemas.microsoft.com/office/drawing/2016/ink" xmlns:am3d="http://schemas.microsoft.com/office/drawing/2017/model3d" xmlns:o="urn:schemas-microsoft-com:office:office" xmlns:oel="http://schemas.microsoft.com/office/2019/extlst" xmlns:r="http://schemas.openxmlformats.org/officeDocument/2006/relationships" xmlns:m="http://schemas.openxmlformats.org/officeDocument/2006/math" xmlns:v="urn:schemas-microsoft-com:vml" xmlns:wp14="http://schemas.microsoft.com/office/word/2010/wordprocessingDrawing" xmlns:wp="http://schemas.openxmlformats.org/drawingml/2006/wordprocessingDrawing" xmlns:w10="urn:schemas-microsoft-com:office:word" xmlns:w="http://schemas.openxmlformats.org/wordprocessingml/2006/main" xmlns:w14="http://schemas.microsoft.com/office/word/2010/wordml" xmlns:w15="http://schemas.microsoft.com/office/word/2012/wordml" xmlns:w16cex="http://schemas.microsoft.com/office/word/2018/wordml/cex" xmlns:w16cid="http://schemas.microsoft.com/office/word/2016/wordml/cid" xmlns:w16="http://schemas.microsoft.com/office/word/2018/wordml" xmlns:w16du="http://schemas.microsoft.com/office/word/2023/wordml/word16du" xmlns:w16sdtdh="http://schemas.microsoft.com/office/word/2020/wordml/sdtdatahash" xmlns:w16sdtfl="http://schemas.microsoft.com/office/word/2024/wordml/sdtformatlock" xmlns:w16se="http://schemas.microsoft.com/office/word/2015/wordml/symex" xmlns:wpg="http://schemas.microsoft.com/office/word/2010/wordprocessingGroup" xmlns:wpi="http://schemas.microsoft.com/office/word/2010/wordprocessingInk" xmlns:wne="http://schemas.microsoft.com/office/word/2006/wordml" xmlns:wps="http://schemas.microsoft.com/office/word/2010/wordprocessingShape" mc:Ignorable="w14 w15 w16se w16cid w16 w16cex w16sdtdh w16sdtfl w16du wp14">
+  <w15:person w15:author="Luttik, Daan">
+    <w15:presenceInfo w15:providerId="AD" w15:userId="S::d.luttik@my.nyenrode.nl::1793cd2c-2cfd-4375-90c5-6702ae82a13b"/>
+  </w15:person>
+</w15:people>
 </file>
 
 <file path=word/styles.xml><?xml version="1.0" encoding="utf-8"?>
@@ -28584,6 +28699,43 @@
       <w:szCs w:val="20"/>
     </w:rPr>
   </w:style>
+  <w:style w:type="paragraph" w:styleId="NoSpacing">
+    <w:name w:val="No Spacing"/>
+    <w:uiPriority w:val="1"/>
+    <w:qFormat/>
+    <w:rsid w:val="002940E3"/>
+    <w:pPr>
+      <w:spacing w:line="240" w:lineRule="auto"/>
+    </w:pPr>
+  </w:style>
+  <w:style w:type="paragraph" w:styleId="Quote">
+    <w:name w:val="Quote"/>
+    <w:basedOn w:val="Normal"/>
+    <w:next w:val="Normal"/>
+    <w:link w:val="QuoteChar"/>
+    <w:uiPriority w:val="29"/>
+    <w:qFormat/>
+    <w:rsid w:val="002940E3"/>
+    <w:pPr>
+      <w:spacing w:before="200" w:after="160"/>
+      <w:ind w:left="862" w:right="862" w:firstLine="0"/>
+    </w:pPr>
+    <w:rPr>
+      <w:iCs/>
+      <w:color w:val="404040" w:themeColor="text1" w:themeTint="BF"/>
+    </w:rPr>
+  </w:style>
+  <w:style w:type="character" w:customStyle="1" w:styleId="QuoteChar">
+    <w:name w:val="Quote Char"/>
+    <w:basedOn w:val="DefaultParagraphFont"/>
+    <w:link w:val="Quote"/>
+    <w:uiPriority w:val="29"/>
+    <w:rsid w:val="002940E3"/>
+    <w:rPr>
+      <w:iCs/>
+      <w:color w:val="404040" w:themeColor="text1" w:themeTint="BF"/>
+    </w:rPr>
+  </w:style>
 </w:styles>
 </file>
 

</xml_diff>

<commit_message>
Did a lot of typing.
</commit_message>
<xml_diff>
--- a/Thesis Draft - Daan Luttik - MBA.docx
+++ b/Thesis Draft - Daan Luttik - MBA.docx
@@ -16787,55 +16787,110 @@
     </w:p>
     <w:p>
       <w:r>
+        <w:t>Internal conditions describe a set of organizational variables that shape whether and how agentic AI can be implemented and create value. Four interlocking themes recur throughout the data: (1) organizational capacity, encompassing AI literacy, resistance to change, and the ability to act quickly under uncertainty; (2) technical resources, including data infrastructure, tooling, and the systems-thinking capability to connect them; (3) strategic direction and leadership</w:t>
+      </w:r>
+      <w:r>
+        <w:t>, providing strategic direction, support, and guidance</w:t>
+      </w:r>
+      <w:r>
+        <w:t>; and (4) governance and organizational friction, including legal</w:t>
+      </w:r>
+      <w:r>
+        <w:t xml:space="preserve"> and </w:t>
+      </w:r>
+      <w:r>
+        <w:t xml:space="preserve">compliance gatekeeping, politics, and </w:t>
+      </w:r>
+      <w:r>
+        <w:t xml:space="preserve">working in </w:t>
+      </w:r>
+      <w:r>
+        <w:t>silos.</w:t>
+      </w:r>
+    </w:p>
+    <w:p>
+      <w:r>
+        <w:t>Managers respond to internal conditions in three distinct ways.</w:t>
+      </w:r>
+      <w:r>
+        <w:t xml:space="preserve"> </w:t>
+      </w:r>
+      <w:r>
         <w:rPr>
           <w:i/>
           <w:iCs/>
         </w:rPr>
-        <w:t>Internal conditions</w:t>
-      </w:r>
-      <w:r>
-        <w:t xml:space="preserve"> describe a set of conditions within the organization of focus. These conditions can be critical for the organization's ability to implement, use, or create value using agentic AI. Three interlocking themes recur throughout the data:</w:t>
-      </w:r>
-      <w:r>
-        <w:t xml:space="preserve"> (1)</w:t>
-      </w:r>
-      <w:r>
-        <w:t xml:space="preserve"> the capacity to change</w:t>
-      </w:r>
-      <w:r>
-        <w:t>, which includes</w:t>
-      </w:r>
-      <w:r>
-        <w:t xml:space="preserve"> </w:t>
-      </w:r>
-      <w:r>
-        <w:t xml:space="preserve">elements like the available </w:t>
-      </w:r>
-      <w:r>
-        <w:t xml:space="preserve">knowledge, culture, and organizational agility; </w:t>
-      </w:r>
-      <w:r>
-        <w:t xml:space="preserve">(2) </w:t>
-      </w:r>
-      <w:r>
-        <w:t xml:space="preserve">the availability of enabling resources such as data infrastructure and technical tools; and </w:t>
-      </w:r>
-      <w:r>
-        <w:t xml:space="preserve">(3) </w:t>
-      </w:r>
-      <w:r>
-        <w:t xml:space="preserve">the quality of leadership and governance. </w:t>
-      </w:r>
-    </w:p>
-    <w:p>
-      <w:pPr>
+        <w:t>Leveraging</w:t>
+      </w:r>
+      <w:r>
+        <w:t xml:space="preserve"> is the use of a favorable condition to amplify the organization's ability to adopt and create value with agentic AI. </w:t>
+      </w:r>
+      <w:r>
         <w:rPr>
           <w:i/>
           <w:iCs/>
         </w:rPr>
-      </w:pPr>
-      <w:r>
-        <w:t>Managers respond to internal conditions in three distinct ways. Leveraging is the use of a favorable condition to amplify the organization's ability to adopt and create value with agentic AI. Navigating is adapting the way agentic AI is adopted to fit the existing constraints, typically (though not necessarily) accepting them as given. Reshaping is actively working to change the condition itself. A notable pattern in the research was that managers defaulted to navigation: unfavorable conditions were largely treated as fixed features of the environment to be worked around, rather than as variables open to active redesign.</w:t>
+        <w:t>Navigating</w:t>
+      </w:r>
+      <w:r>
+        <w:t xml:space="preserve"> is adapting the way agentic AI is adopted to fit the existing constraints, typically (though not necessarily) accepting them as given. </w:t>
+      </w:r>
+      <w:r>
+        <w:rPr>
+          <w:i/>
+          <w:iCs/>
+        </w:rPr>
+        <w:t>Reshaping</w:t>
+      </w:r>
+      <w:r>
+        <w:t xml:space="preserve"> is actively working to change the condition itself. </w:t>
+      </w:r>
+    </w:p>
+    <w:p>
+      <w:pPr>
+        <w:rPr>
+          <w:i/>
+          <w:iCs/>
+        </w:rPr>
+      </w:pPr>
+      <w:r>
+        <w:t xml:space="preserve">While never mentioned explicitly, the researchers observed </w:t>
+      </w:r>
+      <w:r>
+        <w:t>that managers</w:t>
+      </w:r>
+      <w:r>
+        <w:t>, when faced with unfavorable conditions (especially when the unfavorable condition stems from outside of their team),</w:t>
+      </w:r>
+      <w:r>
+        <w:t xml:space="preserve"> </w:t>
+      </w:r>
+      <w:r>
+        <w:t>seem to default</w:t>
+      </w:r>
+      <w:r>
+        <w:t xml:space="preserve"> to navigation</w:t>
+      </w:r>
+      <w:r>
+        <w:t>. Managers seem to view these conditions as fixed rather than</w:t>
+      </w:r>
+      <w:r>
+        <w:t xml:space="preserve"> as variables open to active redesign.</w:t>
+      </w:r>
+    </w:p>
+    <w:p>
+      <w:r>
+        <w:t xml:space="preserve">We also note explicit </w:t>
+      </w:r>
+      <w:r>
+        <w:rPr>
+          <w:i/>
+          <w:iCs/>
+        </w:rPr>
+        <w:t>reshaping</w:t>
+      </w:r>
+      <w:r>
+        <w:t xml:space="preserve"> behaviors that the managers employ (like educating, supporting, championing, and experimenting). These behaviors managers apply in response to these conditions are overlapping; additionally, we did not observe clear one-to-one relations between conditions and responses. </w:t>
       </w:r>
     </w:p>
     <w:p>
@@ -16843,11 +16898,12 @@
         <w:pStyle w:val="Heading3"/>
       </w:pPr>
       <w:r>
+        <w:lastRenderedPageBreak/>
         <w:t>4.2.1</w:t>
       </w:r>
       <w:r>
         <w:tab/>
-        <w:t>Capacity to change</w:t>
+        <w:t>Organizational capacity</w:t>
       </w:r>
     </w:p>
     <w:p>
@@ -16855,13 +16911,7 @@
         <w:t xml:space="preserve">The most consistently identified barrier to adopting agentic AI is not technical but organizational: the capacity to change. This encompasses </w:t>
       </w:r>
       <w:r>
-        <w:t>the e</w:t>
-      </w:r>
-      <w:r>
-        <w:t>mployees’ openness to new ways of working</w:t>
-      </w:r>
-      <w:r>
-        <w:t xml:space="preserve">, </w:t>
+        <w:t xml:space="preserve">the employees’ openness to new ways of working, </w:t>
       </w:r>
       <w:r>
         <w:t>the level of AI understanding</w:t>
@@ -16920,250 +16970,470 @@
         <w:t>“Change is frigging hard. It’s hard for us as individuals. Generally speaking, individuals don’t like to change, particularly if they’ve been doing something a certain way, and it works well</w:t>
       </w:r>
       <w:r>
-        <w:t xml:space="preserve">, and it works well, and they know it, and they’re </w:t>
+        <w:t>, and it works well, and they know it, and they’re comfortable.</w:t>
+      </w:r>
+      <w:r>
+        <w:t xml:space="preserve"> […] </w:t>
+      </w:r>
+      <w:r>
+        <w:t>That challenge gets multiplied when you start talking about an organization … you’ve got all multiple people, you’ve got politics, existing incentives, existing processes.”</w:t>
+      </w:r>
+    </w:p>
+    <w:p>
+      <w:r>
+        <w:t>Providing a complementary perspective interviewee 4 noted the resistance to learning how to work with AI:</w:t>
+      </w:r>
+    </w:p>
+    <w:p>
+      <w:pPr>
+        <w:pStyle w:val="Quote"/>
+      </w:pPr>
+      <w:r>
+        <w:t>“T</w:t>
+      </w:r>
+      <w:r>
+        <w:t>hey</w:t>
+      </w:r>
+      <w:r>
+        <w:t xml:space="preserve"> were very skeptical. Uh, “Oh, I need to learn a new thing while running my business.” Well, if you learn these new things, you can do ten times, ten times besides the things that you do. Uh, so got a lot of pushback there.</w:t>
+      </w:r>
+    </w:p>
+    <w:p>
+      <w:r>
+        <w:t xml:space="preserve">Alongside individual resistance, a lack of understanding of AI compounds the challenge. Interviewee 1 noted not just an absence of factual knowledge but a deeper cognitive barrier: limited understanding of how processes and systems connect. Interviewee 13 echoed this in practical terms: “The culprit is really still they don’t understand what the issues are </w:t>
+      </w:r>
+      <w:r>
+        <w:t>[</w:t>
+      </w:r>
+      <w:r>
+        <w:t>…</w:t>
+      </w:r>
+      <w:r>
+        <w:t>]</w:t>
+      </w:r>
+      <w:r>
+        <w:t xml:space="preserve"> they don’t understand what processes they are doing right now that take time and money.” This </w:t>
       </w:r>
       <w:r>
         <w:lastRenderedPageBreak/>
-        <w:t>comfortable.</w:t>
-      </w:r>
-      <w:r>
-        <w:t xml:space="preserve"> […] </w:t>
-      </w:r>
-      <w:r>
-        <w:t>That challenge gets multiplied when you start talking about an organization … you’ve got all multiple people, you’ve got politics, existing incentives, existing processes.”</w:t>
-      </w:r>
-    </w:p>
-    <w:p>
-      <w:r>
-        <w:t>Providing a complementary perspective interviewee 4 noted the resistance to learning how to work with AI:</w:t>
+        <w:t>inability to think in systems (seeing how data, tools, and processes interact) was identified as a recurring constraint across organizations.</w:t>
+      </w:r>
+    </w:p>
+    <w:p>
+      <w:r>
+        <w:t>A related challenge is the tendency toward analysis paralysis. Interviewee 12 was direct: “You have to act. You can’t just be in a mode of studying this or writing memos about it, or thinking about planning about it.” Interviewee 4 observed a similar dynamic: “We spend so much time debating which shot we have to take that that is already some cost.”</w:t>
+      </w:r>
+    </w:p>
+    <w:p>
+      <w:r>
+        <w:t>A fourth dimension of organizational capacity concerns culture: the pace of innovation and tolerance for failure within the organization. Where an innovation culture is present, managers leverage it directly to accelerate both education and experimentation. Interviewee 7 described this enabling condition: “A culture of innovation</w:t>
+      </w:r>
+      <w:r>
+        <w:t xml:space="preserve"> is</w:t>
+      </w:r>
+      <w:r>
+        <w:t xml:space="preserve"> forgiving. When you pioneer, you break things fast.” </w:t>
+      </w:r>
+    </w:p>
+    <w:p>
+      <w:r>
+        <w:t>Where this culture is absent, it functions as an additional obstacle that compounds resistance and analysis paralysis, making the default response navigation rather than reshaping. Reshaping culture is possible but slow, and is rarely something managers in the data attempt to address directly.</w:t>
+      </w:r>
+    </w:p>
+    <w:p>
+      <w:pPr>
+        <w:rPr>
+          <w:bCs/>
+        </w:rPr>
+      </w:pPr>
+      <w:r>
+        <w:rPr>
+          <w:b/>
+        </w:rPr>
+        <w:t xml:space="preserve">Educating and training </w:t>
+      </w:r>
+      <w:r>
+        <w:rPr>
+          <w:bCs/>
+        </w:rPr>
+        <w:t>is the primary response to the literacy and understanding barrier. Managers invest deliberately in raising AI capability across the organization, through training sessions, workshops, awareness programs, and structured learning, to create the cognitive preconditions for effective adoption. While education primarily targets the understanding deficit, it also reduces resistance by demystifying AI: employees who understand what AI can and cannot do are less fearful of it. However, education alone is insufficient to sustain change. Interviewee 17 observed a common pattern in her training work: “After two or three trainings companies basically stop, because then they go back to what they started with.” Sustained capacity-building requires not just initial education but ongoing structural embedding of learning.</w:t>
+      </w:r>
+    </w:p>
+    <w:p>
+      <w:r>
+        <w:rPr>
+          <w:b/>
+        </w:rPr>
+        <w:lastRenderedPageBreak/>
+        <w:t xml:space="preserve">Experimenting with AI </w:t>
+      </w:r>
+      <w:r>
+        <w:rPr>
+          <w:bCs/>
+        </w:rPr>
+        <w:t>primarily addresses resistance and analysis paralysis by making the value of AI tangible through doing rather than planning. Beyond this primary role, experimentation also surfaces use cases that were invisible in the abstract, and builds tacit literacy that structured education cannot easily provide. Rather than waiting for perfect conditions, effective managers create structured opportunities to learn through doing. Interviewee 6 summarized this orientation: “I’d rather have something live and test and improve than have two years down the road and then finally have something live.” Interviewee 13 described enabling this at the team level: “Provide freedom to experiment and don’t set this atmosphere of fear that AI is going to replace you.”</w:t>
+      </w:r>
+    </w:p>
+    <w:p>
+      <w:r>
+        <w:rPr>
+          <w:b/>
+          <w:bCs/>
+        </w:rPr>
+        <w:t xml:space="preserve">External experts </w:t>
+      </w:r>
+      <w:r>
+        <w:t xml:space="preserve">A third pattern is less visible but analytically important: some managers navigate around organizational capacity constraints rather than reshaping them. When internal literacy is too low or resistance too entrenched to address in the short term, managers route AI initiatives through external experts, agencies, or low-code tooling that reduces the literacy bar. </w:t>
+      </w:r>
+      <w:r>
+        <w:t>This bypasses the bottleneck without fixing it, a pragmatic short-term strategy that can stall long-term capability development if it becomes the default. Interviewee 6 described this pattern: “Another one is actually using experts externally, because if we would’ve waited for people internally, I think it would’ve been a major blocker.”</w:t>
+      </w:r>
+    </w:p>
+    <w:p>
+      <w:pPr>
+        <w:pStyle w:val="Heading3"/>
+        <w:rPr>
+          <w:color w:val="24292E"/>
+        </w:rPr>
+      </w:pPr>
+      <w:bookmarkStart w:id="186" w:name="_xw6d9a4ef7wu" w:colFirst="0" w:colLast="0"/>
+      <w:bookmarkEnd w:id="186"/>
+      <w:r>
+        <w:t>4.2.2</w:t>
+      </w:r>
+      <w:r>
+        <w:tab/>
+        <w:t>Technical resources</w:t>
+      </w:r>
+    </w:p>
+    <w:p>
+      <w:r>
+        <w:t>A second cluster of internal conditions concerns the availability of enabling resources: the data, tools, technical infrastructure</w:t>
+      </w:r>
+      <w:r>
+        <w:t xml:space="preserve">, and the technical talent </w:t>
+      </w:r>
+      <w:r>
+        <w:t xml:space="preserve">that make AI implementation feasible. </w:t>
+      </w:r>
+      <w:r>
+        <w:t>Especially having</w:t>
+      </w:r>
+      <w:r>
+        <w:t xml:space="preserve"> data and tools available and accessible emerged as a critical enabler.</w:t>
+      </w:r>
+    </w:p>
+    <w:p>
+      <w:r>
+        <w:rPr>
+          <w:i/>
+          <w:iCs/>
+        </w:rPr>
+        <w:t>Data infrastructure</w:t>
+      </w:r>
+      <w:r>
+        <w:t xml:space="preserve"> emerged as the foundational prerequisite. Interviewee 2 described his organization’s situation plainly: “The infrastructure is not yet in place, and the work on it is really big.” He elaborated that this is not a failure of will but of competing priorities: every improvement to the underlying data platform competes for attention with immediate </w:t>
+      </w:r>
+      <w:r>
+        <w:lastRenderedPageBreak/>
+        <w:t>operational demands. Without a robust and accessible data layer, AI systems cannot be reliably built or deployed.</w:t>
+      </w:r>
+    </w:p>
+    <w:p>
+      <w:r>
+        <w:t>A lack of</w:t>
+      </w:r>
+      <w:r>
+        <w:rPr>
+          <w:i/>
+          <w:iCs/>
+        </w:rPr>
+        <w:t xml:space="preserve"> s</w:t>
+      </w:r>
+      <w:r>
+        <w:rPr>
+          <w:i/>
+          <w:iCs/>
+        </w:rPr>
+        <w:t>ystems thinking</w:t>
+      </w:r>
+      <w:r>
+        <w:rPr>
+          <w:b/>
+          <w:bCs/>
+        </w:rPr>
+        <w:t xml:space="preserve"> </w:t>
+      </w:r>
+      <w:r>
+        <w:t xml:space="preserve">surfaced as </w:t>
+      </w:r>
+      <w:r>
+        <w:t>a</w:t>
+      </w:r>
+      <w:r>
+        <w:t xml:space="preserve"> </w:t>
+      </w:r>
+      <w:r>
+        <w:t>frequent</w:t>
+      </w:r>
+      <w:r>
+        <w:t xml:space="preserve"> </w:t>
+      </w:r>
+      <w:r>
+        <w:t xml:space="preserve">constraint. </w:t>
+      </w:r>
+      <w:r>
+        <w:t xml:space="preserve">This includes the ability to observe how the process works and how data and the system's components interact.  </w:t>
+      </w:r>
+      <w:r>
+        <w:t xml:space="preserve"> Interviewee 13 described this as the root cause behind many apparent AI failures:</w:t>
       </w:r>
     </w:p>
     <w:p>
       <w:pPr>
         <w:pStyle w:val="Quote"/>
-      </w:pPr>
-      <w:r>
-        <w:t>“T</w:t>
-      </w:r>
-      <w:r>
-        <w:t>hey</w:t>
-      </w:r>
-      <w:r>
-        <w:t xml:space="preserve"> were very skeptical. Uh, “Oh, I need to learn a new thing while running my business.” Well, if you learn these new things, you can do ten times, ten times besides the things that you do. Uh, so got a lot of pushback there.</w:t>
-      </w:r>
-    </w:p>
-    <w:p>
-      <w:r>
-        <w:t>Alongside individual resistance, a lack of understanding of AI compounds the challenge. Interviewee 1 noted not just an absence of factual knowledge but a deeper cognitive barrier: limited understanding of how processes and systems connect. Interviewee 13 echoed this in practical terms: “The culprit is really still they don’t understand what the issues are … they don’t understand what processes they are doing right now that take time and money.” This inability to think in systems — to see how data, tools, and processes interact — was identified as a recurring constraint across organizations.</w:t>
-      </w:r>
-    </w:p>
-    <w:p>
-      <w:r>
-        <w:t>A related challenge is the tendency toward analysis paralysis. Interviewee 12 was direct: “You have to act. You can’t just be in a mode of studying this or writing memos about it, or thinking about planning about it.” Interviewee 4 observed a similar dynamic: “We spend so much time debating which shot we have to take that that is already some cost.”</w:t>
-      </w:r>
-    </w:p>
-    <w:p>
-      <w:ins w:id="186" w:author="Claude" w:date="2026-06-01T00:00:00Z">
-        <w:r>
-          <w:rPr>
-            <w:i/>
-          </w:rPr>
-          <w:t>Experimenting with AI</w:t>
-        </w:r>
-        <w:r>
-          <w:t xml:space="preserve"> refers to running small-scale trials of agentic tools and workflows to generate practical knowledge and build organizational confidence. </w:t>
-        </w:r>
-        <w:r>
-          <w:rPr>
-            <w:i/>
-          </w:rPr>
-          <w:t>Educating and training</w:t>
-        </w:r>
-        <w:r>
-          <w:t xml:space="preserve"> refers to the deliberate effort to raise AI literacy and capability across the organization.</w:t>
-        </w:r>
-      </w:ins>
-    </w:p>
-    <w:p>
-      <w:r>
-        <w:t xml:space="preserve">In response to these barriers, the data shows that experimenting with AI (37 code applications, 17 documents) and educating and training (28 code applications, 14 documents) are the two dominant mechanisms through which managers build organizational capacity to </w:t>
-      </w:r>
+        <w:ind w:left="720"/>
+      </w:pPr>
+      <w:r>
+        <w:t>“The stupidest example is … people want to understand their marketing data better. And it’s really just like you have 20 different sources, you don’t know how to connect them, you don’t know how to put this all together. … The culprit is really still they don’t understand what the issues are.”</w:t>
+      </w:r>
+    </w:p>
+    <w:p>
+      <w:r>
+        <w:t xml:space="preserve">The problem is not data access per se, but the analytical capacity to know what data is needed, in what form, and for what purpose. </w:t>
+      </w:r>
+      <w:r>
+        <w:t>Interviewee 1 noted that marketers often do not automate processes because they seem to find “perceived value in sitting on complicated processes” and “find comfort in bespoke engagements” with technology. She adds:</w:t>
+      </w:r>
+    </w:p>
+    <w:p>
+      <w:pPr>
+        <w:pStyle w:val="Quote"/>
+      </w:pPr>
+      <w:r>
+        <w:t>I think there is a component that is science, which could be automated, and there’s a component that is art, which is the creative and whatever. But you need to decouple the art from the science and use technology for what it’s worth.</w:t>
+      </w:r>
+    </w:p>
+    <w:p>
+      <w:r>
+        <w:t xml:space="preserve">Interviewee 1 </w:t>
+      </w:r>
+      <w:r>
+        <w:t xml:space="preserve">added to this </w:t>
+      </w:r>
+      <w:r>
+        <w:t>that this type of deep process knowledge (a feel for system logic) is precisely what is hardest to augment with AI, because it requires a level of structured thinking that many teams have not yet developed.</w:t>
+      </w:r>
+    </w:p>
+    <w:p>
+      <w:r>
+        <w:rPr>
+          <w:b/>
+          <w:bCs/>
+        </w:rPr>
+        <w:t xml:space="preserve">Manager responses. </w:t>
+      </w:r>
+      <w:r>
+        <w:t xml:space="preserve">Managers respond to resource conditions in three patterns: leveraging available infrastructure to build and deploy fast; navigating gaps through external partnerships and workarounds; and reshaping the foundation through deliberate data-infrastructure investment. </w:t>
+      </w:r>
+    </w:p>
+    <w:p>
       <w:r>
         <w:lastRenderedPageBreak/>
-        <w:t>change. Rather than waiting for perfect conditions, effective managers create structured opportunities to learn through doing. Interviewee 6 summarized this orientation: “I’d rather have something live and test and improve than have two years down the road and then finally have something live.” Interviewee 13 described enabling this at the team level: “Provide freedom to experiment and don’t set this atmosphere of fear that AI is going to replace you.”</w:t>
-      </w:r>
-    </w:p>
-    <w:p>
-      <w:r>
-        <w:t>However, education alone is insufficient to sustain change. Interviewee 17 observed a common pattern encountered in her training work: “After two or three trainings companies basically stop, because then they go back to what they started with.” Sustained capacity-building requires not just initial education but ongoing structural embedding of learning.</w:t>
+        <w:t>Interviewee 16 illustrated the reshaping pattern</w:t>
+      </w:r>
+      <w:r>
+        <w:t>.</w:t>
+      </w:r>
+      <w:r>
+        <w:t xml:space="preserve"> </w:t>
+      </w:r>
+      <w:r>
+        <w:t>He described</w:t>
+      </w:r>
+      <w:r>
+        <w:t xml:space="preserve"> a two-year </w:t>
+      </w:r>
+      <w:r>
+        <w:t>program</w:t>
+      </w:r>
+      <w:r>
+        <w:t xml:space="preserve"> he </w:t>
+      </w:r>
+      <w:r>
+        <w:t>focused on providing clarity regarding the data and processes in use</w:t>
+      </w:r>
+      <w:r>
+        <w:t>: “I started with a track on data governance, basically describing our business definitions and the technical lineage of our digital data landscape.” The same resource base can function as either an accelerator or a bottleneck depending on whether the organizational capacity described in section 4.2.1 is in place to use it.</w:t>
+      </w:r>
+    </w:p>
+    <w:p>
+      <w:r>
+        <w:t>Where these foundational resources are available, they become powerful enablers. Interviewee 4 described his own setup: “I connected an MCP to their Google Analytics and Google Search Console. So I have direct access to that data source in my cloud, and I can run cron jobs and have an agent run reports.” Interviewee 5 similarly observed that once the back-end infrastructure is in place, rapid experimentation becomes possible: “The back-end stuff needs to be extremely robust, and then … you can really build quickly.” Both cases illustrate how data access and tool availability translate directly into the ability to deploy agentic workflows.</w:t>
+      </w:r>
+    </w:p>
+    <w:p>
+      <w:r>
+        <w:t>Budget appeared as a secondary resource constraint. Interviewee 9 captured the tension: “The passion is there, the need is there, the want is there, the brains are there. It’s time, money, and resources.” While budget is not the primary barrier in the data, it becomes a bottleneck when resource availability determines whether AI initiatives can scale from pilot to production.</w:t>
       </w:r>
     </w:p>
     <w:p>
       <w:pPr>
         <w:pStyle w:val="Heading3"/>
-        <w:rPr>
-          <w:color w:val="24292E"/>
-        </w:rPr>
-      </w:pPr>
-      <w:bookmarkStart w:id="187" w:name="_xw6d9a4ef7wu" w:colFirst="0" w:colLast="0"/>
+      </w:pPr>
+      <w:bookmarkStart w:id="187" w:name="_qy9fnmmddxdy" w:colFirst="0" w:colLast="0"/>
       <w:bookmarkEnd w:id="187"/>
       <w:r>
-        <w:rPr>
-          <w:color w:val="24292E"/>
-        </w:rPr>
-        <w:t>4.2.2</w:t>
-      </w:r>
-      <w:r>
-        <w:rPr>
-          <w:color w:val="24292E"/>
-        </w:rPr>
+        <w:t>4.2.3</w:t>
+      </w:r>
+      <w:r>
         <w:tab/>
-        <w:t>Available resources</w:t>
-      </w:r>
-    </w:p>
-    <w:p>
-      <w:r>
-        <w:t>A second cluster of internal conditions concerns the availability of enabling resources: the data, tools, and technical infrastructure that make AI implementation feasible. Having data and tools available and accessible emerged as a critical enabler (21 code applications, 12 documents), while lacking solid data infrastructure was a significant barrier (8 code applications, 6 documents).</w:t>
-      </w:r>
-    </w:p>
-    <w:p>
-      <w:r>
-        <w:t>Data infrastructure emerged as the foundational prerequisite. Interviewee 2 described his organization’s situation plainly: “The infrastructure is not yet in place, and the work on it is really big.” He elaborated that this is not a failure of will but of competing priorities: every improvement to the underlying data platform competes for attention with immediate operational demands. Without a robust and accessible data layer, AI systems cannot be reliably built or deployed.</w:t>
-      </w:r>
-    </w:p>
-    <w:p>
-      <w:r>
-        <w:t>A deeper resource constraint is the absence of systems thinking — the ability to understand how data flows connect across tools, departments, and processes. Interviewee 13 described this as the root cause behind many apparent AI failures:</w:t>
-      </w:r>
-    </w:p>
-    <w:p>
-      <w:pPr>
+        <w:t>Strategic direction &amp; leadership</w:t>
+      </w:r>
+    </w:p>
+    <w:p>
+      <w:r>
+        <w:t xml:space="preserve">The conditions that make strategic direction necessary are broadly consistent across the data. Organizations frequently approach agentic AI without a clear rationale: they want AI because others are using it, not because they have identified a problem it can solve. Interviewee 1 described this pattern: “There will be a lot of clients and companies that want AI, but they won’t know why, outside of the fact that someone tells them they should.” Interviewee 17 noted a related pattern: organizations think in tools rather than business objectives, seeking applications before establishing what they need to achieve. The consequence is that even when AI is deployed, it generates activity without direction. Interviewee 10 observed that when </w:t>
+      </w:r>
+      <w:r>
+        <w:lastRenderedPageBreak/>
+        <w:t>organizations give employees time for AI experimentation, they attach no goals, so potential and initiative are both lost.</w:t>
+      </w:r>
+    </w:p>
+    <w:p>
+      <w:r>
+        <w:t>A third cluster of conditions concerns strategic direction and leadership, covering the organizational structures and behaviors that orient AI adoption toward meaningful goals. Where section 4.2.1 described the people-level capacity to change, this section describes the organizational-level direction that makes change purposeful. The data surfaces four related dynamics: the role of providing clarity, the impact of individual AI champions, the importance of leadership backing, and the process of bringing people along.</w:t>
+      </w:r>
+    </w:p>
+    <w:p>
+      <w:r>
+        <w:t>Providing clarity, that is, naming where the organization is going with AI, which use cases matter, and what success looks like, emerged as the most broadly distributed enabling behavior in this section. Unlike championing, which is driven by individuals, or leadership backing, which is top-down, providing clarity is a managerial act that can happen at any organizational level. Its cross-condition effect is significant: clarity directly reduces the resistance and paralysis described in section 4.2.1, because employees who understand the direction and purpose of AI adoption are less likely to resist or stall. Interviewee 6 captured the essential move: “This is the vision. This is where we’re going. Help me get there.” Interviewee 1 noted the downstream consequence of its absence: “If you don’t have clarity, jumping into execution will only surface a lot of problems.”</w:t>
+      </w:r>
+    </w:p>
+    <w:p>
+      <w:r>
+        <w:t>Individual AI champions emerged as a disproportionately influential factor. An AI champion is a person who, often without formal mandate, drives AI initiatives forward through personal initiative, visible results, and internal advocacy. Interviewee 9 described a vivid example from her organization:</w:t>
+      </w:r>
+    </w:p>
+    <w:p>
+      <w:pPr>
+        <w:pStyle w:val="Quote"/>
         <w:ind w:left="720"/>
       </w:pPr>
       <w:r>
-        <w:t xml:space="preserve">“The stupidest example is … people want to understand their marketing data better. And it’s really just like you have 20 different sources, you don’t know how to </w:t>
-      </w:r>
+        <w:t>“</w:t>
+      </w:r>
+      <w:r>
+        <w:t>[An AI platfrom]</w:t>
+      </w:r>
+      <w:r>
+        <w:t xml:space="preserve"> was created originally by … our </w:t>
+      </w:r>
+      <w:r>
+        <w:t>[role]</w:t>
+      </w:r>
+      <w:r>
+        <w:t xml:space="preserve"> director that dabbles in dev</w:t>
+      </w:r>
+      <w:r>
+        <w:t>elopment</w:t>
+      </w:r>
+      <w:r>
+        <w:t>, and he created it, and it</w:t>
+      </w:r>
+      <w:r>
+        <w:t xml:space="preserve"> has </w:t>
+      </w:r>
+      <w:r>
+        <w:t>blown up, and so now there’s millions of dollars of funding.”</w:t>
+      </w:r>
+    </w:p>
+    <w:p>
       <w:r>
         <w:lastRenderedPageBreak/>
-        <w:t>connect them, you don’t know how to put this all together. … The culprit is really still they don’t understand what the issues are.”</w:t>
-      </w:r>
-    </w:p>
-    <w:p>
-      <w:r>
-        <w:t>The problem is not data access per se, but the analytical capacity to know what data is needed, in what form, and for what purpose. Interviewee 1 noted that this type of deep process knowledge — a feel for system logic — is precisely what is hardest to augment with AI, because it requires a level of structured thinking that many teams have not yet developed.</w:t>
-      </w:r>
-    </w:p>
-    <w:p>
-      <w:r>
-        <w:t>Where these foundational resources are available, they become powerful enablers. Interviewee 4 described his own setup: “I connected an MCP to their Google Analytics and Google Search Console. So I have direct access to that data source in my cloud, and I can run cron jobs and have an agent run reports.” Interviewee 5 similarly observed that once the back-end infrastructure is in place, rapid experimentation becomes possible: “The back-end stuff needs to be extremely robust, and then … you can really build quickly.” Both cases illustrate how data access and tool availability translate directly into the ability to deploy agentic workflows.</w:t>
-      </w:r>
-    </w:p>
-    <w:p>
-      <w:r>
-        <w:t>Budget appeared as a secondary resource constraint (2 code applications). Interviewee 9 captured the tension: “The passion is there, the need is there, the want is there, the brains are there. It’s time, money, and resources.” While budget is not the primary barrier in the data, it becomes a bottleneck when resource availability determines whether AI initiatives can scale from pilot to production.</w:t>
+        <w:t>A single individual’s initiative, when it produces visible results, can unlock significant organizational investment. Interviewee 6 described her own approach: “I hear a lot of other companies where the board is afraid or legal is holding it back … Sorry, but you’d have to believe me on my blue eyes because I’m going to make this happen.”</w:t>
+      </w:r>
+    </w:p>
+    <w:p>
+      <w:r>
+        <w:t>Leadership backing refers to the visible endorsement, resource authorization, and organizational protection that senior leaders provide for AI initiatives. It amplifies the champion effect.</w:t>
+      </w:r>
+      <w:r>
+        <w:t xml:space="preserve"> Without visible endorsement from leadership, AI initiatives tend to stall at the pilot stage. Interviewee 4 noted that the current moment requires leaders to help employees make sense of change: “People are drinking from a fire hose. They need to have that leadership that tells them their importance, they’re part of the team, and their work matters.” Interviewee 17 identified three conditions that must align for AI adoption to succeed: “Leadership wants us to work with AI. But can employees do that too? Do they do it and do they want to? Those are basically three things. And when those three things align with each other, you get a fantastic AI implementation.”</w:t>
+      </w:r>
+    </w:p>
+    <w:p>
+      <w:r>
+        <w:rPr>
+          <w:i/>
+        </w:rPr>
+        <w:t>Bringing people along</w:t>
+      </w:r>
+      <w:r>
+        <w:t xml:space="preserve"> refers to the managerial process of building alignment, managing resistance, and developing shared commitment to AI adoption within the organization.</w:t>
+      </w:r>
+    </w:p>
+    <w:p>
+      <w:r>
+        <w:t xml:space="preserve">The process of bringing people along, understood as change management at the team and organizational level, was one of the most consistently documented behaviors in this block. </w:t>
+      </w:r>
+      <w:r>
+        <w:t>Interviewee 14 framed the scale of the challenge: “Thirty percent of all AI trajectories is just technology; sixty to seventy percent is actually us as humans or as an organization.” Interviewee</w:t>
+      </w:r>
+      <w:r>
+        <w:t xml:space="preserve"> 13 described a practical approach: using lighthouse projects as demonstration cases that make the value of AI tangible to skeptical colleagues. “Show them the first one that can be automated or made a lot quicker … then, well, then often they understand much better what the use cases would be.”</w:t>
       </w:r>
     </w:p>
     <w:p>
       <w:pPr>
         <w:pStyle w:val="Heading3"/>
       </w:pPr>
-      <w:bookmarkStart w:id="188" w:name="_qy9fnmmddxdy" w:colFirst="0" w:colLast="0"/>
+      <w:r>
+        <w:lastRenderedPageBreak/>
+        <w:t>4.2.4</w:t>
+      </w:r>
+      <w:r>
+        <w:tab/>
+        <w:t>Governance &amp; organizational friction</w:t>
+      </w:r>
+    </w:p>
+    <w:p>
+      <w:r>
+        <w:t>A fourth cluster of conditions concerns governance and organizational friction, covering the IT/legal/compliance gatekeeping, procurement processes, politics, and silos that impede AI adoption. Unlike the conditions in sections 4.2.1 to 4.2.3, which managers actively reshape, governance friction is predominantly navigated: unfavorable governance structures are treated as fixed features of the environment to be worked around rather than changed. This tendency is itself a finding: reshaping governance (actually changing the structures rather than routing around them) is rare in the data. Governance friction appears in several forms: IT security and procurement processes slowing deployment, legal and compliance concerns blocking tool use, and organizational politics preventing experimentation. Interviewee 13 observed a pattern in large enterprises:</w:t>
+      </w:r>
+    </w:p>
+    <w:p>
+      <w:pPr>
+        <w:pStyle w:val="Quote"/>
+        <w:ind w:left="720"/>
+      </w:pPr>
+      <w:r>
+        <w:t>“They are not allowed to use agentic AI a lot … there’s this weird distinction people make. It’s totally fine to buy any kind of tool you don’t know anything about and put it into the system. But agentic AI? That’s completely out of range.”</w:t>
+      </w:r>
+    </w:p>
+    <w:p>
+      <w:r>
+        <w:t>Interviewee 6 noted that governance structures, while legitimate, can prevent organizations from learning: “If we would’ve been stopped at the beginning, ‘You cannot use this system because you’re already on this system’, I think that is something that’s really holding people back.”</w:t>
+      </w:r>
+    </w:p>
+    <w:p>
+      <w:r>
+        <w:t xml:space="preserve">Taken together, the four conditions described in sections 4.2.1 to 4.2.4 represent the organizational substrate on which AI value creation depends. They are not independent: poor direction amplifies capacity problems; resource gaps deepen paralysis; governance friction compounds both. The behaviors documented across these sections: educating, experimenting, providing clarity, bringing people along, leveraging resources, navigating friction. These behaviors address multiple conditions simultaneously and in rough sequence. Organizations </w:t>
+      </w:r>
+      <w:r>
+        <w:lastRenderedPageBreak/>
+        <w:t>that neglect any one dimension tend to find that the others stall. This pattern surfaces most acutely in section 4.5.3: organizations that invest only in experimentation without clarity or education tend to generate pilots that do not scale.</w:t>
+      </w:r>
+    </w:p>
+    <w:p>
+      <w:pPr>
+        <w:pStyle w:val="Heading2"/>
+        <w:rPr>
+          <w:color w:val="00312A"/>
+        </w:rPr>
+      </w:pPr>
+      <w:bookmarkStart w:id="188" w:name="_hojo1f9yxiy" w:colFirst="0" w:colLast="0"/>
       <w:bookmarkEnd w:id="188"/>
-      <w:r>
-        <w:t>4.2.3</w:t>
-      </w:r>
-      <w:r>
-        <w:tab/>
-        <w:t>Leadership &amp; Governance</w:t>
-      </w:r>
-    </w:p>
-    <w:p/>
-    <w:p>
-      <w:r>
-        <w:t>The third cluster of internal conditions concerns leadership and governance — the organizational structures and behaviors that either enable or impede AI adoption. The data surfaces three related dynamics: the role of individual AI champions, the importance of leadership backing, and the friction created by bureaucratic governance.</w:t>
-      </w:r>
-    </w:p>
-    <w:p>
-      <w:r>
-        <w:t xml:space="preserve">Individual AI champions emerged as a disproportionately influential factor (5 code applications but high narrative weight across the corpus). An AI champion is a person who, </w:t>
-      </w:r>
-      <w:r>
-        <w:lastRenderedPageBreak/>
-        <w:t>often without formal mandate, drives AI initiatives forward through personal initiative, visible results, and internal advocacy. Interviewee 9 described a vivid example from her organization:</w:t>
-      </w:r>
-    </w:p>
-    <w:p>
-      <w:pPr>
-        <w:ind w:left="720"/>
-      </w:pPr>
-      <w:r>
-        <w:t>“Affinity Hub was created originally by … our global creative director that dabbles in dev, and he created it, and it’s like blown up, and so now there’s millions of dollars of funding.”</w:t>
-      </w:r>
-    </w:p>
-    <w:p>
-      <w:r>
-        <w:t>A single individual’s initiative, when it produces visible results, can unlock significant organizational investment. Interviewee 6 embodied this champion role in her own organization — consistently pushing AI initiatives forward, absorbing resistance, and creating space for others to experiment.</w:t>
-      </w:r>
-    </w:p>
-    <w:p>
-      <w:r>
-        <w:t>Leadership backing amplifies the champion effect (14 code applications, 10 documents). Without visible endorsement from leadership, AI initiatives tend to stall at the pilot stage. Interviewee 4 noted that the current moment requires leaders to help employees make sense of change: “People are drinking from a fire hose. They need to have that leadership that tells them their importance, they’re part of the team, and their work matters.” Interviewee 17 identified three conditions that must align for AI adoption to succeed: “Leadership wants us to work with AI. But can employees do that too? Do they do it and do they want to? Those are basically three things. And when those three things align with each other, you get a fantastic AI implementation.”</w:t>
-      </w:r>
-    </w:p>
-    <w:p>
-      <w:ins w:id="189" w:author="Claude" w:date="2026-06-01T00:00:00Z">
-        <w:r>
-          <w:rPr>
-            <w:i/>
-          </w:rPr>
-          <w:t>Bringing people along</w:t>
-        </w:r>
-        <w:r>
-          <w:t xml:space="preserve"> refers to the managerial process of building alignment, managing resistance, and developing shared commitment to AI adoption within the organization.</w:t>
-        </w:r>
-      </w:ins>
-    </w:p>
-    <w:p>
-      <w:r>
-        <w:t xml:space="preserve">The process of bringing people along — change management at the team and organizational level — was one of the most richly coded themes in this block (24 code applications, 13 documents). Interviewee 6 captured the essential managerial move: “This is the vision. This is where we’re going. Help me get there.” Interviewee 13 described a practical approach: using lighthouse projects as demonstration cases that make the value of AI tangible to </w:t>
-      </w:r>
-      <w:r>
-        <w:lastRenderedPageBreak/>
-        <w:t>skeptical colleagues. “Show them the first one that can be automated or made a lot quicker … then, well, then often they understand much better what the use cases would be.”</w:t>
-      </w:r>
-    </w:p>
-    <w:p>
-      <w:r>
-        <w:t>Alongside these enabling behaviors, bureaucratic governance emerged as a significant opposing force (21 code applications, 13 documents). Governance friction appeared in several forms: IT security and procurement processes slowing deployment, legal and compliance concerns blocking tool use, and organizational politics preventing experimentation. Interviewee 13 observed a pattern in large enterprises:</w:t>
-      </w:r>
-    </w:p>
-    <w:p>
-      <w:pPr>
-        <w:ind w:left="720"/>
-      </w:pPr>
-      <w:r>
-        <w:t>“They are not allowed to use agentic AI a lot … there’s this weird distinction people make. It’s totally fine to buy any kind of tool you don’t know anything about and put it into the system. But agentic AI? That’s completely out of range.”</w:t>
-      </w:r>
-    </w:p>
-    <w:p>
-      <w:r>
-        <w:t>Interviewee 6 noted that governance structures, while legitimate, can prevent organizations from learning: “If we would’ve been stopped at the beginning — ‘You cannot use this system because you’re already on this system’ — I think that is something that’s really holding people back.”</w:t>
-      </w:r>
-    </w:p>
-    <w:p>
-      <w:r>
-        <w:t>Taken together, the internal conditions described in sections 4.2.1 to 4.2.3 represent the organizational substrate on which AI value creation depends. How managers navigate these conditions — leveraging favorable ones and working around or reshaping unfavorable ones — directly shapes the adoption processes described in section 4.3.</w:t>
-      </w:r>
-    </w:p>
-    <w:p>
-      <w:pPr>
-        <w:pStyle w:val="Heading2"/>
-        <w:rPr>
-          <w:color w:val="00312A"/>
-        </w:rPr>
-      </w:pPr>
-      <w:bookmarkStart w:id="190" w:name="_hojo1f9yxiy" w:colFirst="0" w:colLast="0"/>
-      <w:bookmarkEnd w:id="190"/>
       <w:r>
         <w:rPr>
           <w:color w:val="00312A"/>
@@ -17185,8 +17455,8 @@
           <w:color w:val="00312A"/>
         </w:rPr>
       </w:pPr>
-      <w:bookmarkStart w:id="191" w:name="_iuvuby6hzug8" w:colFirst="0" w:colLast="0"/>
-      <w:bookmarkEnd w:id="191"/>
+      <w:bookmarkStart w:id="189" w:name="_iuvuby6hzug8" w:colFirst="0" w:colLast="0"/>
+      <w:bookmarkEnd w:id="189"/>
       <w:r>
         <w:rPr>
           <w:color w:val="00312A"/>
@@ -17225,7 +17495,6 @@
         <w:rPr>
           <w:color w:val="00312A"/>
         </w:rPr>
-        <w:lastRenderedPageBreak/>
         <w:t>Generic and personal-productivity use cases</w:t>
       </w:r>
     </w:p>
@@ -17284,6 +17553,7 @@
         <w:rPr>
           <w:color w:val="00312A"/>
         </w:rPr>
+        <w:lastRenderedPageBreak/>
         <w:t>Content creation and campaign management are the most visible use cases to outside observers but, by participants’ own accounts, among the least transformative. The dominant pattern is augmenting existing copywriting, briefing, and creative workflows rather than redesigning them. Interviewee 4 described the highest-productivity configuration in the data: a personal stack combining Obsidian as a memory layer, Claude Code as the execution engine, GitHub for file synchronisation, and per-client vaults for context isolation: “I have persistent memory using, um, Obsidian. And I just… My productivity just went 10X.” The key driver is not the model itself but the surrounding architecture that provides consistent, long-lived context.</w:t>
       </w:r>
     </w:p>
@@ -17297,54 +17567,54 @@
         <w:rPr>
           <w:color w:val="00312A"/>
         </w:rPr>
-        <w:t xml:space="preserve">Brand governance is an adjacent use case in this generic-productivity cluster. Interviewee 3, working in a marketing team with strong leadership encouragement to experiment, described an assistant trained on the company’s brand guidelines and persona </w:t>
+        <w:t>Brand governance is an adjacent use case in this generic-productivity cluster. Interviewee 3, working in a marketing team with strong leadership encouragement to experiment, described an assistant trained on the company’s brand guidelines and persona documents that evaluates whether new content is brand-aligned before publication — collapsing what had been a long approval chain into a real-time check.</w:t>
+      </w:r>
+    </w:p>
+    <w:p>
+      <w:pPr>
+        <w:pStyle w:val="Heading4"/>
+        <w:rPr>
+          <w:color w:val="00312A"/>
+        </w:rPr>
+      </w:pPr>
+      <w:r>
+        <w:rPr>
+          <w:color w:val="00312A"/>
+        </w:rPr>
+        <w:t>Customer-facing agents</w:t>
+      </w:r>
+    </w:p>
+    <w:p>
+      <w:pPr>
+        <w:rPr>
+          <w:color w:val="00312A"/>
+        </w:rPr>
+      </w:pPr>
+      <w:r>
+        <w:rPr>
+          <w:color w:val="00312A"/>
+        </w:rPr>
+        <w:t>Customer-facing use cases are fewer in number but higher in commercial stakes. Customer-service and sales-assistant agents that handle routine queries and recognize commercial moments — upsells, membership changes, re-orders — are described as the most commercially compelling agentic deployments. Interviewee 12 noted that these agents have, over the past two years, crossed a quality threshold they previously never reached: “they’ve actually gotten really good because they’re leveraging the conversational capabilities of these LLMs.” Interviewee 6 described a chatbot programme that combines customer-experience improvement with direct commercial outcomes — the same agent that handles a membership question can identify an upgrade opportunity and execute it.</w:t>
+      </w:r>
+    </w:p>
+    <w:p>
+      <w:pPr>
+        <w:rPr>
+          <w:color w:val="00312A"/>
+        </w:rPr>
+      </w:pPr>
+      <w:r>
+        <w:rPr>
+          <w:color w:val="00312A"/>
+        </w:rPr>
+        <w:t xml:space="preserve">Advertising optimization agents form a second customer-facing archetype. These agents operate autonomously within ad platforms, adjusting bids, targeting parameters, and budget </w:t>
       </w:r>
       <w:r>
         <w:rPr>
           <w:color w:val="00312A"/>
         </w:rPr>
         <w:lastRenderedPageBreak/>
-        <w:t>documents that evaluates whether new content is brand-aligned before publication — collapsing what had been a long approval chain into a real-time check.</w:t>
-      </w:r>
-    </w:p>
-    <w:p>
-      <w:pPr>
-        <w:pStyle w:val="Heading4"/>
-        <w:rPr>
-          <w:color w:val="00312A"/>
-        </w:rPr>
-      </w:pPr>
-      <w:r>
-        <w:rPr>
-          <w:color w:val="00312A"/>
-        </w:rPr>
-        <w:t>Customer-facing agents</w:t>
-      </w:r>
-    </w:p>
-    <w:p>
-      <w:pPr>
-        <w:rPr>
-          <w:color w:val="00312A"/>
-        </w:rPr>
-      </w:pPr>
-      <w:r>
-        <w:rPr>
-          <w:color w:val="00312A"/>
-        </w:rPr>
-        <w:t>Customer-facing use cases are fewer in number but higher in commercial stakes. Customer-service and sales-assistant agents that handle routine queries and recognize commercial moments — upsells, membership changes, re-orders — are described as the most commercially compelling agentic deployments. Interviewee 12 noted that these agents have, over the past two years, crossed a quality threshold they previously never reached: “they’ve actually gotten really good because they’re leveraging the conversational capabilities of these LLMs.” Interviewee 6 described a chatbot programme that combines customer-experience improvement with direct commercial outcomes — the same agent that handles a membership question can identify an upgrade opportunity and execute it.</w:t>
-      </w:r>
-    </w:p>
-    <w:p>
-      <w:pPr>
-        <w:rPr>
-          <w:color w:val="00312A"/>
-        </w:rPr>
-      </w:pPr>
-      <w:r>
-        <w:rPr>
-          <w:color w:val="00312A"/>
-        </w:rPr>
-        <w:t>Advertising optimization agents form a second customer-facing archetype. These agents operate autonomously within ad platforms, adjusting bids, targeting parameters, and budget allocation against a specified ROAS target without per-decision human approval. Interviewee 8 described measurable outcomes from such a deployment:</w:t>
+        <w:t>allocation against a specified ROAS target without per-decision human approval. Interviewee 8 described measurable outcomes from such a deployment:</w:t>
       </w:r>
     </w:p>
     <w:p>
@@ -17403,40 +17673,40 @@
         <w:rPr>
           <w:color w:val="00312A"/>
         </w:rPr>
-        <w:t xml:space="preserve">Internal process automation is the archetype where human-AI collaboration is most clearly structured. Workflows that previously required a human to run scheduled queries, review outputs, populate reports, and compose communications are executed by chained AI </w:t>
+        <w:t>Internal process automation is the archetype where human-AI collaboration is most clearly structured. Workflows that previously required a human to run scheduled queries, review outputs, populate reports, and compose communications are executed by chained AI tools with human oversight only at the output stage. Interviewee 15 described the emerging connector-based model in the context of agentic customer re-ordering, while Interviewee 10 noted that AI has effectively eliminated the capacity constraint on plugging analyst-equivalent intelligence into decision points across marketing operations: “I can plug in a data analyst almost anywhere to support what I’m doing.”</w:t>
+      </w:r>
+    </w:p>
+    <w:p>
+      <w:pPr>
+        <w:rPr>
+          <w:color w:val="00312A"/>
+        </w:rPr>
+      </w:pPr>
+      <w:r>
+        <w:rPr>
+          <w:color w:val="00312A"/>
+        </w:rPr>
+        <w:t>The internal automation archetype extends beyond commercial marketing contexts. Interviewee 2, working at a national sports federation, described an initiative to apply agentic AI to volunteer scheduling — matching volunteers to club roles, shifts, and locations across hundreds of member clubs — as an illustration of how process automation addresses coordination costs that commercial metrics do not easily capture.</w:t>
+      </w:r>
+    </w:p>
+    <w:p>
+      <w:pPr>
+        <w:rPr>
+          <w:color w:val="00312A"/>
+        </w:rPr>
+      </w:pPr>
+      <w:r>
+        <w:rPr>
+          <w:color w:val="00312A"/>
+        </w:rPr>
+        <w:t xml:space="preserve">Across the interviews, a consistent gap emerges between how agentic AI is positioned — in proposals, pitches, and internal leadership communications — and what is actually running in production. Participants describe demonstrations and narratives in which agentic AI features prominently while in practice the same workflow remains manual, scripted, or at most partially </w:t>
       </w:r>
       <w:r>
         <w:rPr>
           <w:color w:val="00312A"/>
         </w:rPr>
         <w:lastRenderedPageBreak/>
-        <w:t>tools with human oversight only at the output stage. Interviewee 15 described the emerging connector-based model in the context of agentic customer re-ordering, while Interviewee 10 noted that AI has effectively eliminated the capacity constraint on plugging analyst-equivalent intelligence into decision points across marketing operations: “I can plug in a data analyst almost anywhere to support what I’m doing.”</w:t>
-      </w:r>
-    </w:p>
-    <w:p>
-      <w:pPr>
-        <w:rPr>
-          <w:color w:val="00312A"/>
-        </w:rPr>
-      </w:pPr>
-      <w:r>
-        <w:rPr>
-          <w:color w:val="00312A"/>
-        </w:rPr>
-        <w:t>The internal automation archetype extends beyond commercial marketing contexts. Interviewee 2, working at a national sports federation, described an initiative to apply agentic AI to volunteer scheduling — matching volunteers to club roles, shifts, and locations across hundreds of member clubs — as an illustration of how process automation addresses coordination costs that commercial metrics do not easily capture.</w:t>
-      </w:r>
-    </w:p>
-    <w:p>
-      <w:pPr>
-        <w:rPr>
-          <w:color w:val="00312A"/>
-        </w:rPr>
-      </w:pPr>
-      <w:r>
-        <w:rPr>
-          <w:color w:val="00312A"/>
-        </w:rPr>
-        <w:t>Across the interviews, a consistent gap emerges between how agentic AI is positioned — in proposals, pitches, and internal leadership communications — and what is actually running in production. Participants describe demonstrations and narratives in which agentic AI features prominently while in practice the same workflow remains manual, scripted, or at most partially automated. This gap appears across organization types: large agencies, in-house marketing teams, and scale-ups all exhibit it to some degree.</w:t>
+        <w:t>automated. This gap appears across organization types: large agencies, in-house marketing teams, and scale-ups all exhibit it to some degree.</w:t>
       </w:r>
     </w:p>
     <w:p>
@@ -17494,14 +17764,7 @@
         <w:rPr>
           <w:color w:val="00312A"/>
         </w:rPr>
-        <w:t xml:space="preserve">The optics gap has two organizational implications. First, it creates confusion about what AI actually does. When employees hear that the organization is ‘using agentic AI’ in pitches and </w:t>
-      </w:r>
-      <w:r>
-        <w:rPr>
-          <w:color w:val="00312A"/>
-        </w:rPr>
-        <w:lastRenderedPageBreak/>
-        <w:t>leadership communications but see no corresponding change in their own workflows, the result is either skepticism about AI’s practical utility or inflated expectations that become obstacles when real deployments are less impressive than the narrative. Second, it distorts accountability: if stated capability does not correspond to operational reality, it becomes difficult to measure progress, identify blockers, or allocate investment accurately. Several participants noted that organizations claiming the most advanced AI capability were among those where operational adoption was hardest to verify in practice.</w:t>
+        <w:t>The optics gap has two organizational implications. First, it creates confusion about what AI actually does. When employees hear that the organization is ‘using agentic AI’ in pitches and leadership communications but see no corresponding change in their own workflows, the result is either skepticism about AI’s practical utility or inflated expectations that become obstacles when real deployments are less impressive than the narrative. Second, it distorts accountability: if stated capability does not correspond to operational reality, it becomes difficult to measure progress, identify blockers, or allocate investment accurately. Several participants noted that organizations claiming the most advanced AI capability were among those where operational adoption was hardest to verify in practice.</w:t>
       </w:r>
     </w:p>
     <w:p>
@@ -17511,8 +17774,8 @@
           <w:color w:val="00312A"/>
         </w:rPr>
       </w:pPr>
-      <w:bookmarkStart w:id="192" w:name="_niqmcast9jsc" w:colFirst="0" w:colLast="0"/>
-      <w:bookmarkEnd w:id="192"/>
+      <w:bookmarkStart w:id="190" w:name="_niqmcast9jsc" w:colFirst="0" w:colLast="0"/>
+      <w:bookmarkEnd w:id="190"/>
       <w:r>
         <w:rPr>
           <w:color w:val="00312A"/>
@@ -17550,7 +17813,14 @@
         <w:rPr>
           <w:color w:val="00312A"/>
         </w:rPr>
-        <w:t>On the feature side, tool calling and integrations (11 code applications) and accessing the entire database as context (14) are the enabling features most closely tied to value creation. Tool calling allows an agent to interact with external systems — retrieving data, writing records, triggering workflows — rather than remaining confined to a conversational interface. Database-as-context allows the agent to reason over the full set of relevant information rather than only what the user provides in a single prompt. Interviewee 6 framed the context argument by contrasting her AI-powered customer-service agent with the outsourced human agents it had partly replaced:</w:t>
+        <w:t xml:space="preserve">On the feature side, tool calling and integrations (11 code applications) and accessing the entire database as context (14) are the enabling features most closely tied to value creation. Tool calling allows an agent to interact with external systems — retrieving data, writing records, </w:t>
+      </w:r>
+      <w:r>
+        <w:rPr>
+          <w:color w:val="00312A"/>
+        </w:rPr>
+        <w:lastRenderedPageBreak/>
+        <w:t>triggering workflows — rather than remaining confined to a conversational interface. Database-as-context allows the agent to reason over the full set of relevant information rather than only what the user provides in a single prompt. Interviewee 6 framed the context argument by contrasting her AI-powered customer-service agent with the outsourced human agents it had partly replaced:</w:t>
       </w:r>
     </w:p>
     <w:p>
@@ -17590,42 +17860,36 @@
         <w:rPr>
           <w:color w:val="00312A"/>
         </w:rPr>
-        <w:t xml:space="preserve">On the strategy side, four patterns recur. Evaluating output — maintaining human judgment over the quality, accuracy, and brand-fit of AI-generated material — is described across virtually every interview as the primary risk management strategy. Interviewee 10 argued </w:t>
-      </w:r>
+        <w:t>On the strategy side, four patterns recur. Evaluating output — maintaining human judgment over the quality, accuracy, and brand-fit of AI-generated material — is described across virtually every interview as the primary risk management strategy. Interviewee 10 argued that evaluative capacity becomes more, not less, important as AI takes on more of the production work: “interpretation becomes more important: what’s good, what’s not, what fits us, what doesn’t … that requires deep domain expertise.” Determining input — the discipline of specifying data, context, and instructions carefully — is the complementary discipline. Interviewee 14 captured the dependency plainly: “what you put into it ultimately determines what comes out.”</w:t>
+      </w:r>
+    </w:p>
+    <w:p>
+      <w:pPr>
+        <w:rPr>
+          <w:color w:val="00312A"/>
+        </w:rPr>
+      </w:pPr>
+      <w:r>
+        <w:rPr>
+          <w:color w:val="00312A"/>
+        </w:rPr>
+        <w:t>Personalizing agents — configuring system prompts, personas, and knowledge bases to match the specific use case, brand voice, and data environment — is described as the factor that most distinguishes high-performing deployments from generic ones. Building a solid harness (context engineering) is the most technically demanding strategy: the deliberate design of the data, memory, tool access, and planning logic that surrounds the model. Interviewee 5 used the term ‘harness’ explicitly: “the big change of agentic AI right now is … very depending on who finds the right harness around the AI.” These four strategies are not independent; the highest-performing configurations in the data combine all four.</w:t>
+      </w:r>
+    </w:p>
+    <w:p>
+      <w:pPr>
+        <w:pStyle w:val="Heading2"/>
+        <w:rPr>
+          <w:color w:val="00312A"/>
+        </w:rPr>
+      </w:pPr>
+      <w:bookmarkStart w:id="191" w:name="_d3o8hfs61axc" w:colFirst="0" w:colLast="0"/>
+      <w:bookmarkEnd w:id="191"/>
       <w:r>
         <w:rPr>
           <w:color w:val="00312A"/>
         </w:rPr>
         <w:lastRenderedPageBreak/>
-        <w:t>that evaluative capacity becomes more, not less, important as AI takes on more of the production work: “interpretation becomes more important: what’s good, what’s not, what fits us, what doesn’t … that requires deep domain expertise.” Determining input — the discipline of specifying data, context, and instructions carefully — is the complementary discipline. Interviewee 14 captured the dependency plainly: “what you put into it ultimately determines what comes out.”</w:t>
-      </w:r>
-    </w:p>
-    <w:p>
-      <w:pPr>
-        <w:rPr>
-          <w:color w:val="00312A"/>
-        </w:rPr>
-      </w:pPr>
-      <w:r>
-        <w:rPr>
-          <w:color w:val="00312A"/>
-        </w:rPr>
-        <w:t>Personalizing agents — configuring system prompts, personas, and knowledge bases to match the specific use case, brand voice, and data environment — is described as the factor that most distinguishes high-performing deployments from generic ones. Building a solid harness (context engineering) is the most technically demanding strategy: the deliberate design of the data, memory, tool access, and planning logic that surrounds the model. Interviewee 5 used the term ‘harness’ explicitly: “the big change of agentic AI right now is … very depending on who finds the right harness around the AI.” These four strategies are not independent; the highest-performing configurations in the data combine all four.</w:t>
-      </w:r>
-    </w:p>
-    <w:p>
-      <w:pPr>
-        <w:pStyle w:val="Heading2"/>
-        <w:rPr>
-          <w:color w:val="00312A"/>
-        </w:rPr>
-      </w:pPr>
-      <w:bookmarkStart w:id="193" w:name="_d3o8hfs61axc" w:colFirst="0" w:colLast="0"/>
-      <w:bookmarkEnd w:id="193"/>
-      <w:r>
-        <w:rPr>
-          <w:color w:val="00312A"/>
-        </w:rPr>
         <w:t>4.4</w:t>
       </w:r>
       <w:r>
@@ -17635,14 +17899,14 @@
         <w:tab/>
         <w:t xml:space="preserve">Value </w:t>
       </w:r>
-      <w:commentRangeStart w:id="194"/>
+      <w:commentRangeStart w:id="192"/>
       <w:r>
         <w:rPr>
           <w:color w:val="00312A"/>
         </w:rPr>
         <w:t>Outcomes</w:t>
       </w:r>
-      <w:commentRangeEnd w:id="194"/>
+      <w:commentRangeEnd w:id="192"/>
       <w:r>
         <w:rPr>
           <w:rStyle w:val="CommentReference"/>
@@ -17650,7 +17914,7 @@
           <w:sz w:val="22"/>
           <w:szCs w:val="22"/>
         </w:rPr>
-        <w:commentReference w:id="194"/>
+        <w:commentReference w:id="192"/>
       </w:r>
     </w:p>
     <w:p>
@@ -17676,14 +17940,7 @@
         <w:rPr>
           <w:color w:val="00312A"/>
         </w:rPr>
-        <w:t xml:space="preserve">The data make the mediating role of managerial behavior visible in a specific way: participants with near-identical technology access report divergent outcomes, and the differentiating factors are consistently organizational rather than technical. The quality of the data, the clarity of the use case, the investment in change management, and the design of </w:t>
-      </w:r>
-      <w:r>
-        <w:rPr>
-          <w:color w:val="00312A"/>
-        </w:rPr>
-        <w:lastRenderedPageBreak/>
-        <w:t>governance together determine which part of the value portfolio is captured and which is lost. This is the chapter’s central finding: value creation with agentic AI is an inside-out process, shaped more by what organizations do with the technology than by which technology they choose. The three subsections that follow detail the benefit, sacrifice, and risk families; the cross-cutting implications are taken up in Chapter 5.</w:t>
+        <w:t>The data make the mediating role of managerial behavior visible in a specific way: participants with near-identical technology access report divergent outcomes, and the differentiating factors are consistently organizational rather than technical. The quality of the data, the clarity of the use case, the investment in change management, and the design of governance together determine which part of the value portfolio is captured and which is lost. This is the chapter’s central finding: value creation with agentic AI is an inside-out process, shaped more by what organizations do with the technology than by which technology they choose. The three subsections that follow detail the benefit, sacrifice, and risk families; the cross-cutting implications are taken up in Chapter 5.</w:t>
       </w:r>
     </w:p>
     <w:p>
@@ -17693,8 +17950,8 @@
           <w:color w:val="00312A"/>
         </w:rPr>
       </w:pPr>
-      <w:bookmarkStart w:id="195" w:name="_psp9v76zeahl" w:colFirst="0" w:colLast="0"/>
-      <w:bookmarkEnd w:id="195"/>
+      <w:bookmarkStart w:id="193" w:name="_psp9v76zeahl" w:colFirst="0" w:colLast="0"/>
+      <w:bookmarkEnd w:id="193"/>
       <w:r>
         <w:rPr>
           <w:color w:val="00312A"/>
@@ -17750,6 +18007,7 @@
           <w:iCs/>
           <w:color w:val="00312A"/>
         </w:rPr>
+        <w:lastRenderedPageBreak/>
         <w:t>you can always build something very quickly that gives you the same information as if you would have an analyst sitting there or some kind of a controller or whatever, because the same work is done in there. It’s not as good as if you would have a great analyst or great controller, but it’s pretty much the same as if you have a mediocre one and, uh, still have to sense check what comes out of it.</w:t>
       </w:r>
     </w:p>
@@ -17777,14 +18035,7 @@
         <w:rPr>
           <w:color w:val="00312A"/>
         </w:rPr>
-        <w:t xml:space="preserve">Scale is the benefit most clearly impossible without AI. Generating large numbers of product-page variants, monitoring sentiment across many competitor channels simultaneously, or personalizing communications at the individual rather than the segment level are not viable at human labor cost. Extending the personal skillset is the benefit described with most enthusiasm across interviews. Participants repeatedly described AI enabling work they could not previously do: coding without being a developer, analyzing without being a data scientist, </w:t>
-      </w:r>
-      <w:r>
-        <w:rPr>
-          <w:color w:val="00312A"/>
-        </w:rPr>
-        <w:lastRenderedPageBreak/>
-        <w:t>writing in a language without being fluent. Interviewee 12 captured the broadening of individual capability: “it sort of expands the range of creative possibilities and capabilities that an individual can do.” Interviewee 10 described the downstream organizational effect: the social media manager “suddenly becomes a designer and app concept creator.”</w:t>
+        <w:t>Scale is the benefit most clearly impossible without AI. Generating large numbers of product-page variants, monitoring sentiment across many competitor channels simultaneously, or personalizing communications at the individual rather than the segment level are not viable at human labor cost. Extending the personal skillset is the benefit described with most enthusiasm across interviews. Participants repeatedly described AI enabling work they could not previously do: coding without being a developer, analyzing without being a data scientist, writing in a language without being fluent. Interviewee 12 captured the broadening of individual capability: “it sort of expands the range of creative possibilities and capabilities that an individual can do.” Interviewee 10 described the downstream organizational effect: the social media manager “suddenly becomes a designer and app concept creator.”</w:t>
       </w:r>
     </w:p>
     <w:p>
@@ -17855,6 +18106,7 @@
         <w:rPr>
           <w:color w:val="00312A"/>
         </w:rPr>
+        <w:lastRenderedPageBreak/>
         <w:t>The most concrete commercial benefit figure in the data comes from Interviewee 6, who was asked directly about the return on investment from a multi-vendor chatbot programme that handles membership queries and drives commercial conversions:</w:t>
       </w:r>
     </w:p>
@@ -17910,13 +18162,12 @@
           <w:color w:val="00312A"/>
         </w:rPr>
       </w:pPr>
-      <w:bookmarkStart w:id="196" w:name="_vkh433kqk3oi" w:colFirst="0" w:colLast="0"/>
-      <w:bookmarkEnd w:id="196"/>
-      <w:r>
-        <w:rPr>
-          <w:color w:val="00312A"/>
-        </w:rPr>
-        <w:lastRenderedPageBreak/>
+      <w:bookmarkStart w:id="194" w:name="_vkh433kqk3oi" w:colFirst="0" w:colLast="0"/>
+      <w:bookmarkEnd w:id="194"/>
+      <w:r>
+        <w:rPr>
+          <w:color w:val="00312A"/>
+        </w:rPr>
         <w:t>4.4.2</w:t>
       </w:r>
       <w:r>
@@ -17963,6 +18214,7 @@
         <w:rPr>
           <w:color w:val="00312A"/>
         </w:rPr>
+        <w:lastRenderedPageBreak/>
         <w:t>Job replacement and role change are acknowledged across interviews, though almost never as an immediate intention. The more common framing is gradual role evolution as AI absorbs certain task types and the remaining human work shifts toward judgment, evaluation, and relationship management. Interviewee 13 described the communication that makes this transition manageable:</w:t>
       </w:r>
     </w:p>
@@ -18008,14 +18260,7 @@
         <w:rPr>
           <w:color w:val="00312A"/>
         </w:rPr>
-        <w:t xml:space="preserve">Authenticity is a more subtle sacrifice. AI-generated content — particularly in outreach and customer communications — can be recognized as artificial, and that recognition damages </w:t>
-      </w:r>
-      <w:r>
-        <w:rPr>
-          <w:color w:val="00312A"/>
-        </w:rPr>
-        <w:lastRenderedPageBreak/>
-        <w:t>trust. Interviewee 16 drew a deliberate line between creative and automated work: “I want to keep the creative work human. I think that keeps our authenticity, at least for now.” The implication is that authenticity functions not only as a brand value but as a functional constraint on which use cases are viable.</w:t>
+        <w:t>Authenticity is a more subtle sacrifice. AI-generated content — particularly in outreach and customer communications — can be recognized as artificial, and that recognition damages trust. Interviewee 16 drew a deliberate line between creative and automated work: “I want to keep the creative work human. I think that keeps our authenticity, at least for now.” The implication is that authenticity functions not only as a brand value but as a functional constraint on which use cases are viable.</w:t>
       </w:r>
     </w:p>
     <w:p>
@@ -18026,8 +18271,8 @@
           <w:highlight w:val="yellow"/>
         </w:rPr>
       </w:pPr>
-      <w:bookmarkStart w:id="197" w:name="_i62wq5quevoe" w:colFirst="0" w:colLast="0"/>
-      <w:bookmarkEnd w:id="197"/>
+      <w:bookmarkStart w:id="195" w:name="_i62wq5quevoe" w:colFirst="0" w:colLast="0"/>
+      <w:bookmarkEnd w:id="195"/>
       <w:r>
         <w:rPr>
           <w:color w:val="00312A"/>
@@ -18065,7 +18310,14 @@
         <w:rPr>
           <w:color w:val="00312A"/>
         </w:rPr>
-        <w:t>Hallucination — the generation of plausible but factually incorrect content — is the most universally acknowledged risk (11 code applications, 7 documents). Its practical significance varies by use case: in research and internal analysis, hallucinations are typically caught by human review before they cause harm; in customer-facing communications or automated workflows, they can reach customers before they are detected. Interviewee 12 offered a framework for containing the risk: hallucination is manageable within domains where the user possesses the domain expertise to evaluate output, and dangerous where they do not. This framing makes human oversight (see section 4.3.2) structurally necessary rather than optional.</w:t>
+        <w:t xml:space="preserve">Hallucination — the generation of plausible but factually incorrect content — is the most universally acknowledged risk (11 code applications, 7 documents). Its practical significance varies by use case: in research and internal analysis, hallucinations are typically caught by human review before they cause harm; in customer-facing communications or automated workflows, they can reach customers before they are detected. Interviewee 12 offered a </w:t>
+      </w:r>
+      <w:r>
+        <w:rPr>
+          <w:color w:val="00312A"/>
+        </w:rPr>
+        <w:lastRenderedPageBreak/>
+        <w:t>framework for containing the risk: hallucination is manageable within domains where the user possesses the domain expertise to evaluate output, and dangerous where they do not. This framing makes human oversight (see section 4.3.2) structurally necessary rather than optional.</w:t>
       </w:r>
     </w:p>
     <w:p>
@@ -18110,7 +18362,6 @@
         <w:rPr>
           <w:color w:val="00312A"/>
         </w:rPr>
-        <w:lastRenderedPageBreak/>
         <w:t>— Interviewee 13</w:t>
       </w:r>
     </w:p>
@@ -18158,7 +18409,14 @@
         <w:rPr>
           <w:color w:val="00312A"/>
         </w:rPr>
-        <w:t>Running through the data, a recurring structural pattern emerges: the same capability that creates a risk also provides the means to address it. Agentic AI threatens brand coherence, and agentic AI is deployed to enforce brand guidelines. Hallucinations undermine output quality, and agentic review workflows are used to catch errors before they propagate. AI reduces the need for junior execution roles, yet AI-native junior talent may be exactly what organizations need to build the next wave of capability. This pattern — where the technology is simultaneously the source of a problem and a candidate for its resolution — is not incidental. It reflects the dual character of a general-purpose technology: one whose value depends on configuration, governance, and the judgment of the humans who deploy it.</w:t>
+        <w:t xml:space="preserve">Running through the data, a recurring structural pattern emerges: the same capability that creates a risk also provides the means to address it. Agentic AI threatens brand coherence, and agentic AI is deployed to enforce brand guidelines. Hallucinations undermine output </w:t>
+      </w:r>
+      <w:r>
+        <w:rPr>
+          <w:color w:val="00312A"/>
+        </w:rPr>
+        <w:lastRenderedPageBreak/>
+        <w:t>quality, and agentic review workflows are used to catch errors before they propagate. AI reduces the need for junior execution roles, yet AI-native junior talent may be exactly what organizations need to build the next wave of capability. This pattern — where the technology is simultaneously the source of a problem and a candidate for its resolution — is not incidental. It reflects the dual character of a general-purpose technology: one whose value depends on configuration, governance, and the judgment of the humans who deploy it.</w:t>
       </w:r>
     </w:p>
     <w:p>
@@ -18185,7 +18443,6 @@
         <w:rPr>
           <w:color w:val="00312A"/>
         </w:rPr>
-        <w:lastRenderedPageBreak/>
         <w:t>4.5.1</w:t>
       </w:r>
       <w:r>
@@ -18219,7 +18476,14 @@
         <w:rPr>
           <w:color w:val="00312A"/>
         </w:rPr>
-        <w:t>Yet the same organizations raising brand risk are also deploying agentic AI as a brand governance tool. Interviewee 3 described an assistant trained on brand guidelines and persona documents that evaluates content for brand alignment before publication, collapsing a multi-stage approval process into a real-time check. Interviewee 8 described an agentic workflow that screens images for content inappropriate to the brand’s professional context before they appear on social channels. Interviewee 16 described governance agents that ensure generated content adheres to tone-of-voice and visual brand standards at scale — a volume of output no human review team could sustain.</w:t>
+        <w:t>Yet the same organizations raising brand risk are also deploying agentic AI as a brand governance tool. Interviewee 3 described an assistant trained on brand guidelines and persona documents that evaluates content for brand alignment before publication, collapsing a multi-</w:t>
+      </w:r>
+      <w:r>
+        <w:rPr>
+          <w:color w:val="00312A"/>
+        </w:rPr>
+        <w:lastRenderedPageBreak/>
+        <w:t>stage approval process into a real-time check. Interviewee 8 described an agentic workflow that screens images for content inappropriate to the brand’s professional context before they appear on social channels. Interviewee 16 described governance agents that ensure generated content adheres to tone-of-voice and visual brand standards at scale — a volume of output no human review team could sustain.</w:t>
       </w:r>
     </w:p>
     <w:p>
@@ -18246,7 +18510,6 @@
         <w:rPr>
           <w:color w:val="00312A"/>
         </w:rPr>
-        <w:lastRenderedPageBreak/>
         <w:t>4.5.2</w:t>
       </w:r>
       <w:r>
@@ -18280,7 +18543,14 @@
         <w:rPr>
           <w:color w:val="00312A"/>
         </w:rPr>
-        <w:t>The comparison with human accuracy is underexplored in practice but analytically significant. Human analysts exhibit their own forms of ‘hallucination’: motivated reasoning, confirmation bias, selective attention to data that supports existing hypotheses. Interviewee 3 noted that human data analysis sometimes involves finding data points to prove a point rather than being objective about what the data says. Interviewee 13’s characterization of agentic AI as equivalent to “a mediocre analyst that you still have to sense check” implies a standard where some level of error is accepted as normal and managed through review — the same standard already applied to human junior analysts.</w:t>
+        <w:t xml:space="preserve">The comparison with human accuracy is underexplored in practice but analytically significant. Human analysts exhibit their own forms of ‘hallucination’: motivated reasoning, confirmation bias, selective attention to data that supports existing hypotheses. Interviewee 3 noted that human data analysis sometimes involves finding data points to prove a point rather than being objective about what the data says. Interviewee 13’s characterization of agentic AI as equivalent to “a mediocre analyst that you still have to sense check” implies a standard where </w:t>
+      </w:r>
+      <w:r>
+        <w:rPr>
+          <w:color w:val="00312A"/>
+        </w:rPr>
+        <w:lastRenderedPageBreak/>
+        <w:t>some level of error is accepted as normal and managed through review — the same standard already applied to human junior analysts.</w:t>
       </w:r>
     </w:p>
     <w:p>
@@ -18307,7 +18577,6 @@
         <w:rPr>
           <w:color w:val="00312A"/>
         </w:rPr>
-        <w:lastRenderedPageBreak/>
         <w:t>4.5.3</w:t>
       </w:r>
       <w:r>
@@ -18341,7 +18610,14 @@
         <w:rPr>
           <w:color w:val="00312A"/>
         </w:rPr>
-        <w:t>The optics-versus-reality pattern identified in section 4.3.1 is the organizational expression of this paradox. Organizations report agentic capability in pitches and internal communications long before that capability is operationally present. Interviewee 12 described this dynamic through what he has called Martech’s Law: technology changes exponentially, but organizations change logarithmically. The experiment that proves a concept in an afternoon may require months of data preparation, governance approval, change management, and integration work before it creates consistent value for the organization. The participants who describe the strongest returns — Interviewees 4, 6, 13 — are precisely those who invested systematically in this operationalization work rather than treating the prototype as the endpoint.</w:t>
+        <w:t xml:space="preserve">The optics-versus-reality pattern identified in section 4.3.1 is the organizational expression of this paradox. Organizations report agentic capability in pitches and internal communications long before that capability is operationally present. Interviewee 12 described this dynamic through what he has called Martech’s Law: technology changes exponentially, but organizations change logarithmically. The experiment that proves a concept in an afternoon may require months of data preparation, governance approval, change management, and integration </w:t>
+      </w:r>
+      <w:r>
+        <w:rPr>
+          <w:color w:val="00312A"/>
+        </w:rPr>
+        <w:lastRenderedPageBreak/>
+        <w:t>work before it creates consistent value for the organization. The participants who describe the strongest returns — Interviewees 4, 6, 13 — are precisely those who invested systematically in this operationalization work rather than treating the prototype as the endpoint.</w:t>
       </w:r>
     </w:p>
     <w:p>
@@ -18370,7 +18646,6 @@
         <w:rPr>
           <w:color w:val="00312A"/>
         </w:rPr>
-        <w:lastRenderedPageBreak/>
         <w:t>4.5.4</w:t>
       </w:r>
       <w:r>
@@ -18417,6 +18692,7 @@
         <w:rPr>
           <w:color w:val="00312A"/>
         </w:rPr>
+        <w:lastRenderedPageBreak/>
         <w:t>Interviewee 12’s taxonomy of agent types (agents for marketers, agents for customers, agents of customers) maps directly onto this tension. Internal copilot agents operate within a context where the human principal is always present and can course-correct. Customer-facing agents operate in a context where errors are immediately visible to external audiences. Consumer-owned agents dissolve the firm’s control boundary entirely. The appropriate level of autonomy — and the corresponding investment in control infrastructure — scales with the visibility and reversibility of the agent’s actions.</w:t>
       </w:r>
     </w:p>
@@ -18433,7 +18709,6 @@
         <w:rPr>
           <w:color w:val="00312A"/>
         </w:rPr>
-        <w:lastRenderedPageBreak/>
         <w:t>4.5.5</w:t>
       </w:r>
       <w:r>
@@ -18480,6 +18755,7 @@
         <w:rPr>
           <w:color w:val="00312A"/>
         </w:rPr>
+        <w:lastRenderedPageBreak/>
         <w:t>The resolution suggested by the data is not to choose between protecting junior roles and capturing AI efficiency gains, but to restructure how juniors contribute. Organizations that are already navigating this successfully tend to use AI to absorb the most routine, low-judgment execution tasks — freeing junior professionals to develop the evaluative, interpretive, and briefing skills that are increasingly the scarce complement to AI capability. Interviewee 10 argued that briefing and reviewing will remain the two most critical marketing capabilities precisely because they cannot be automated: they require domain expertise, market judgment, and the ability to recognize when technically correct output is strategically wrong.</w:t>
       </w:r>
     </w:p>
@@ -18490,14 +18766,13 @@
           <w:color w:val="00312A"/>
         </w:rPr>
       </w:pPr>
-      <w:bookmarkStart w:id="198" w:name="_bi3ndv3n11ww" w:colFirst="0" w:colLast="0"/>
-      <w:bookmarkEnd w:id="198"/>
-      <w:commentRangeStart w:id="199"/>
-      <w:r>
-        <w:rPr>
-          <w:color w:val="00312A"/>
-        </w:rPr>
-        <w:lastRenderedPageBreak/>
+      <w:bookmarkStart w:id="196" w:name="_bi3ndv3n11ww" w:colFirst="0" w:colLast="0"/>
+      <w:bookmarkEnd w:id="196"/>
+      <w:commentRangeStart w:id="197"/>
+      <w:r>
+        <w:rPr>
+          <w:color w:val="00312A"/>
+        </w:rPr>
         <w:t>4.x.</w:t>
       </w:r>
       <w:r>
@@ -18535,7 +18810,7 @@
         </w:rPr>
         <w:t>)... seek additional data</w:t>
       </w:r>
-      <w:commentRangeEnd w:id="199"/>
+      <w:commentRangeEnd w:id="197"/>
       <w:r>
         <w:rPr>
           <w:rStyle w:val="CommentReference"/>
@@ -18543,7 +18818,7 @@
           <w:sz w:val="22"/>
           <w:szCs w:val="22"/>
         </w:rPr>
-        <w:commentReference w:id="199"/>
+        <w:commentReference w:id="197"/>
       </w:r>
     </w:p>
     <w:p>
@@ -18554,8 +18829,8 @@
           <w:color w:val="00312A"/>
         </w:rPr>
       </w:pPr>
-      <w:bookmarkStart w:id="200" w:name="_q5epuhs454bw" w:colFirst="0" w:colLast="0"/>
-      <w:bookmarkEnd w:id="200"/>
+      <w:bookmarkStart w:id="198" w:name="_q5epuhs454bw" w:colFirst="0" w:colLast="0"/>
+      <w:bookmarkEnd w:id="198"/>
       <w:r>
         <w:br w:type="page"/>
       </w:r>
@@ -18606,8 +18881,8 @@
           <w:color w:val="00312A"/>
         </w:rPr>
       </w:pPr>
-      <w:bookmarkStart w:id="201" w:name="_7rbdabewznnc" w:colFirst="0" w:colLast="0"/>
-      <w:bookmarkEnd w:id="201"/>
+      <w:bookmarkStart w:id="199" w:name="_7rbdabewznnc" w:colFirst="0" w:colLast="0"/>
+      <w:bookmarkEnd w:id="199"/>
       <w:r>
         <w:rPr>
           <w:color w:val="00312A"/>
@@ -18636,8 +18911,8 @@
           <w:color w:val="00312A"/>
         </w:rPr>
       </w:pPr>
-      <w:bookmarkStart w:id="202" w:name="_vqcghgtkedix" w:colFirst="0" w:colLast="0"/>
-      <w:bookmarkEnd w:id="202"/>
+      <w:bookmarkStart w:id="200" w:name="_vqcghgtkedix" w:colFirst="0" w:colLast="0"/>
+      <w:bookmarkEnd w:id="200"/>
       <w:r>
         <w:rPr>
           <w:color w:val="00312A"/>
@@ -18710,8 +18985,8 @@
           <w:color w:val="00312A"/>
         </w:rPr>
       </w:pPr>
-      <w:bookmarkStart w:id="203" w:name="_mnyukkjx9iq" w:colFirst="0" w:colLast="0"/>
-      <w:bookmarkEnd w:id="203"/>
+      <w:bookmarkStart w:id="201" w:name="_mnyukkjx9iq" w:colFirst="0" w:colLast="0"/>
+      <w:bookmarkEnd w:id="201"/>
       <w:r>
         <w:rPr>
           <w:color w:val="00312A"/>
@@ -18790,8 +19065,8 @@
       <w:pPr>
         <w:pStyle w:val="Heading1"/>
       </w:pPr>
-      <w:bookmarkStart w:id="204" w:name="_dd6zel2y4t5x" w:colFirst="0" w:colLast="0"/>
-      <w:bookmarkEnd w:id="204"/>
+      <w:bookmarkStart w:id="202" w:name="_dd6zel2y4t5x" w:colFirst="0" w:colLast="0"/>
+      <w:bookmarkEnd w:id="202"/>
       <w:r>
         <w:t>6.</w:t>
       </w:r>
@@ -18804,8 +19079,8 @@
       <w:pPr>
         <w:pStyle w:val="Heading1"/>
       </w:pPr>
-      <w:bookmarkStart w:id="205" w:name="_9375lqp6ztft" w:colFirst="0" w:colLast="0"/>
-      <w:bookmarkEnd w:id="205"/>
+      <w:bookmarkStart w:id="203" w:name="_9375lqp6ztft" w:colFirst="0" w:colLast="0"/>
+      <w:bookmarkEnd w:id="203"/>
       <w:r>
         <w:br w:type="page"/>
       </w:r>
@@ -18818,8 +19093,8 @@
           <w:highlight w:val="white"/>
         </w:rPr>
       </w:pPr>
-      <w:bookmarkStart w:id="206" w:name="_kgmnd1ymad1c" w:colFirst="0" w:colLast="0"/>
-      <w:bookmarkEnd w:id="206"/>
+      <w:bookmarkStart w:id="204" w:name="_kgmnd1ymad1c" w:colFirst="0" w:colLast="0"/>
+      <w:bookmarkEnd w:id="204"/>
       <w:r>
         <w:lastRenderedPageBreak/>
         <w:t>7.</w:t>
@@ -19300,7 +19575,7 @@
           <w:highlight w:val="white"/>
         </w:rPr>
       </w:pPr>
-      <w:commentRangeStart w:id="207"/>
+      <w:commentRangeStart w:id="205"/>
       <w:r>
         <w:rPr>
           <w:strike/>
@@ -19365,7 +19640,7 @@
         </w:rPr>
         <w:t xml:space="preserve"> </w:t>
       </w:r>
-      <w:commentRangeEnd w:id="207"/>
+      <w:commentRangeEnd w:id="205"/>
       <w:r>
         <w:rPr>
           <w:rStyle w:val="CommentReference"/>
@@ -19374,7 +19649,7 @@
           <w:szCs w:val="20"/>
           <w:highlight w:val="white"/>
         </w:rPr>
-        <w:commentReference w:id="207"/>
+        <w:commentReference w:id="205"/>
       </w:r>
     </w:p>
     <w:p>
@@ -19387,7 +19662,7 @@
           <w:highlight w:val="white"/>
         </w:rPr>
       </w:pPr>
-      <w:commentRangeStart w:id="208"/>
+      <w:commentRangeStart w:id="206"/>
       <w:r>
         <w:rPr>
           <w:strike/>
@@ -19435,7 +19710,7 @@
         </w:rPr>
         <w:t xml:space="preserve">(1), 38-68. </w:t>
       </w:r>
-      <w:commentRangeEnd w:id="208"/>
+      <w:commentRangeEnd w:id="206"/>
       <w:r>
         <w:rPr>
           <w:rStyle w:val="CommentReference"/>
@@ -19444,7 +19719,7 @@
           <w:szCs w:val="20"/>
           <w:highlight w:val="white"/>
         </w:rPr>
-        <w:commentReference w:id="208"/>
+        <w:commentReference w:id="206"/>
       </w:r>
     </w:p>
     <w:p>
@@ -19935,7 +20210,7 @@
           <w:strike/>
         </w:rPr>
       </w:pPr>
-      <w:commentRangeStart w:id="209"/>
+      <w:commentRangeStart w:id="207"/>
       <w:r>
         <w:rPr>
           <w:strike/>
@@ -19987,7 +20262,7 @@
         </w:rPr>
         <w:t xml:space="preserve"> </w:t>
       </w:r>
-      <w:commentRangeEnd w:id="209"/>
+      <w:commentRangeEnd w:id="207"/>
       <w:r>
         <w:rPr>
           <w:rStyle w:val="CommentReference"/>
@@ -19995,7 +20270,7 @@
           <w:sz w:val="22"/>
           <w:szCs w:val="22"/>
         </w:rPr>
-        <w:commentReference w:id="209"/>
+        <w:commentReference w:id="207"/>
       </w:r>
     </w:p>
     <w:p>
@@ -20389,7 +20664,7 @@
           <w:highlight w:val="white"/>
         </w:rPr>
       </w:pPr>
-      <w:commentRangeStart w:id="210"/>
+      <w:commentRangeStart w:id="208"/>
       <w:r>
         <w:rPr>
           <w:strike/>
@@ -20413,7 +20688,7 @@
         </w:rPr>
         <w:t>, (2019), 20-33.</w:t>
       </w:r>
-      <w:commentRangeEnd w:id="210"/>
+      <w:commentRangeEnd w:id="208"/>
       <w:r>
         <w:rPr>
           <w:rStyle w:val="CommentReference"/>
@@ -20422,7 +20697,7 @@
           <w:szCs w:val="22"/>
           <w:highlight w:val="white"/>
         </w:rPr>
-        <w:commentReference w:id="210"/>
+        <w:commentReference w:id="208"/>
       </w:r>
     </w:p>
     <w:p>
@@ -20697,7 +20972,7 @@
           <w:highlight w:val="white"/>
         </w:rPr>
       </w:pPr>
-      <w:commentRangeStart w:id="211"/>
+      <w:commentRangeStart w:id="209"/>
       <w:r>
         <w:rPr>
           <w:strike/>
@@ -20721,7 +20996,7 @@
         </w:rPr>
         <w:t>.</w:t>
       </w:r>
-      <w:commentRangeEnd w:id="211"/>
+      <w:commentRangeEnd w:id="209"/>
       <w:r>
         <w:rPr>
           <w:rStyle w:val="CommentReference"/>
@@ -20730,7 +21005,7 @@
           <w:szCs w:val="22"/>
           <w:highlight w:val="white"/>
         </w:rPr>
-        <w:commentReference w:id="211"/>
+        <w:commentReference w:id="209"/>
       </w:r>
     </w:p>
     <w:p>
@@ -20954,7 +21229,7 @@
           <w:strike/>
         </w:rPr>
       </w:pPr>
-      <w:commentRangeStart w:id="212"/>
+      <w:commentRangeStart w:id="210"/>
       <w:r>
         <w:rPr>
           <w:strike/>
@@ -20988,7 +21263,7 @@
           <w:t>https://doi.org/10.1016/j.jbusres.2022.07.0200</w:t>
         </w:r>
       </w:hyperlink>
-      <w:commentRangeEnd w:id="212"/>
+      <w:commentRangeEnd w:id="210"/>
       <w:r>
         <w:rPr>
           <w:rStyle w:val="CommentReference"/>
@@ -20996,7 +21271,7 @@
           <w:sz w:val="22"/>
           <w:szCs w:val="22"/>
         </w:rPr>
-        <w:commentReference w:id="212"/>
+        <w:commentReference w:id="210"/>
       </w:r>
     </w:p>
     <w:p>
@@ -21117,8 +21392,8 @@
       <w:pPr>
         <w:pStyle w:val="Heading1"/>
       </w:pPr>
-      <w:bookmarkStart w:id="213" w:name="_icpp6ljm25yc" w:colFirst="0" w:colLast="0"/>
-      <w:bookmarkEnd w:id="213"/>
+      <w:bookmarkStart w:id="211" w:name="_icpp6ljm25yc" w:colFirst="0" w:colLast="0"/>
+      <w:bookmarkEnd w:id="211"/>
       <w:r>
         <w:lastRenderedPageBreak/>
         <w:t>Appendix A. Interview Guide and Protocol</w:t>
@@ -21133,8 +21408,8 @@
       <w:pPr>
         <w:pStyle w:val="Heading2"/>
       </w:pPr>
-      <w:bookmarkStart w:id="214" w:name="_yaxctkjupl5f" w:colFirst="0" w:colLast="0"/>
-      <w:bookmarkEnd w:id="214"/>
+      <w:bookmarkStart w:id="212" w:name="_yaxctkjupl5f" w:colFirst="0" w:colLast="0"/>
+      <w:bookmarkEnd w:id="212"/>
       <w:r>
         <w:t>A.1.</w:t>
       </w:r>
@@ -21147,8 +21422,8 @@
       <w:pPr>
         <w:pStyle w:val="Heading3"/>
       </w:pPr>
-      <w:bookmarkStart w:id="215" w:name="_fso8dir40043" w:colFirst="0" w:colLast="0"/>
-      <w:bookmarkEnd w:id="215"/>
+      <w:bookmarkStart w:id="213" w:name="_fso8dir40043" w:colFirst="0" w:colLast="0"/>
+      <w:bookmarkEnd w:id="213"/>
       <w:r>
         <w:t>A.1.1.</w:t>
       </w:r>
@@ -21414,8 +21689,8 @@
       <w:pPr>
         <w:pStyle w:val="Heading3"/>
       </w:pPr>
-      <w:bookmarkStart w:id="216" w:name="_xu7tl6fyia16" w:colFirst="0" w:colLast="0"/>
-      <w:bookmarkEnd w:id="216"/>
+      <w:bookmarkStart w:id="214" w:name="_xu7tl6fyia16" w:colFirst="0" w:colLast="0"/>
+      <w:bookmarkEnd w:id="214"/>
       <w:r>
         <w:t>A.1.2.</w:t>
       </w:r>
@@ -21481,8 +21756,8 @@
       <w:pPr>
         <w:pStyle w:val="Heading3"/>
       </w:pPr>
-      <w:bookmarkStart w:id="217" w:name="_uslcrode5spj" w:colFirst="0" w:colLast="0"/>
-      <w:bookmarkEnd w:id="217"/>
+      <w:bookmarkStart w:id="215" w:name="_uslcrode5spj" w:colFirst="0" w:colLast="0"/>
+      <w:bookmarkEnd w:id="215"/>
       <w:r>
         <w:t>A.1.3.</w:t>
       </w:r>
@@ -21642,8 +21917,8 @@
       <w:pPr>
         <w:pStyle w:val="Heading2"/>
       </w:pPr>
-      <w:bookmarkStart w:id="218" w:name="_4i48gt7nuy87" w:colFirst="0" w:colLast="0"/>
-      <w:bookmarkEnd w:id="218"/>
+      <w:bookmarkStart w:id="216" w:name="_4i48gt7nuy87" w:colFirst="0" w:colLast="0"/>
+      <w:bookmarkEnd w:id="216"/>
       <w:r>
         <w:t>A.2.</w:t>
       </w:r>
@@ -21673,15 +21948,15 @@
           <w:cols w:space="708"/>
         </w:sectPr>
       </w:pPr>
-      <w:bookmarkStart w:id="219" w:name="_i4eri4z2mseg" w:colFirst="0" w:colLast="0"/>
-      <w:bookmarkEnd w:id="219"/>
+      <w:bookmarkStart w:id="217" w:name="_i4eri4z2mseg" w:colFirst="0" w:colLast="0"/>
+      <w:bookmarkEnd w:id="217"/>
     </w:p>
     <w:p>
       <w:pPr>
         <w:pStyle w:val="Heading1"/>
       </w:pPr>
-      <w:bookmarkStart w:id="220" w:name="_n4q94a2ei39t" w:colFirst="0" w:colLast="0"/>
-      <w:bookmarkEnd w:id="220"/>
+      <w:bookmarkStart w:id="218" w:name="_n4q94a2ei39t" w:colFirst="0" w:colLast="0"/>
+      <w:bookmarkEnd w:id="218"/>
       <w:r>
         <w:lastRenderedPageBreak/>
         <w:t>Appendix C. The process of constructive grounded theory</w:t>
@@ -21783,8 +22058,8 @@
       <w:pPr>
         <w:pStyle w:val="Heading1"/>
       </w:pPr>
-      <w:bookmarkStart w:id="221" w:name="_z0nzv114icat" w:colFirst="0" w:colLast="0"/>
-      <w:bookmarkEnd w:id="221"/>
+      <w:bookmarkStart w:id="219" w:name="_z0nzv114icat" w:colFirst="0" w:colLast="0"/>
+      <w:bookmarkEnd w:id="219"/>
       <w:r>
         <w:br w:type="page"/>
       </w:r>
@@ -21793,8 +22068,8 @@
       <w:pPr>
         <w:pStyle w:val="Heading1"/>
       </w:pPr>
-      <w:bookmarkStart w:id="222" w:name="_8iomnw571gh6" w:colFirst="0" w:colLast="0"/>
-      <w:bookmarkEnd w:id="222"/>
+      <w:bookmarkStart w:id="220" w:name="_8iomnw571gh6" w:colFirst="0" w:colLast="0"/>
+      <w:bookmarkEnd w:id="220"/>
       <w:r>
         <w:lastRenderedPageBreak/>
         <w:t>Appendix D. Supporting Quotes</w:t>
@@ -21827,8 +22102,8 @@
         <w:pStyle w:val="Heading1"/>
         <w:ind w:firstLine="0"/>
       </w:pPr>
-      <w:bookmarkStart w:id="223" w:name="_a7k3h3b6oqi2" w:colFirst="0" w:colLast="0"/>
-      <w:bookmarkEnd w:id="223"/>
+      <w:bookmarkStart w:id="221" w:name="_a7k3h3b6oqi2" w:colFirst="0" w:colLast="0"/>
+      <w:bookmarkEnd w:id="221"/>
       <w:r>
         <w:lastRenderedPageBreak/>
         <w:t>Appendix E. What to include?</w:t>
@@ -25935,7 +26210,7 @@
       </w:r>
     </w:p>
   </w:comment>
-  <w:comment w:id="194" w:author="Daan Luttik" w:date="2026-05-25T16:35:00Z" w:initials="">
+  <w:comment w:id="192" w:author="Daan Luttik" w:date="2026-05-25T16:35:00Z" w:initials="">
     <w:p>
       <w:pPr>
         <w:widowControl w:val="0"/>
@@ -25968,7 +26243,7 @@
       </w:r>
     </w:p>
   </w:comment>
-  <w:comment w:id="199" w:author="Daan Luttik" w:date="2026-05-25T16:47:00Z" w:initials="">
+  <w:comment w:id="197" w:author="Daan Luttik" w:date="2026-05-25T16:47:00Z" w:initials="">
     <w:p>
       <w:pPr>
         <w:widowControl w:val="0"/>
@@ -26001,7 +26276,7 @@
       </w:r>
     </w:p>
   </w:comment>
-  <w:comment w:id="207" w:author="Daan Luttik" w:date="2026-05-03T19:36:00Z" w:initials="">
+  <w:comment w:id="205" w:author="Daan Luttik" w:date="2026-05-03T19:36:00Z" w:initials="">
     <w:p>
       <w:pPr>
         <w:widowControl w:val="0"/>
@@ -26034,7 +26309,7 @@
       </w:r>
     </w:p>
   </w:comment>
-  <w:comment w:id="208" w:author="Daan Luttik" w:date="2026-05-03T19:41:00Z" w:initials="">
+  <w:comment w:id="206" w:author="Daan Luttik" w:date="2026-05-03T19:41:00Z" w:initials="">
     <w:p>
       <w:pPr>
         <w:widowControl w:val="0"/>
@@ -26067,7 +26342,7 @@
       </w:r>
     </w:p>
   </w:comment>
-  <w:comment w:id="209" w:author="Daan Luttik" w:date="2026-05-03T19:38:00Z" w:initials="">
+  <w:comment w:id="207" w:author="Daan Luttik" w:date="2026-05-03T19:38:00Z" w:initials="">
     <w:p>
       <w:pPr>
         <w:widowControl w:val="0"/>
@@ -26100,7 +26375,7 @@
       </w:r>
     </w:p>
   </w:comment>
-  <w:comment w:id="210" w:author="Daan Luttik" w:date="2026-05-03T19:40:00Z" w:initials="">
+  <w:comment w:id="208" w:author="Daan Luttik" w:date="2026-05-03T19:40:00Z" w:initials="">
     <w:p>
       <w:pPr>
         <w:widowControl w:val="0"/>
@@ -26133,7 +26408,7 @@
       </w:r>
     </w:p>
   </w:comment>
-  <w:comment w:id="211" w:author="Daan Luttik" w:date="2026-05-03T19:43:00Z" w:initials="">
+  <w:comment w:id="209" w:author="Daan Luttik" w:date="2026-05-03T19:43:00Z" w:initials="">
     <w:p>
       <w:pPr>
         <w:widowControl w:val="0"/>
@@ -26166,7 +26441,7 @@
       </w:r>
     </w:p>
   </w:comment>
-  <w:comment w:id="212" w:author="Daan Luttik" w:date="2026-05-03T19:44:00Z" w:initials="">
+  <w:comment w:id="210" w:author="Daan Luttik" w:date="2026-05-03T19:44:00Z" w:initials="">
     <w:p>
       <w:pPr>
         <w:widowControl w:val="0"/>
@@ -28540,6 +28815,7 @@
   <w:style w:type="character" w:default="1" w:styleId="DefaultParagraphFont">
     <w:name w:val="Default Paragraph Font"/>
     <w:uiPriority w:val="1"/>
+    <w:semiHidden/>
     <w:unhideWhenUsed/>
   </w:style>
   <w:style w:type="table" w:default="1" w:styleId="TableNormal">

</xml_diff>

<commit_message>
updated the thesis further
</commit_message>
<xml_diff>
--- a/Thesis Draft - Daan Luttik - MBA.docx
+++ b/Thesis Draft - Daan Luttik - MBA.docx
@@ -17105,16 +17105,7 @@
         <w:t>This managerial behavior can be beneficial to many internal conditions, and seems to drive outcomes.</w:t>
       </w:r>
       <w:r>
-        <w:t xml:space="preserve"> As interviewee 4 put it, “In leadership, you need to set goals. You need to inspire people to believe in what you are doing and pull the people together”. </w:t>
-      </w:r>
-      <w:r>
-        <w:t xml:space="preserve">Interviewee 14 framed its </w:t>
-      </w:r>
-      <w:r>
-        <w:t>importance</w:t>
-      </w:r>
-      <w:r>
-        <w:t>: “Thirty percent of all AI trajectories is just technology; sixty to seventy percent is actually us as humans or as an organization.”</w:t>
+        <w:t xml:space="preserve"> As interviewee 4 put it, “In leadership, you need to set goals. You need to inspire people to believe in what you are doing and pull the people together”. Interviewee 14 framed its importance: “Thirty percent of all AI trajectories is just technology; sixty to seventy percent is actually us as humans or as an organization.”</w:t>
       </w:r>
     </w:p>
     <w:p>
@@ -17301,15 +17292,23 @@
         <w:t xml:space="preserve"> </w:t>
       </w:r>
       <w:r>
-        <w:t>Interviewee 6 noted that “Leadership encouragement is a tailwind” describing “Whenever we use [agentic AI] and showcase something […] it is appreciated and rewarded”</w:t>
-      </w:r>
-      <w:r>
-        <w:t>.</w:t>
-      </w:r>
-    </w:p>
-    <w:p/>
-    <w:p/>
-    <w:p>
+        <w:t>Interviewee 6 noted that “Leadership encouragement is a tailwind” describing “Whenever we use [agentic AI] and showcase something […] it is appreciated and rewarded”.</w:t>
+      </w:r>
+      <w:r>
+        <w:t xml:space="preserve"> Their backing can also unlock notable resources. Interviewee 8 noted how leadership incentivizes AI adoption by absorbing AI spend  “They want </w:t>
+      </w:r>
+      <w:r>
+        <w:lastRenderedPageBreak/>
+        <w:t>AI adoption to happen, so they just decided this new AI group would eat the cost and that anyone within the corporation can ‘use it for free’”.</w:t>
+      </w:r>
+    </w:p>
+    <w:p>
+      <w:r>
+        <w:rPr>
+          <w:bCs/>
+        </w:rPr>
+        <w:t xml:space="preserve">An important leadership role is the </w:t>
+      </w:r>
       <w:r>
         <w:rPr>
           <w:bCs/>
@@ -17319,7 +17318,22 @@
         <w:t>AI champions</w:t>
       </w:r>
       <w:r>
-        <w:t xml:space="preserve"> supply the bottom-up counterpart to top-down backing. A champion is a person who, often without formal mandate, drives AI initiatives forward through personal initiative, visible results, and internal advocacy, and the data shows their influence to be disproportionate. Interviewee 9 described a vivid case:</w:t>
+        <w:t>. This champion might be the manager, but can also be a technical employee that is supported by his superiors</w:t>
+      </w:r>
+      <w:r>
+        <w:t>. A champion is a person wh</w:t>
+      </w:r>
+      <w:r>
+        <w:t xml:space="preserve">o </w:t>
+      </w:r>
+      <w:r>
+        <w:t>drives AI initiatives forward through personal initiative, visible results, and internal advocacy. Interviewee 9 describe</w:t>
+      </w:r>
+      <w:r>
+        <w:t>s how disproportionally impactful an AI champion can be</w:t>
+      </w:r>
+      <w:r>
+        <w:t>:</w:t>
       </w:r>
     </w:p>
     <w:p>
@@ -17328,21 +17342,51 @@
         <w:ind w:left="720"/>
       </w:pPr>
       <w:r>
-        <w:t>“[An AI platform] was created originally by … our [role] director that dabbles in development, and he created it, and it has blown up, and so now there’s millions of dollars of funding.”</w:t>
-      </w:r>
-    </w:p>
-    <w:p>
-      <w:r>
-        <w:t>A single individual’s initiative, when it produces visible results, can unlock significant organizational investment—a champion-first sequence in which grassroots results attract the leadership backing described above, rather than the reverse. Interviewee 8 observed that such individuals are not isolated: “We don’t have an AI group … we have probably AI strategists and specialists all throughout the corporation.” Interviewee 6 captured the champion’s characteristic willingness to move ahead of formal permission: “I hear a lot of other companies where the board is afraid or legal is holding it back … Sorry, but you’d have to believe me on my blue eyes because I’m going to make this happen.”</w:t>
-      </w:r>
-    </w:p>
-    <w:p>
-      <w:r>
-        <w:t>Across the four behaviors, the data points to a single integrative claim: each is necessary but none is sufficient alone, and adoption advances only when they align. Backing without clarity scatters effort (Interviewees 16 and 3); clarity or championing without backing stalls at the pilot stage; and direction of any kind without bringing people along leaves the sixty-to-seventy-percent human gap untouched (Interviewee 14). Interviewee 17 expressed the alignment condition directly: “Leadership wants us to work with AI. But can employees do that too? Do they do it and do they want to? Those are basically three things. And when those three things align with each other, you get a fantastic AI implementation.” It is this combination—direction set from the top, permission and resources to act, grassroots energy, and the change-</w:t>
+        <w:t xml:space="preserve">“[An AI platform] was created originally by </w:t>
+      </w:r>
+      <w:r>
+        <w:t>[</w:t>
+      </w:r>
+      <w:r>
+        <w:t>…</w:t>
+      </w:r>
+      <w:r>
+        <w:t>]</w:t>
+      </w:r>
+      <w:r>
+        <w:t xml:space="preserve"> our [</w:t>
+      </w:r>
+      <w:r>
+        <w:t>redacted</w:t>
+      </w:r>
+      <w:r>
+        <w:t>] director that dabbles in development, and he created it, and it has blown up, and so now there’s millions of dollars of funding.”</w:t>
+      </w:r>
+    </w:p>
+    <w:p>
+      <w:r>
+        <w:t xml:space="preserve">A single individual’s initiative, when it produces visible results, can unlock significant organizational investment—a champion-first sequence in which grassroots results attract the leadership backing described above, rather than the reverse. Interviewee 8 observed that such individuals are not isolated: “We don’t have an AI group </w:t>
+      </w:r>
+      <w:r>
+        <w:t>[</w:t>
+      </w:r>
+      <w:r>
+        <w:t>…</w:t>
+      </w:r>
+      <w:r>
+        <w:t>]</w:t>
+      </w:r>
+      <w:r>
+        <w:t xml:space="preserve"> we have probably AI strategists and specialists all throughout the corporation.” Interviewee 6 captured the champion’s characteristic willingness to move ahead of formal permission: “I hear a lot of other companies where the board is afraid or legal is holding it back … Sorry, but you’d have to believe me on my blue eyes because I’m going to make this happen.”</w:t>
+      </w:r>
+    </w:p>
+    <w:p>
+      <w:r>
+        <w:t xml:space="preserve">Across the four behaviors, the data points to a single integrative claim: each is necessary but none is sufficient alone, and adoption advances only when they align. Backing without clarity scatters effort (Interviewees 16 and 3); clarity or championing without backing stalls at the pilot stage; and direction of any kind without bringing people along leaves the sixty-to-seventy-percent human gap untouched (Interviewee 14). Interviewee 17 expressed the alignment condition directly: “Leadership wants us to work with AI. But can employees do that too? Do they do it and do they want to? Those are basically three things. And when those three things align with each other, you get a fantastic AI implementation.” It is this combination—direction </w:t>
       </w:r>
       <w:r>
         <w:lastRenderedPageBreak/>
-        <w:t>management work to carry people with it—that lets leadership function as the cross-cutting driver introduced at the start of this section.</w:t>
+        <w:t>set from the top, permission and resources to act, grassroots energy, and the change-management work to carry people with it—that lets leadership function as the cross-cutting driver introduced at the start of this section.</w:t>
       </w:r>
     </w:p>
     <w:p/>
@@ -28919,6 +28963,7 @@
   <w:style w:type="character" w:default="1" w:styleId="DefaultParagraphFont">
     <w:name w:val="Default Paragraph Font"/>
     <w:uiPriority w:val="1"/>
+    <w:semiHidden/>
     <w:unhideWhenUsed/>
   </w:style>
   <w:style w:type="table" w:default="1" w:styleId="TableNormal">

</xml_diff>

<commit_message>
added auxiliary resources again
</commit_message>
<xml_diff>
--- a/Thesis Draft - Daan Luttik - MBA.docx
+++ b/Thesis Draft - Daan Luttik - MBA.docx
@@ -12339,7 +12339,7 @@
                 <w:sz w:val="21"/>
                 <w:szCs w:val="21"/>
               </w:rPr>
-              <w:t>Observing AI's improvement &amp; potential; Observing increasing AI adoption</w:t>
+              <w:t>Observing AI’s improvement &amp; potential; Observing increasing AI adoption</w:t>
             </w:r>
           </w:p>
         </w:tc>
@@ -13999,7 +13999,7 @@
         <w:pStyle w:val="Quote"/>
       </w:pPr>
       <w:r>
-        <w:t>“Change is frigging hard. It’s hard for us as individuals. Generally speaking, individuals don’t like to change, particularly if they’ve been doing something a certain way, and it works well, and it works well, and they know it, and they’re comfortable. […] That challenge gets multiplied when you start talking about an organization … you’ve got all multiple people, you’ve got politics, existing incentives, existing processes.”</w:t>
+        <w:t>Change is frigging hard. It’s hard for us as individuals. Generally speaking, individuals don’t like to change, particularly if they’ve been doing something a certain way, and it works well, and it works well, and they know it, and they’re comfortable. […] That challenge gets multiplied when you start talking about an organization … you’ve got all multiple people, you’ve got politics, existing incentives, existing processes.</w:t>
       </w:r>
     </w:p>
     <w:p>
@@ -14071,7 +14071,7 @@
         <w:pStyle w:val="Quote"/>
       </w:pPr>
       <w:r>
-        <w:t xml:space="preserve">“Help people learn what AI can do […] leadership, middle management, and employees, each with different focus. Leadership must understand where AI is heading to create strategic horizons. Middle management must learn how to facilitate and structure experimentation. Employees must learn that AI is more than writing emails.” </w:t>
+        <w:t xml:space="preserve">Help people learn what AI can do […] leadership, middle management, and employees, each with different focus. Leadership must understand where AI is heading to create strategic horizons. Middle management must learn how to facilitate and structure experimentation. Employees must learn that AI is more than writing emails. </w:t>
       </w:r>
     </w:p>
     <w:p>
@@ -14274,7 +14274,7 @@
       </w:pPr>
       <w:r>
         <w:lastRenderedPageBreak/>
-        <w:t>“[An AI platform] was created originally by […] our [redacted] director that dabbles in development, and he created it, and it has blown up, and so now there’s millions of dollars of funding.”</w:t>
+        <w:t>[An AI platform] was created originally by […] our [redacted] director that dabbles in development, and he created it, and it has blown up, and so now there’s millions of dollars of funding.</w:t>
       </w:r>
     </w:p>
     <w:p>
@@ -14662,7 +14662,7 @@
         <w:pStyle w:val="Quote"/>
       </w:pPr>
       <w:r>
-        <w:t xml:space="preserve">We have something called [redacted], which is a custom journey tool, and it's basically a large language model where you constantly build up cultural </w:t>
+        <w:t xml:space="preserve">We have something called [redacted], which is a custom journey tool, and it’s basically a large language model where you constantly build up cultural </w:t>
       </w:r>
       <w:r>
         <w:lastRenderedPageBreak/>
@@ -14761,7 +14761,7 @@
           <w:i/>
           <w:iCs/>
         </w:rPr>
-        <w:t>“We used Make and n8n for, like, automating all the workflows. ... You say, 'I get this data from this tool. If this happens, do this.' ... And this substituted at least for two or three people.”</w:t>
+        <w:t>“We used Make and n8n for, like, automating all the workflows. ... You say, ‘I get this data from this tool. If this happens, do this.’ ... And this substituted at least for two or three people.”</w:t>
       </w:r>
     </w:p>
     <w:p>
@@ -14892,7 +14892,7 @@
           <w:iCs/>
           <w:lang w:val="en-US"/>
         </w:rPr>
-        <w:t>"add to cart,"</w:t>
+        <w:t>“add to cart,”</w:t>
       </w:r>
       <w:r>
         <w:rPr>
@@ -14906,7 +14906,7 @@
           <w:iCs/>
           <w:lang w:val="en-US"/>
         </w:rPr>
-        <w:t>"five different definitions"</w:t>
+        <w:t>“five different definitions”</w:t>
       </w:r>
       <w:r>
         <w:rPr>
@@ -14920,13 +14920,13 @@
           <w:iCs/>
           <w:lang w:val="en-US"/>
         </w:rPr>
-        <w:t>"a problem if you want to feed it to AI"</w:t>
+        <w:t>“a problem if you want to feed it to AI”</w:t>
       </w:r>
       <w:r>
         <w:rPr>
           <w:lang w:val="en-US"/>
         </w:rPr>
-        <w:t xml:space="preserve">. The data's highest-productivity setup follows this logic. </w:t>
+        <w:t xml:space="preserve">. The data’s highest-productivity setup follows this logic. </w:t>
       </w:r>
     </w:p>
     <w:p>
@@ -15009,7 +15009,7 @@
     <w:p>
       <w:commentRangeStart w:id="184"/>
       <w:r>
-        <w:t xml:space="preserve">Notably, even for similar use cases, the stated outcomes might be different across interviewees; this might be due to the organizational aspects the managers influence or approach, other elements that affect the outcome, or even the interviewee's perception.  </w:t>
+        <w:t xml:space="preserve">Notably, even for similar use cases, the stated outcomes might be different across interviewees; this might be due to the organizational aspects the managers influence or approach, other elements that affect the outcome, or even the interviewee’s perception.  </w:t>
       </w:r>
       <w:commentRangeEnd w:id="184"/>
       <w:r>
@@ -15207,7 +15207,7 @@
         <w:pStyle w:val="Quote"/>
       </w:pPr>
       <w:r>
-        <w:t>“I do not think of AI as being infallible. […] If you don’t have an understanding of your domain, then just sort of blindly trust AI, I think most people would agree that is kind of a risky place to put yourself in.”</w:t>
+        <w:t>I do not think of AI as being infallible. […] If you don’t have an understanding of your domain, then just sort of blindly trust AI, I think most people would agree that is kind of a risky place to put yourself in.</w:t>
       </w:r>
     </w:p>
     <w:p>
@@ -15329,7 +15329,7 @@
         <w:pStyle w:val="Quote"/>
       </w:pPr>
       <w:r>
-        <w:t>I'm logging a quality score based on these guidelines, and I do want to see this quality score go up. But I also want a human quality score next to it, so we can benchmark how we're doing compared to the traditional way of working, so we can prove it's better. Because otherwise it's a feeling.</w:t>
+        <w:t>I’m logging a quality score based on these guidelines, and I do want to see this quality score go up. But I also want a human quality score next to it, so we can benchmark how we’re doing compared to the traditional way of working, so we can prove it’s better. Because otherwise it’s a feeling.</w:t>
       </w:r>
     </w:p>
     <w:p>
@@ -15384,7 +15384,7 @@
         <w:pStyle w:val="Quote"/>
       </w:pPr>
       <w:r>
-        <w:t>You can always build something very quickly that gives you the same information as if you would have an analyst sitting there. It’s not as good as if you would have a great analyst, but it's pretty much the same as if you have a mediocre one and still have to sense-check what comes out of it.</w:t>
+        <w:t>You can always build something very quickly that gives you the same information as if you would have an analyst sitting there. It’s not as good as if you would have a great analyst, but it’s pretty much the same as if you have a mediocre one and still have to sense-check what comes out of it.</w:t>
       </w:r>
     </w:p>
     <w:p>
@@ -15432,7 +15432,7 @@
     </w:p>
     <w:p>
       <w:r>
-        <w:t>Another tension regarding implementation can be seen in the gap between optics and reality. Organizations report agentic capability in pitches and internal communications long before that capability is operationally present. Interviewee 9 states: “I think we sometimes present something a certain way while we're trying to actually make it that way in the background. Interviewee 12 seconds that perspective, noting that organizations “say that you have something that you don't really have, and then you go and build it really quickly.”</w:t>
+        <w:t>Another tension regarding implementation can be seen in the gap between optics and reality. Organizations report agentic capability in pitches and internal communications long before that capability is operationally present. Interviewee 9 states: “I think we sometimes present something a certain way while we’re trying to actually make it that way in the background. Interviewee 12 seconds that perspective, noting that organizations “say that you have something that you don’t really have, and then you go and build it really quickly.”</w:t>
       </w:r>
     </w:p>
     <w:p>
@@ -15467,7 +15467,7 @@
         <w:pStyle w:val="Quote"/>
       </w:pPr>
       <w:r>
-        <w:t>We tend to deploy AI first on the easiest-to-understand tasks, usually junior tasks. The problem: then you no longer develop juniors into seniors. […] Juniors often improve extremely quickly when given AI tools; they don't repeat mistakes. So that's a major risk: no new talent pipeline.</w:t>
+        <w:t>We tend to deploy AI first on the easiest-to-understand tasks, usually junior tasks. The problem: then you no longer develop juniors into seniors. […] Juniors often improve extremely quickly when given AI tools; they don’t repeat mistakes. So that’s a major risk: no new talent pipeline.</w:t>
       </w:r>
     </w:p>
     <w:p>
@@ -15483,7 +15483,7 @@
         <w:rPr>
           <w:lang w:val="en-US"/>
         </w:rPr>
-        <w:t> Interviewee 6 observed, "younger people being way more on top of it than older people." Interviewee 7 framed this as an inversion of the traditional seniority hierarchy:</w:t>
+        <w:t> Interviewee 6 observed, “younger people being way more on top of it than older people.” Interviewee 7 framed this as an inversion of the traditional seniority hierarchy:</w:t>
       </w:r>
     </w:p>
     <w:p>
@@ -15497,7 +15497,7 @@
         <w:rPr>
           <w:lang w:val="en-US"/>
         </w:rPr>
-        <w:t>You come in, you don't know basically nothing, but as you move up, your skill level and experience go up. So it's the pyramid on its top. AI is different. The young people come with a lot of skills and knowledge, and the more you move up, the less they know about AI.</w:t>
+        <w:t>You come in, you don’t know basically nothing, but as you move up, your skill level and experience go up. So it’s the pyramid on its top. AI is different. The young people come with a lot of skills and knowledge, and the more you move up, the less they know about AI.</w:t>
       </w:r>
     </w:p>
     <w:p>
@@ -23492,7 +23492,7 @@
         <w:annotationRef/>
       </w:r>
       <w:r>
-        <w:t xml:space="preserve"> this section seems most relevant here rather than section 5 because it's still so dependent on quotes. It does also contain more interpretation than the other sections in chapter 4, so I just wanted to check.</w:t>
+        <w:t xml:space="preserve"> this section seems most relevant here rather than section 5 because it’s still so dependent on quotes. It does also contain more interpretation than the other sections in chapter 4, so I just wanted to check.</w:t>
       </w:r>
     </w:p>
   </w:comment>
@@ -23543,7 +23543,7 @@
         <w:annotationRef/>
       </w:r>
       <w:r>
-        <w:t>@claude:  I don't think this is entirely true. Value is partly based on the configuration you use, but it's also very much dependent on the manager's behaviour. If you're implementing a system which you're not bringing people along, it won't be used and it won't derive value. Likewise, a lot of the value is based on actually starting. Organisations that do not start with experimentation, getting stuck in their legal setup, are missing a lot of potential value.</w:t>
+        <w:t>@claude:  I don’t think this is entirely true. Value is partly based on the configuration you use, but it’s also very much dependent on the manager’s behaviour. If you’re implementing a system which you’re not bringing people along, it won’t be used and it won’t derive value. Likewise, a lot of the value is based on actually starting. Organisations that do not start with experimentation, getting stuck in their legal setup, are missing a lot of potential value.</w:t>
       </w:r>
     </w:p>
   </w:comment>

</xml_diff>

<commit_message>
Finalize thesis docs: update draft + deck, drop interim variants
- Update final thesis (main + onedrive shared copy) and presentation deck
- Remove interim backup/variant exports (COMPREHENSIVE/FOCUSED, dated backups)
- Add linkedin-series.md and .claude/launch.json
- Ignore Office lock/temp files (~$*, ~WRL*.tmp)

Co-Authored-By: Claude Opus 4.8 <noreply@anthropic.com>
</commit_message>
<xml_diff>
--- a/Thesis Draft - Daan Luttik - MBA.docx
+++ b/Thesis Draft - Daan Luttik - MBA.docx
@@ -548,7 +548,7 @@
       <w:pPr>
         <w:pStyle w:val="Heading1"/>
       </w:pPr>
-      <w:bookmarkStart w:id="2" w:name="_Toc232373215"/>
+      <w:bookmarkStart w:id="2" w:name="_Toc233106439"/>
       <w:r>
         <w:lastRenderedPageBreak/>
         <w:t>Foreword</w:t>
@@ -726,7 +726,7 @@
           <w:r>
             <w:fldChar w:fldCharType="separate"/>
           </w:r>
-          <w:hyperlink w:anchor="_Toc232373215" w:history="1">
+          <w:hyperlink w:anchor="_Toc233106439" w:history="1">
             <w:r>
               <w:rPr>
                 <w:rStyle w:val="Hyperlink"/>
@@ -753,7 +753,7 @@
                 <w:noProof/>
                 <w:webHidden/>
               </w:rPr>
-              <w:instrText xml:space="preserve"> PAGEREF _Toc232373215 \h </w:instrText>
+              <w:instrText xml:space="preserve"> PAGEREF _Toc233106439 \h </w:instrText>
             </w:r>
             <w:r>
               <w:rPr>
@@ -800,7 +800,7 @@
               <w14:ligatures w14:val="standardContextual"/>
             </w:rPr>
           </w:pPr>
-          <w:hyperlink w:anchor="_Toc232373216" w:history="1">
+          <w:hyperlink w:anchor="_Toc233106440" w:history="1">
             <w:r>
               <w:rPr>
                 <w:rStyle w:val="Hyperlink"/>
@@ -827,7 +827,7 @@
                 <w:noProof/>
                 <w:webHidden/>
               </w:rPr>
-              <w:instrText xml:space="preserve"> PAGEREF _Toc232373216 \h </w:instrText>
+              <w:instrText xml:space="preserve"> PAGEREF _Toc233106440 \h </w:instrText>
             </w:r>
             <w:r>
               <w:rPr>
@@ -874,7 +874,7 @@
               <w14:ligatures w14:val="standardContextual"/>
             </w:rPr>
           </w:pPr>
-          <w:hyperlink w:anchor="_Toc232373217" w:history="1">
+          <w:hyperlink w:anchor="_Toc233106441" w:history="1">
             <w:r>
               <w:rPr>
                 <w:rStyle w:val="Hyperlink"/>
@@ -901,7 +901,7 @@
                 <w:noProof/>
                 <w:webHidden/>
               </w:rPr>
-              <w:instrText xml:space="preserve"> PAGEREF _Toc232373217 \h </w:instrText>
+              <w:instrText xml:space="preserve"> PAGEREF _Toc233106441 \h </w:instrText>
             </w:r>
             <w:r>
               <w:rPr>
@@ -949,7 +949,7 @@
               <w14:ligatures w14:val="standardContextual"/>
             </w:rPr>
           </w:pPr>
-          <w:hyperlink w:anchor="_Toc232373218" w:history="1">
+          <w:hyperlink w:anchor="_Toc233106442" w:history="1">
             <w:r>
               <w:rPr>
                 <w:rStyle w:val="Hyperlink"/>
@@ -995,7 +995,7 @@
                 <w:noProof/>
                 <w:webHidden/>
               </w:rPr>
-              <w:instrText xml:space="preserve"> PAGEREF _Toc232373218 \h </w:instrText>
+              <w:instrText xml:space="preserve"> PAGEREF _Toc233106442 \h </w:instrText>
             </w:r>
             <w:r>
               <w:rPr>
@@ -1043,7 +1043,7 @@
               <w14:ligatures w14:val="standardContextual"/>
             </w:rPr>
           </w:pPr>
-          <w:hyperlink w:anchor="_Toc232373219" w:history="1">
+          <w:hyperlink w:anchor="_Toc233106443" w:history="1">
             <w:r>
               <w:rPr>
                 <w:rStyle w:val="Hyperlink"/>
@@ -1089,7 +1089,7 @@
                 <w:noProof/>
                 <w:webHidden/>
               </w:rPr>
-              <w:instrText xml:space="preserve"> PAGEREF _Toc232373219 \h </w:instrText>
+              <w:instrText xml:space="preserve"> PAGEREF _Toc233106443 \h </w:instrText>
             </w:r>
             <w:r>
               <w:rPr>
@@ -1137,7 +1137,7 @@
               <w14:ligatures w14:val="standardContextual"/>
             </w:rPr>
           </w:pPr>
-          <w:hyperlink w:anchor="_Toc232373220" w:history="1">
+          <w:hyperlink w:anchor="_Toc233106444" w:history="1">
             <w:r>
               <w:rPr>
                 <w:rStyle w:val="Hyperlink"/>
@@ -1185,7 +1185,7 @@
                 <w:noProof/>
                 <w:webHidden/>
               </w:rPr>
-              <w:instrText xml:space="preserve"> PAGEREF _Toc232373220 \h </w:instrText>
+              <w:instrText xml:space="preserve"> PAGEREF _Toc233106444 \h </w:instrText>
             </w:r>
             <w:r>
               <w:rPr>
@@ -1233,7 +1233,7 @@
               <w14:ligatures w14:val="standardContextual"/>
             </w:rPr>
           </w:pPr>
-          <w:hyperlink w:anchor="_Toc232373221" w:history="1">
+          <w:hyperlink w:anchor="_Toc233106445" w:history="1">
             <w:r>
               <w:rPr>
                 <w:rStyle w:val="Hyperlink"/>
@@ -1281,7 +1281,7 @@
                 <w:noProof/>
                 <w:webHidden/>
               </w:rPr>
-              <w:instrText xml:space="preserve"> PAGEREF _Toc232373221 \h </w:instrText>
+              <w:instrText xml:space="preserve"> PAGEREF _Toc233106445 \h </w:instrText>
             </w:r>
             <w:r>
               <w:rPr>
@@ -1329,7 +1329,7 @@
               <w14:ligatures w14:val="standardContextual"/>
             </w:rPr>
           </w:pPr>
-          <w:hyperlink w:anchor="_Toc232373222" w:history="1">
+          <w:hyperlink w:anchor="_Toc233106446" w:history="1">
             <w:r>
               <w:rPr>
                 <w:rStyle w:val="Hyperlink"/>
@@ -1377,7 +1377,7 @@
                 <w:noProof/>
                 <w:webHidden/>
               </w:rPr>
-              <w:instrText xml:space="preserve"> PAGEREF _Toc232373222 \h </w:instrText>
+              <w:instrText xml:space="preserve"> PAGEREF _Toc233106446 \h </w:instrText>
             </w:r>
             <w:r>
               <w:rPr>
@@ -1424,7 +1424,7 @@
               <w14:ligatures w14:val="standardContextual"/>
             </w:rPr>
           </w:pPr>
-          <w:hyperlink w:anchor="_Toc232373223" w:history="1">
+          <w:hyperlink w:anchor="_Toc233106447" w:history="1">
             <w:r>
               <w:rPr>
                 <w:rStyle w:val="Hyperlink"/>
@@ -1451,7 +1451,7 @@
                 <w:noProof/>
                 <w:webHidden/>
               </w:rPr>
-              <w:instrText xml:space="preserve"> PAGEREF _Toc232373223 \h </w:instrText>
+              <w:instrText xml:space="preserve"> PAGEREF _Toc233106447 \h </w:instrText>
             </w:r>
             <w:r>
               <w:rPr>
@@ -1499,7 +1499,7 @@
               <w14:ligatures w14:val="standardContextual"/>
             </w:rPr>
           </w:pPr>
-          <w:hyperlink w:anchor="_Toc232373224" w:history="1">
+          <w:hyperlink w:anchor="_Toc233106448" w:history="1">
             <w:r>
               <w:rPr>
                 <w:rStyle w:val="Hyperlink"/>
@@ -1547,7 +1547,7 @@
                 <w:noProof/>
                 <w:webHidden/>
               </w:rPr>
-              <w:instrText xml:space="preserve"> PAGEREF _Toc232373224 \h </w:instrText>
+              <w:instrText xml:space="preserve"> PAGEREF _Toc233106448 \h </w:instrText>
             </w:r>
             <w:r>
               <w:rPr>
@@ -1595,7 +1595,7 @@
               <w14:ligatures w14:val="standardContextual"/>
             </w:rPr>
           </w:pPr>
-          <w:hyperlink w:anchor="_Toc232373225" w:history="1">
+          <w:hyperlink w:anchor="_Toc233106449" w:history="1">
             <w:r>
               <w:rPr>
                 <w:rStyle w:val="Hyperlink"/>
@@ -1643,7 +1643,7 @@
                 <w:noProof/>
                 <w:webHidden/>
               </w:rPr>
-              <w:instrText xml:space="preserve"> PAGEREF _Toc232373225 \h </w:instrText>
+              <w:instrText xml:space="preserve"> PAGEREF _Toc233106449 \h </w:instrText>
             </w:r>
             <w:r>
               <w:rPr>
@@ -1691,7 +1691,7 @@
               <w14:ligatures w14:val="standardContextual"/>
             </w:rPr>
           </w:pPr>
-          <w:hyperlink w:anchor="_Toc232373226" w:history="1">
+          <w:hyperlink w:anchor="_Toc233106450" w:history="1">
             <w:r>
               <w:rPr>
                 <w:rStyle w:val="Hyperlink"/>
@@ -1739,7 +1739,7 @@
                 <w:noProof/>
                 <w:webHidden/>
               </w:rPr>
-              <w:instrText xml:space="preserve"> PAGEREF _Toc232373226 \h </w:instrText>
+              <w:instrText xml:space="preserve"> PAGEREF _Toc233106450 \h </w:instrText>
             </w:r>
             <w:r>
               <w:rPr>
@@ -1787,7 +1787,7 @@
               <w14:ligatures w14:val="standardContextual"/>
             </w:rPr>
           </w:pPr>
-          <w:hyperlink w:anchor="_Toc232373227" w:history="1">
+          <w:hyperlink w:anchor="_Toc233106451" w:history="1">
             <w:r>
               <w:rPr>
                 <w:rStyle w:val="Hyperlink"/>
@@ -1835,7 +1835,7 @@
                 <w:noProof/>
                 <w:webHidden/>
               </w:rPr>
-              <w:instrText xml:space="preserve"> PAGEREF _Toc232373227 \h </w:instrText>
+              <w:instrText xml:space="preserve"> PAGEREF _Toc233106451 \h </w:instrText>
             </w:r>
             <w:r>
               <w:rPr>
@@ -1883,7 +1883,7 @@
               <w14:ligatures w14:val="standardContextual"/>
             </w:rPr>
           </w:pPr>
-          <w:hyperlink w:anchor="_Toc232373228" w:history="1">
+          <w:hyperlink w:anchor="_Toc233106452" w:history="1">
             <w:r>
               <w:rPr>
                 <w:rStyle w:val="Hyperlink"/>
@@ -1929,7 +1929,7 @@
                 <w:noProof/>
                 <w:webHidden/>
               </w:rPr>
-              <w:instrText xml:space="preserve"> PAGEREF _Toc232373228 \h </w:instrText>
+              <w:instrText xml:space="preserve"> PAGEREF _Toc233106452 \h </w:instrText>
             </w:r>
             <w:r>
               <w:rPr>
@@ -1977,7 +1977,7 @@
               <w14:ligatures w14:val="standardContextual"/>
             </w:rPr>
           </w:pPr>
-          <w:hyperlink w:anchor="_Toc232373229" w:history="1">
+          <w:hyperlink w:anchor="_Toc233106453" w:history="1">
             <w:r>
               <w:rPr>
                 <w:rStyle w:val="Hyperlink"/>
@@ -2023,7 +2023,7 @@
                 <w:noProof/>
                 <w:webHidden/>
               </w:rPr>
-              <w:instrText xml:space="preserve"> PAGEREF _Toc232373229 \h </w:instrText>
+              <w:instrText xml:space="preserve"> PAGEREF _Toc233106453 \h </w:instrText>
             </w:r>
             <w:r>
               <w:rPr>
@@ -2071,7 +2071,7 @@
               <w14:ligatures w14:val="standardContextual"/>
             </w:rPr>
           </w:pPr>
-          <w:hyperlink w:anchor="_Toc232373230" w:history="1">
+          <w:hyperlink w:anchor="_Toc233106454" w:history="1">
             <w:r>
               <w:rPr>
                 <w:rStyle w:val="Hyperlink"/>
@@ -2117,7 +2117,7 @@
                 <w:noProof/>
                 <w:webHidden/>
               </w:rPr>
-              <w:instrText xml:space="preserve"> PAGEREF _Toc232373230 \h </w:instrText>
+              <w:instrText xml:space="preserve"> PAGEREF _Toc233106454 \h </w:instrText>
             </w:r>
             <w:r>
               <w:rPr>
@@ -2165,7 +2165,7 @@
               <w14:ligatures w14:val="standardContextual"/>
             </w:rPr>
           </w:pPr>
-          <w:hyperlink w:anchor="_Toc232373231" w:history="1">
+          <w:hyperlink w:anchor="_Toc233106455" w:history="1">
             <w:r>
               <w:rPr>
                 <w:rStyle w:val="Hyperlink"/>
@@ -2211,7 +2211,7 @@
                 <w:noProof/>
                 <w:webHidden/>
               </w:rPr>
-              <w:instrText xml:space="preserve"> PAGEREF _Toc232373231 \h </w:instrText>
+              <w:instrText xml:space="preserve"> PAGEREF _Toc233106455 \h </w:instrText>
             </w:r>
             <w:r>
               <w:rPr>
@@ -2259,7 +2259,7 @@
               <w14:ligatures w14:val="standardContextual"/>
             </w:rPr>
           </w:pPr>
-          <w:hyperlink w:anchor="_Toc232373232" w:history="1">
+          <w:hyperlink w:anchor="_Toc233106456" w:history="1">
             <w:r>
               <w:rPr>
                 <w:rStyle w:val="Hyperlink"/>
@@ -2305,7 +2305,7 @@
                 <w:noProof/>
                 <w:webHidden/>
               </w:rPr>
-              <w:instrText xml:space="preserve"> PAGEREF _Toc232373232 \h </w:instrText>
+              <w:instrText xml:space="preserve"> PAGEREF _Toc233106456 \h </w:instrText>
             </w:r>
             <w:r>
               <w:rPr>
@@ -2353,7 +2353,7 @@
               <w14:ligatures w14:val="standardContextual"/>
             </w:rPr>
           </w:pPr>
-          <w:hyperlink w:anchor="_Toc232373233" w:history="1">
+          <w:hyperlink w:anchor="_Toc233106457" w:history="1">
             <w:r>
               <w:rPr>
                 <w:rStyle w:val="Hyperlink"/>
@@ -2399,7 +2399,7 @@
                 <w:noProof/>
                 <w:webHidden/>
               </w:rPr>
-              <w:instrText xml:space="preserve"> PAGEREF _Toc232373233 \h </w:instrText>
+              <w:instrText xml:space="preserve"> PAGEREF _Toc233106457 \h </w:instrText>
             </w:r>
             <w:r>
               <w:rPr>
@@ -2447,7 +2447,7 @@
               <w14:ligatures w14:val="standardContextual"/>
             </w:rPr>
           </w:pPr>
-          <w:hyperlink w:anchor="_Toc232373234" w:history="1">
+          <w:hyperlink w:anchor="_Toc233106458" w:history="1">
             <w:r>
               <w:rPr>
                 <w:rStyle w:val="Hyperlink"/>
@@ -2493,7 +2493,7 @@
                 <w:noProof/>
                 <w:webHidden/>
               </w:rPr>
-              <w:instrText xml:space="preserve"> PAGEREF _Toc232373234 \h </w:instrText>
+              <w:instrText xml:space="preserve"> PAGEREF _Toc233106458 \h </w:instrText>
             </w:r>
             <w:r>
               <w:rPr>
@@ -2541,7 +2541,7 @@
               <w14:ligatures w14:val="standardContextual"/>
             </w:rPr>
           </w:pPr>
-          <w:hyperlink w:anchor="_Toc232373235" w:history="1">
+          <w:hyperlink w:anchor="_Toc233106459" w:history="1">
             <w:r>
               <w:rPr>
                 <w:rStyle w:val="Hyperlink"/>
@@ -2587,7 +2587,7 @@
                 <w:noProof/>
                 <w:webHidden/>
               </w:rPr>
-              <w:instrText xml:space="preserve"> PAGEREF _Toc232373235 \h </w:instrText>
+              <w:instrText xml:space="preserve"> PAGEREF _Toc233106459 \h </w:instrText>
             </w:r>
             <w:r>
               <w:rPr>
@@ -2635,7 +2635,7 @@
               <w14:ligatures w14:val="standardContextual"/>
             </w:rPr>
           </w:pPr>
-          <w:hyperlink w:anchor="_Toc232373236" w:history="1">
+          <w:hyperlink w:anchor="_Toc233106460" w:history="1">
             <w:r>
               <w:rPr>
                 <w:rStyle w:val="Hyperlink"/>
@@ -2681,7 +2681,7 @@
                 <w:noProof/>
                 <w:webHidden/>
               </w:rPr>
-              <w:instrText xml:space="preserve"> PAGEREF _Toc232373236 \h </w:instrText>
+              <w:instrText xml:space="preserve"> PAGEREF _Toc233106460 \h </w:instrText>
             </w:r>
             <w:r>
               <w:rPr>
@@ -2729,7 +2729,7 @@
               <w14:ligatures w14:val="standardContextual"/>
             </w:rPr>
           </w:pPr>
-          <w:hyperlink w:anchor="_Toc232373237" w:history="1">
+          <w:hyperlink w:anchor="_Toc233106461" w:history="1">
             <w:r>
               <w:rPr>
                 <w:rStyle w:val="Hyperlink"/>
@@ -2775,7 +2775,7 @@
                 <w:noProof/>
                 <w:webHidden/>
               </w:rPr>
-              <w:instrText xml:space="preserve"> PAGEREF _Toc232373237 \h </w:instrText>
+              <w:instrText xml:space="preserve"> PAGEREF _Toc233106461 \h </w:instrText>
             </w:r>
             <w:r>
               <w:rPr>
@@ -2823,7 +2823,7 @@
               <w14:ligatures w14:val="standardContextual"/>
             </w:rPr>
           </w:pPr>
-          <w:hyperlink w:anchor="_Toc232373238" w:history="1">
+          <w:hyperlink w:anchor="_Toc233106462" w:history="1">
             <w:r>
               <w:rPr>
                 <w:rStyle w:val="Hyperlink"/>
@@ -2869,7 +2869,7 @@
                 <w:noProof/>
                 <w:webHidden/>
               </w:rPr>
-              <w:instrText xml:space="preserve"> PAGEREF _Toc232373238 \h </w:instrText>
+              <w:instrText xml:space="preserve"> PAGEREF _Toc233106462 \h </w:instrText>
             </w:r>
             <w:r>
               <w:rPr>
@@ -2917,7 +2917,7 @@
               <w14:ligatures w14:val="standardContextual"/>
             </w:rPr>
           </w:pPr>
-          <w:hyperlink w:anchor="_Toc232373239" w:history="1">
+          <w:hyperlink w:anchor="_Toc233106463" w:history="1">
             <w:r>
               <w:rPr>
                 <w:rStyle w:val="Hyperlink"/>
@@ -2963,7 +2963,7 @@
                 <w:noProof/>
                 <w:webHidden/>
               </w:rPr>
-              <w:instrText xml:space="preserve"> PAGEREF _Toc232373239 \h </w:instrText>
+              <w:instrText xml:space="preserve"> PAGEREF _Toc233106463 \h </w:instrText>
             </w:r>
             <w:r>
               <w:rPr>
@@ -3010,7 +3010,7 @@
               <w14:ligatures w14:val="standardContextual"/>
             </w:rPr>
           </w:pPr>
-          <w:hyperlink w:anchor="_Toc232373240" w:history="1">
+          <w:hyperlink w:anchor="_Toc233106464" w:history="1">
             <w:r>
               <w:rPr>
                 <w:rStyle w:val="Hyperlink"/>
@@ -3037,7 +3037,7 @@
                 <w:noProof/>
                 <w:webHidden/>
               </w:rPr>
-              <w:instrText xml:space="preserve"> PAGEREF _Toc232373240 \h </w:instrText>
+              <w:instrText xml:space="preserve"> PAGEREF _Toc233106464 \h </w:instrText>
             </w:r>
             <w:r>
               <w:rPr>
@@ -3085,7 +3085,7 @@
               <w14:ligatures w14:val="standardContextual"/>
             </w:rPr>
           </w:pPr>
-          <w:hyperlink w:anchor="_Toc232373241" w:history="1">
+          <w:hyperlink w:anchor="_Toc233106465" w:history="1">
             <w:r>
               <w:rPr>
                 <w:rStyle w:val="Hyperlink"/>
@@ -3133,7 +3133,7 @@
                 <w:noProof/>
                 <w:webHidden/>
               </w:rPr>
-              <w:instrText xml:space="preserve"> PAGEREF _Toc232373241 \h </w:instrText>
+              <w:instrText xml:space="preserve"> PAGEREF _Toc233106465 \h </w:instrText>
             </w:r>
             <w:r>
               <w:rPr>
@@ -3180,7 +3180,7 @@
               <w14:ligatures w14:val="standardContextual"/>
             </w:rPr>
           </w:pPr>
-          <w:hyperlink w:anchor="_Toc232373242" w:history="1">
+          <w:hyperlink w:anchor="_Toc233106466" w:history="1">
             <w:r>
               <w:rPr>
                 <w:rStyle w:val="Hyperlink"/>
@@ -3207,7 +3207,7 @@
                 <w:noProof/>
                 <w:webHidden/>
               </w:rPr>
-              <w:instrText xml:space="preserve"> PAGEREF _Toc232373242 \h </w:instrText>
+              <w:instrText xml:space="preserve"> PAGEREF _Toc233106466 \h </w:instrText>
             </w:r>
             <w:r>
               <w:rPr>
@@ -3254,7 +3254,7 @@
               <w14:ligatures w14:val="standardContextual"/>
             </w:rPr>
           </w:pPr>
-          <w:hyperlink w:anchor="_Toc232373243" w:history="1">
+          <w:hyperlink w:anchor="_Toc233106467" w:history="1">
             <w:r>
               <w:rPr>
                 <w:rStyle w:val="Hyperlink"/>
@@ -3281,7 +3281,7 @@
                 <w:noProof/>
                 <w:webHidden/>
               </w:rPr>
-              <w:instrText xml:space="preserve"> PAGEREF _Toc232373243 \h </w:instrText>
+              <w:instrText xml:space="preserve"> PAGEREF _Toc233106467 \h </w:instrText>
             </w:r>
             <w:r>
               <w:rPr>
@@ -3328,13 +3328,13 @@
               <w14:ligatures w14:val="standardContextual"/>
             </w:rPr>
           </w:pPr>
-          <w:hyperlink w:anchor="_Toc232373244" w:history="1">
+          <w:hyperlink w:anchor="_Toc233106468" w:history="1">
             <w:r>
               <w:rPr>
                 <w:rStyle w:val="Hyperlink"/>
                 <w:noProof/>
               </w:rPr>
-              <w:t>Conditions: auditing what enables or constrains</w:t>
+              <w:t>Navigating: acting on the conditions</w:t>
             </w:r>
             <w:r>
               <w:rPr>
@@ -3355,7 +3355,7 @@
                 <w:noProof/>
                 <w:webHidden/>
               </w:rPr>
-              <w:instrText xml:space="preserve"> PAGEREF _Toc232373244 \h </w:instrText>
+              <w:instrText xml:space="preserve"> PAGEREF _Toc233106468 \h </w:instrText>
             </w:r>
             <w:r>
               <w:rPr>
@@ -3372,13 +3372,10 @@
             </w:r>
             <w:r>
               <w:rPr>
-                <w:b/>
-                <w:bCs/>
                 <w:noProof/>
                 <w:webHidden/>
-                <w:lang w:val="en-US"/>
-              </w:rPr>
-              <w:t>Error! Bookmark not defined.</w:t>
+              </w:rPr>
+              <w:t>64</w:t>
             </w:r>
             <w:r>
               <w:rPr>
@@ -3405,13 +3402,13 @@
               <w14:ligatures w14:val="standardContextual"/>
             </w:rPr>
           </w:pPr>
-          <w:hyperlink w:anchor="_Toc232373245" w:history="1">
+          <w:hyperlink w:anchor="_Toc233106469" w:history="1">
             <w:r>
               <w:rPr>
                 <w:rStyle w:val="Hyperlink"/>
                 <w:noProof/>
               </w:rPr>
-              <w:t>Navigating: acting on the conditions</w:t>
+              <w:t>Applying: putting agentic AI to work</w:t>
             </w:r>
             <w:r>
               <w:rPr>
@@ -3432,7 +3429,7 @@
                 <w:noProof/>
                 <w:webHidden/>
               </w:rPr>
-              <w:instrText xml:space="preserve"> PAGEREF _Toc232373245 \h </w:instrText>
+              <w:instrText xml:space="preserve"> PAGEREF _Toc233106469 \h </w:instrText>
             </w:r>
             <w:r>
               <w:rPr>
@@ -3452,7 +3449,7 @@
                 <w:noProof/>
                 <w:webHidden/>
               </w:rPr>
-              <w:t>64</w:t>
+              <w:t>65</w:t>
             </w:r>
             <w:r>
               <w:rPr>
@@ -3479,13 +3476,13 @@
               <w14:ligatures w14:val="standardContextual"/>
             </w:rPr>
           </w:pPr>
-          <w:hyperlink w:anchor="_Toc232373246" w:history="1">
+          <w:hyperlink w:anchor="_Toc233106470" w:history="1">
             <w:r>
               <w:rPr>
                 <w:rStyle w:val="Hyperlink"/>
                 <w:noProof/>
               </w:rPr>
-              <w:t>Applying: putting agentic AI to work</w:t>
+              <w:t>Mediating Value Outcomes: turning application into value</w:t>
             </w:r>
             <w:r>
               <w:rPr>
@@ -3506,81 +3503,7 @@
                 <w:noProof/>
                 <w:webHidden/>
               </w:rPr>
-              <w:instrText xml:space="preserve"> PAGEREF _Toc232373246 \h </w:instrText>
-            </w:r>
-            <w:r>
-              <w:rPr>
-                <w:noProof/>
-                <w:webHidden/>
-              </w:rPr>
-            </w:r>
-            <w:r>
-              <w:rPr>
-                <w:noProof/>
-                <w:webHidden/>
-              </w:rPr>
-              <w:fldChar w:fldCharType="separate"/>
-            </w:r>
-            <w:r>
-              <w:rPr>
-                <w:noProof/>
-                <w:webHidden/>
-              </w:rPr>
-              <w:t>65</w:t>
-            </w:r>
-            <w:r>
-              <w:rPr>
-                <w:noProof/>
-                <w:webHidden/>
-              </w:rPr>
-              <w:fldChar w:fldCharType="end"/>
-            </w:r>
-          </w:hyperlink>
-        </w:p>
-        <w:p>
-          <w:pPr>
-            <w:pStyle w:val="TOC2"/>
-            <w:tabs>
-              <w:tab w:val="right" w:leader="dot" w:pos="9350"/>
-            </w:tabs>
-            <w:rPr>
-              <w:rFonts w:asciiTheme="minorHAnsi" w:eastAsiaTheme="minorEastAsia" w:hAnsiTheme="minorHAnsi" w:cstheme="minorBidi"/>
-              <w:noProof/>
-              <w:kern w:val="2"/>
-              <w:sz w:val="24"/>
-              <w:szCs w:val="24"/>
-              <w:lang w:val="nl-NL"/>
-              <w14:ligatures w14:val="standardContextual"/>
-            </w:rPr>
-          </w:pPr>
-          <w:hyperlink w:anchor="_Toc232373247" w:history="1">
-            <w:r>
-              <w:rPr>
-                <w:rStyle w:val="Hyperlink"/>
-                <w:noProof/>
-              </w:rPr>
-              <w:t>Mediating Value Outcomes: turning application into value</w:t>
-            </w:r>
-            <w:r>
-              <w:rPr>
-                <w:noProof/>
-                <w:webHidden/>
-              </w:rPr>
-              <w:tab/>
-            </w:r>
-            <w:r>
-              <w:rPr>
-                <w:noProof/>
-                <w:webHidden/>
-              </w:rPr>
-              <w:fldChar w:fldCharType="begin"/>
-            </w:r>
-            <w:r>
-              <w:rPr>
-                <w:noProof/>
-                <w:webHidden/>
-              </w:rPr>
-              <w:instrText xml:space="preserve"> PAGEREF _Toc232373247 \h </w:instrText>
+              <w:instrText xml:space="preserve"> PAGEREF _Toc233106470 \h </w:instrText>
             </w:r>
             <w:r>
               <w:rPr>
@@ -3627,7 +3550,7 @@
       <w:pPr>
         <w:pStyle w:val="Heading1"/>
       </w:pPr>
-      <w:bookmarkStart w:id="3" w:name="_Toc232373216"/>
+      <w:bookmarkStart w:id="3" w:name="_Toc233106440"/>
       <w:r>
         <w:lastRenderedPageBreak/>
         <w:t>Executive Summary</w:t>
@@ -3688,7 +3611,7 @@
         <w:t>This study proposes a model that combines</w:t>
       </w:r>
       <w:r>
-        <w:t>c</w:t>
+        <w:t xml:space="preserve"> </w:t>
       </w:r>
       <w:r>
         <w:t>four managerial behaviors</w:t>
@@ -3763,7 +3686,7 @@
       <w:pPr>
         <w:pStyle w:val="Heading1"/>
       </w:pPr>
-      <w:bookmarkStart w:id="5" w:name="_Toc232373217"/>
+      <w:bookmarkStart w:id="5" w:name="_Toc233106441"/>
       <w:r>
         <w:lastRenderedPageBreak/>
         <w:t xml:space="preserve">1.       </w:t>
@@ -4297,7 +4220,7 @@
       <w:pPr>
         <w:pStyle w:val="Heading1"/>
       </w:pPr>
-      <w:bookmarkStart w:id="29" w:name="_Toc232373218"/>
+      <w:bookmarkStart w:id="29" w:name="_Toc233106442"/>
       <w:r>
         <w:lastRenderedPageBreak/>
         <w:t xml:space="preserve">2. </w:t>
@@ -4324,7 +4247,7 @@
           <w:iCs/>
         </w:rPr>
       </w:pPr>
-      <w:bookmarkStart w:id="30" w:name="_Toc232373219"/>
+      <w:bookmarkStart w:id="30" w:name="_Toc233106443"/>
       <w:r>
         <w:t xml:space="preserve">2.1. </w:t>
       </w:r>
@@ -5396,7 +5319,7 @@
       <w:pPr>
         <w:pStyle w:val="Heading2"/>
       </w:pPr>
-      <w:bookmarkStart w:id="62" w:name="_Toc232373220"/>
+      <w:bookmarkStart w:id="62" w:name="_Toc233106444"/>
       <w:r>
         <w:rPr>
           <w:lang w:val="en-US"/>
@@ -5675,7 +5598,7 @@
       <w:pPr>
         <w:pStyle w:val="Heading2"/>
       </w:pPr>
-      <w:bookmarkStart w:id="73" w:name="_Toc232373221"/>
+      <w:bookmarkStart w:id="73" w:name="_Toc233106445"/>
       <w:r>
         <w:rPr>
           <w:lang w:val="en-US"/>
@@ -5804,7 +5727,7 @@
       <w:pPr>
         <w:pStyle w:val="Heading2"/>
       </w:pPr>
-      <w:bookmarkStart w:id="77" w:name="_Toc232373222"/>
+      <w:bookmarkStart w:id="77" w:name="_Toc233106446"/>
       <w:bookmarkEnd w:id="75"/>
       <w:commentRangeStart w:id="78"/>
       <w:r>
@@ -5946,7 +5869,7 @@
           <w:color w:val="auto"/>
         </w:rPr>
       </w:pPr>
-      <w:bookmarkStart w:id="80" w:name="_Toc232373223"/>
+      <w:bookmarkStart w:id="80" w:name="_Toc233106447"/>
       <w:bookmarkEnd w:id="79"/>
       <w:r>
         <w:rPr>
@@ -6017,7 +5940,7 @@
           <w:lang w:val="en-US"/>
         </w:rPr>
       </w:pPr>
-      <w:bookmarkStart w:id="84" w:name="_Toc232373224"/>
+      <w:bookmarkStart w:id="84" w:name="_Toc233106448"/>
       <w:r>
         <w:rPr>
           <w:lang w:val="en-US"/>
@@ -6055,7 +5978,7 @@
         <w:pStyle w:val="Heading2"/>
         <w:spacing w:before="80"/>
       </w:pPr>
-      <w:bookmarkStart w:id="86" w:name="_Toc232373225"/>
+      <w:bookmarkStart w:id="86" w:name="_Toc233106449"/>
       <w:r>
         <w:rPr>
           <w:lang w:val="en-US"/>
@@ -6163,7 +6086,7 @@
         <w:pStyle w:val="Heading2"/>
         <w:spacing w:before="80"/>
       </w:pPr>
-      <w:bookmarkStart w:id="87" w:name="_Toc232373226"/>
+      <w:bookmarkStart w:id="87" w:name="_Toc233106450"/>
       <w:r>
         <w:rPr>
           <w:lang w:val="en-US"/>
@@ -6289,7 +6212,7 @@
         <w:pStyle w:val="Heading2"/>
       </w:pPr>
       <w:bookmarkStart w:id="88" w:name="_kqzta5wwdy54" w:colFirst="0" w:colLast="0"/>
-      <w:bookmarkStart w:id="89" w:name="_Toc232373227"/>
+      <w:bookmarkStart w:id="89" w:name="_Toc233106451"/>
       <w:bookmarkEnd w:id="88"/>
       <w:r>
         <w:rPr>
@@ -12758,7 +12681,7 @@
       <w:pPr>
         <w:pStyle w:val="Heading2"/>
       </w:pPr>
-      <w:bookmarkStart w:id="110" w:name="_Toc232373228"/>
+      <w:bookmarkStart w:id="110" w:name="_Toc233106452"/>
       <w:r>
         <w:lastRenderedPageBreak/>
         <w:t>3.4</w:t>
@@ -14946,7 +14869,7 @@
       <w:pPr>
         <w:pStyle w:val="Heading1"/>
       </w:pPr>
-      <w:bookmarkStart w:id="120" w:name="_Toc232373229"/>
+      <w:bookmarkStart w:id="120" w:name="_Toc233106453"/>
       <w:r>
         <w:lastRenderedPageBreak/>
         <w:t xml:space="preserve">4. </w:t>
@@ -15072,7 +14995,7 @@
       <w:pPr>
         <w:pStyle w:val="Heading2"/>
       </w:pPr>
-      <w:bookmarkStart w:id="123" w:name="_Toc232373230"/>
+      <w:bookmarkStart w:id="123" w:name="_Toc233106454"/>
       <w:r>
         <w:lastRenderedPageBreak/>
         <w:t>4.1</w:t>
@@ -15571,7 +15494,7 @@
           <w:color w:val="000000"/>
         </w:rPr>
       </w:pPr>
-      <w:bookmarkStart w:id="144" w:name="_Toc232373231"/>
+      <w:bookmarkStart w:id="144" w:name="_Toc233106455"/>
       <w:commentRangeStart w:id="145"/>
       <w:r>
         <w:t>4.2</w:t>
@@ -16433,7 +16356,7 @@
       <w:pPr>
         <w:pStyle w:val="Heading2"/>
       </w:pPr>
-      <w:bookmarkStart w:id="166" w:name="_Toc232373232"/>
+      <w:bookmarkStart w:id="166" w:name="_Toc233106456"/>
       <w:commentRangeEnd w:id="165"/>
       <w:r>
         <w:rPr>
@@ -16970,7 +16893,7 @@
       <w:pPr>
         <w:pStyle w:val="Heading2"/>
       </w:pPr>
-      <w:bookmarkStart w:id="172" w:name="_Toc232373233"/>
+      <w:bookmarkStart w:id="172" w:name="_Toc233106457"/>
       <w:r>
         <w:t>4.4</w:t>
       </w:r>
@@ -18099,7 +18022,7 @@
           <w:color w:val="00312A"/>
         </w:rPr>
       </w:pPr>
-      <w:bookmarkStart w:id="188" w:name="_Toc232373234"/>
+      <w:bookmarkStart w:id="188" w:name="_Toc233106458"/>
       <w:r>
         <w:rPr>
           <w:color w:val="00312A"/>
@@ -18257,7 +18180,7 @@
       <w:pPr>
         <w:pStyle w:val="Heading2"/>
       </w:pPr>
-      <w:bookmarkStart w:id="196" w:name="_Toc232373235"/>
+      <w:bookmarkStart w:id="196" w:name="_Toc233106459"/>
       <w:r>
         <w:t>5.1</w:t>
       </w:r>
@@ -18877,13 +18800,7 @@
         <w:rPr>
           <w:lang w:val="en-US"/>
         </w:rPr>
-        <w:t xml:space="preserve"> </w:t>
-      </w:r>
-      <w:r>
-        <w:rPr>
-          <w:lang w:val="en-US"/>
-        </w:rPr>
-        <w:t>Ancillai et al., 2023)</w:t>
+        <w:t xml:space="preserve"> Ancillai et al., 2023)</w:t>
       </w:r>
       <w:r>
         <w:rPr>
@@ -18978,19 +18895,7 @@
         <w:rPr>
           <w:lang w:val="en-US"/>
         </w:rPr>
-        <w:t>The second question we sought to answer was “</w:t>
-      </w:r>
-      <w:r>
-        <w:rPr>
-          <w:lang w:val="en-US"/>
-        </w:rPr>
-        <w:t>How do marketing managers adopt agentic AI within their organizations?</w:t>
-      </w:r>
-      <w:r>
-        <w:rPr>
-          <w:lang w:val="en-US"/>
-        </w:rPr>
-        <w:t xml:space="preserve">”, we observed </w:t>
+        <w:t xml:space="preserve">The second question we sought to answer was “How do marketing managers adopt agentic AI within their organizations?”, we observed </w:t>
       </w:r>
       <w:r>
         <w:rPr>
@@ -19433,7 +19338,7 @@
       <w:pPr>
         <w:pStyle w:val="Heading2"/>
       </w:pPr>
-      <w:bookmarkStart w:id="221" w:name="_Toc232373236"/>
+      <w:bookmarkStart w:id="221" w:name="_Toc233106460"/>
       <w:r>
         <w:t>5.2</w:t>
       </w:r>
@@ -19684,7 +19589,7 @@
       <w:pPr>
         <w:pStyle w:val="Heading2"/>
       </w:pPr>
-      <w:bookmarkStart w:id="225" w:name="_Toc232373237"/>
+      <w:bookmarkStart w:id="225" w:name="_Toc233106461"/>
       <w:r>
         <w:t>5.3</w:t>
       </w:r>
@@ -19815,19 +19720,7 @@
         <w:rPr>
           <w:lang w:val="en-US"/>
         </w:rPr>
-        <w:t>, m</w:t>
-      </w:r>
-      <w:r>
-        <w:rPr>
-          <w:lang w:val="en-US"/>
-        </w:rPr>
-        <w:t xml:space="preserve">ost notably our dataset is skewed towards the Netherlands, so </w:t>
-      </w:r>
-      <w:r>
-        <w:rPr>
-          <w:lang w:val="en-US"/>
-        </w:rPr>
-        <w:t>the results might not be transferable to other markets, for instance due to a different cultural or legislative climate</w:t>
+        <w:t>, most notably our dataset is skewed towards the Netherlands, so the results might not be transferable to other markets, for instance due to a different cultural or legislative climate</w:t>
       </w:r>
       <w:r>
         <w:rPr>
@@ -20149,7 +20042,7 @@
       <w:pPr>
         <w:pStyle w:val="Heading1"/>
       </w:pPr>
-      <w:bookmarkStart w:id="235" w:name="_Toc232373238"/>
+      <w:bookmarkStart w:id="235" w:name="_Toc233106462"/>
       <w:r>
         <w:lastRenderedPageBreak/>
         <w:t>6.</w:t>
@@ -20309,7 +20202,7 @@
           <w:highlight w:val="white"/>
         </w:rPr>
       </w:pPr>
-      <w:bookmarkStart w:id="238" w:name="_Toc232373239"/>
+      <w:bookmarkStart w:id="238" w:name="_Toc233106463"/>
       <w:r>
         <w:lastRenderedPageBreak/>
         <w:t>7.</w:t>
@@ -21026,7 +20919,7 @@
       <w:r>
         <w:rPr>
           <w:highlight w:val="white"/>
-          <w:lang w:val="fr-FR"/>
+          <w:lang w:val="en-US"/>
         </w:rPr>
         <w:t xml:space="preserve">Bert: Pre-training of deep bidirectional transformers for language understanding. </w:t>
       </w:r>
@@ -21079,7 +20972,7 @@
           <w:i/>
           <w:iCs/>
           <w:highlight w:val="white"/>
-          <w:lang w:val="en-US"/>
+          <w:lang w:val="fr-FR"/>
         </w:rPr>
         <w:t>Science advances</w:t>
       </w:r>
@@ -22000,7 +21893,7 @@
         <w:ind w:left="720" w:hanging="720"/>
         <w:rPr>
           <w:highlight w:val="white"/>
-          <w:lang w:val="fr-FR"/>
+          <w:lang w:val="en-US"/>
         </w:rPr>
       </w:pPr>
       <w:r>
@@ -22014,14 +21907,14 @@
           <w:i/>
           <w:iCs/>
           <w:highlight w:val="white"/>
-          <w:lang w:val="fr-FR"/>
+          <w:lang w:val="en-US"/>
         </w:rPr>
         <w:t>Nature</w:t>
       </w:r>
       <w:r>
         <w:rPr>
           <w:highlight w:val="white"/>
-          <w:lang w:val="fr-FR"/>
+          <w:lang w:val="en-US"/>
         </w:rPr>
         <w:t>, </w:t>
       </w:r>
@@ -22030,14 +21923,14 @@
           <w:i/>
           <w:iCs/>
           <w:highlight w:val="white"/>
-          <w:lang w:val="fr-FR"/>
+          <w:lang w:val="en-US"/>
         </w:rPr>
         <w:t>521</w:t>
       </w:r>
       <w:r>
         <w:rPr>
           <w:highlight w:val="white"/>
-          <w:lang w:val="fr-FR"/>
+          <w:lang w:val="en-US"/>
         </w:rPr>
         <w:t>(7553), 436-444.</w:t>
       </w:r>
@@ -22048,7 +21941,7 @@
       </w:pPr>
       <w:r>
         <w:rPr>
-          <w:lang w:val="fr-FR"/>
+          <w:lang w:val="en-US"/>
         </w:rPr>
         <w:t xml:space="preserve">Lewis, P., Perez, E., Piktus, A., Petroni, F., Karpukhin, V., Goyal, N., ... </w:t>
       </w:r>
@@ -23009,7 +22902,7 @@
       <w:r>
         <w:rPr>
           <w:highlight w:val="white"/>
-          <w:lang w:val="it-IT"/>
+          <w:lang w:val="en-US"/>
         </w:rPr>
         <w:t xml:space="preserve">Woodside, A. G., Golfetto, F., &amp; Gibbert, M. (2008). </w:t>
       </w:r>
@@ -23128,7 +23021,7 @@
       <w:pPr>
         <w:pStyle w:val="Heading1"/>
       </w:pPr>
-      <w:bookmarkStart w:id="240" w:name="_Toc232373240"/>
+      <w:bookmarkStart w:id="240" w:name="_Toc233106464"/>
       <w:r>
         <w:lastRenderedPageBreak/>
         <w:t>Appendix A. Interview Guide and Protocol</w:t>
@@ -23147,7 +23040,7 @@
       <w:pPr>
         <w:pStyle w:val="Heading2"/>
       </w:pPr>
-      <w:bookmarkStart w:id="241" w:name="_Toc232373241"/>
+      <w:bookmarkStart w:id="241" w:name="_Toc233106465"/>
       <w:r>
         <w:rPr>
           <w:lang w:val="en-US"/>
@@ -23575,7 +23468,7 @@
       <w:pPr>
         <w:pStyle w:val="Heading1"/>
       </w:pPr>
-      <w:bookmarkStart w:id="242" w:name="_Toc232373242"/>
+      <w:bookmarkStart w:id="242" w:name="_Toc233106466"/>
       <w:commentRangeStart w:id="243"/>
       <w:r>
         <w:lastRenderedPageBreak/>
@@ -23601,7 +23494,7 @@
       <w:pPr>
         <w:pStyle w:val="Heading2"/>
       </w:pPr>
-      <w:bookmarkStart w:id="244" w:name="_Toc232373243"/>
+      <w:bookmarkStart w:id="244" w:name="_Toc233106467"/>
       <w:r>
         <w:t>Observing: sensing the changing context</w:t>
       </w:r>
@@ -23684,7 +23577,7 @@
       <w:pPr>
         <w:pStyle w:val="Heading2"/>
       </w:pPr>
-      <w:bookmarkStart w:id="245" w:name="_Toc232373245"/>
+      <w:bookmarkStart w:id="245" w:name="_Toc233106468"/>
       <w:r>
         <w:t>Navigating</w:t>
       </w:r>
@@ -23847,12 +23740,12 @@
         </w:rPr>
         <w:t>Fund and protect experimentation: centralize or absorb its cost so teams are not penalized for early, low-return learning.</w:t>
       </w:r>
-      <w:bookmarkStart w:id="246" w:name="_Toc232373246"/>
     </w:p>
     <w:p>
       <w:pPr>
         <w:pStyle w:val="Heading2"/>
       </w:pPr>
+      <w:bookmarkStart w:id="246" w:name="_Toc233106469"/>
       <w:r>
         <w:t>Applying: putting agentic AI to work</w:t>
       </w:r>
@@ -23934,12 +23827,12 @@
         </w:rPr>
         <w:t>. Only scale after you have gotten signals that it generates net-positive value.</w:t>
       </w:r>
-      <w:bookmarkStart w:id="247" w:name="_Toc232373247"/>
     </w:p>
     <w:p>
       <w:pPr>
         <w:pStyle w:val="Heading2"/>
       </w:pPr>
+      <w:bookmarkStart w:id="247" w:name="_Toc233106470"/>
       <w:r>
         <w:t>Mediating Value Outcomes: turning application into value</w:t>
       </w:r>

</xml_diff>

<commit_message>
Cleanup after handing in
</commit_message>
<xml_diff>
--- a/Thesis Draft - Daan Luttik - MBA.docx
+++ b/Thesis Draft - Daan Luttik - MBA.docx
@@ -6127,31 +6127,7 @@
         <w:rPr>
           <w:lang w:val="en-US"/>
         </w:rPr>
-        <w:t xml:space="preserve">The </w:t>
-      </w:r>
-      <w:r>
-        <w:rPr>
-          <w:lang w:val="en-US"/>
-        </w:rPr>
-        <w:t>research employs in-depth</w:t>
-      </w:r>
-      <w:r>
-        <w:rPr>
-          <w:lang w:val="en-US"/>
-        </w:rPr>
-        <w:t xml:space="preserve"> interviews with two key stakeholder groups: 1. marketing managers, who bring the domain expertise and practical experience, and 2. AI experts who can add additional expert knowledge about the technical possibilities and limitations of agentic AI solutions. This dual </w:t>
-      </w:r>
-      <w:r>
-        <w:rPr>
-          <w:lang w:val="en-US"/>
-        </w:rPr>
-        <w:t>perspective was chosen</w:t>
-      </w:r>
-      <w:r>
-        <w:rPr>
-          <w:lang w:val="en-US"/>
-        </w:rPr>
-        <w:t xml:space="preserve"> to get additional insights on both the technological possibilities and the current and planned use within marketing. The interaction between these </w:t>
+        <w:t xml:space="preserve">The research employs in-depth interviews with two key stakeholder groups: 1. marketing managers, who bring the domain expertise and practical experience, and 2. AI experts who can add additional expert knowledge about the technical possibilities and limitations of agentic AI solutions. This dual perspective was chosen to get additional insights on both the technological possibilities and the current and planned use within marketing. The interaction between these </w:t>
       </w:r>
       <w:r>
         <w:rPr>
@@ -6163,13 +6139,7 @@
     </w:p>
     <w:p>
       <w:r>
-        <w:t xml:space="preserve">In line with constructive grounded theory, a semi-structured </w:t>
-      </w:r>
-      <w:r>
-        <w:t>interview was used</w:t>
-      </w:r>
-      <w:r>
-        <w:t xml:space="preserve"> (Charmaz, </w:t>
+        <w:t xml:space="preserve">In line with constructive grounded theory, a semi-structured interview was used (Charmaz, </w:t>
       </w:r>
       <w:r>
         <w:rPr>
@@ -6201,19 +6171,7 @@
         <w:rPr>
           <w:lang w:val="en-US"/>
         </w:rPr>
-        <w:t xml:space="preserve">Throughout the process, </w:t>
-      </w:r>
-      <w:r>
-        <w:rPr>
-          <w:lang w:val="en-US"/>
-        </w:rPr>
-        <w:t>memos were written</w:t>
-      </w:r>
-      <w:r>
-        <w:rPr>
-          <w:lang w:val="en-US"/>
-        </w:rPr>
-        <w:t xml:space="preserve"> to capture the researcher</w:t>
+        <w:t>Throughout the process, memos were written to capture the researcher</w:t>
       </w:r>
       <w:r>
         <w:rPr>
@@ -6225,31 +6183,7 @@
         <w:rPr>
           <w:lang w:val="en-US"/>
         </w:rPr>
-        <w:t xml:space="preserve">s thoughts (Charmaz, 2014). Once tentative </w:t>
-      </w:r>
-      <w:r>
-        <w:rPr>
-          <w:lang w:val="en-US"/>
-        </w:rPr>
-        <w:t>categories were established</w:t>
-      </w:r>
-      <w:r>
-        <w:rPr>
-          <w:lang w:val="en-US"/>
-        </w:rPr>
-        <w:t xml:space="preserve"> using the coding process, </w:t>
-      </w:r>
-      <w:r>
-        <w:rPr>
-          <w:lang w:val="en-US"/>
-        </w:rPr>
-        <w:t>theoretical sampling was applied</w:t>
-      </w:r>
-      <w:r>
-        <w:rPr>
-          <w:lang w:val="en-US"/>
-        </w:rPr>
-        <w:t>, i.e.</w:t>
+        <w:t>s thoughts (Charmaz, 2014). Once tentative categories were established using the coding process, theoretical sampling was applied, i.e.</w:t>
       </w:r>
       <w:r>
         <w:rPr>
@@ -6273,19 +6207,7 @@
         <w:rPr>
           <w:lang w:val="en-US"/>
         </w:rPr>
-        <w:t xml:space="preserve">After reaching theoretical saturation, the point where new data no longer yields new insights (Charmaz, 2014), the memos and categories </w:t>
-      </w:r>
-      <w:r>
-        <w:rPr>
-          <w:lang w:val="en-US"/>
-        </w:rPr>
-        <w:t>were utilized</w:t>
-      </w:r>
-      <w:r>
-        <w:rPr>
-          <w:lang w:val="en-US"/>
-        </w:rPr>
-        <w:t xml:space="preserve"> to write the concrete arguments that form the basis for the new theoretical contribution (Charmaz, 2014). </w:t>
+        <w:t xml:space="preserve">After reaching theoretical saturation, the point where new data no longer yields new insights (Charmaz, 2014), the memos and categories were utilized to write the concrete arguments that form the basis for the new theoretical contribution (Charmaz, 2014). </w:t>
       </w:r>
     </w:p>
     <w:p>
@@ -6347,19 +6269,7 @@
         <w:rPr>
           <w:lang w:val="en-US"/>
         </w:rPr>
-        <w:t xml:space="preserve">In pursuit of the research question, top managers and experts in the </w:t>
-      </w:r>
-      <w:r>
-        <w:rPr>
-          <w:lang w:val="en-US"/>
-        </w:rPr>
-        <w:t>field were interviewed</w:t>
-      </w:r>
-      <w:r>
-        <w:rPr>
-          <w:lang w:val="en-US"/>
-        </w:rPr>
-        <w:t>. To find relevant candidates for the first group, the marketing managers</w:t>
+        <w:t>In pursuit of the research question, top managers and experts in the field were interviewed. To find relevant candidates for the first group, the marketing managers</w:t>
       </w:r>
       <w:r>
         <w:rPr>
@@ -6373,13 +6283,7 @@
         <w:rPr>
           <w:lang w:val="en-US"/>
         </w:rPr>
-        <w:t xml:space="preserve"> a slightly wider scope than just those with the formal </w:t>
-      </w:r>
-      <w:r>
-        <w:rPr>
-          <w:lang w:val="en-US"/>
-        </w:rPr>
-        <w:t>title was chosen</w:t>
+        <w:t xml:space="preserve"> a slightly wider scope than just those with the formal title was chosen</w:t>
       </w:r>
       <w:commentRangeStart w:id="94"/>
       <w:r>
@@ -6409,19 +6313,7 @@
           <w:lang w:val="en-US"/>
         </w:rPr>
         <w:lastRenderedPageBreak/>
-        <w:t xml:space="preserve">consists of AI experts; </w:t>
-      </w:r>
-      <w:r>
-        <w:rPr>
-          <w:lang w:val="en-US"/>
-        </w:rPr>
-        <w:t>they were selected based on knowledge</w:t>
-      </w:r>
-      <w:r>
-        <w:rPr>
-          <w:lang w:val="en-US"/>
-        </w:rPr>
-        <w:t xml:space="preserve"> of AI and expertise in implementing and rolling out AI systems. This group contains both technical leaders and technical consultants. </w:t>
+        <w:t xml:space="preserve">consists of AI experts; they were selected based on knowledge of AI and expertise in implementing and rolling out AI systems. This group contains both technical leaders and technical consultants. </w:t>
       </w:r>
     </w:p>
     <w:p>
@@ -6525,13 +6417,7 @@
         <w:rPr>
           <w:lang w:val="en-US"/>
         </w:rPr>
-        <w:t xml:space="preserve"> (</w:t>
-      </w:r>
-      <w:r>
-        <w:rPr>
-          <w:lang w:val="en-US"/>
-        </w:rPr>
-        <w:t>Charmaz, 2014</w:t>
+        <w:t xml:space="preserve"> (Charmaz, 2014</w:t>
       </w:r>
       <w:commentRangeEnd w:id="95"/>
       <w:r>
@@ -6570,43 +6456,25 @@
         <w:commentReference w:id="104"/>
       </w:r>
       <w:r>
-        <w:t xml:space="preserve">snowball sampling (Parker et al., 2019) </w:t>
-      </w:r>
-      <w:r>
-        <w:t>was used to identify</w:t>
-      </w:r>
-      <w:r>
-        <w:t xml:space="preserve"> interview participants</w:t>
-      </w:r>
-      <w:r>
-        <w:rPr>
-          <w:lang w:val="en-US"/>
-        </w:rPr>
-        <w:t xml:space="preserve">. The </w:t>
-      </w:r>
-      <w:r>
-        <w:rPr>
-          <w:lang w:val="en-US"/>
-        </w:rPr>
-        <w:t>sampling started with</w:t>
-      </w:r>
-      <w:r>
-        <w:rPr>
-          <w:lang w:val="en-US"/>
-        </w:rPr>
-        <w:t xml:space="preserve"> the researcher's personal network, relying mainly on LinkedIn; candidates were selected when their roles matched the selection criteria. Since the sampling </w:t>
-      </w:r>
-      <w:r>
-        <w:rPr>
-          <w:lang w:val="en-US"/>
-        </w:rPr>
-        <w:t>universe was already narrow</w:t>
-      </w:r>
-      <w:r>
-        <w:rPr>
-          <w:lang w:val="en-US"/>
-        </w:rPr>
-        <w:t xml:space="preserve"> and access might be limited, n</w:t>
+        <w:t>snowball sampling (Parker et al., 2019) was used to identify interview participants</w:t>
+      </w:r>
+      <w:r>
+        <w:rPr>
+          <w:lang w:val="en-US"/>
+        </w:rPr>
+        <w:t xml:space="preserve">. The sampling started with the researcher's personal network, relying mainly on LinkedIn; candidates were selected when their roles matched the selection criteria. Since the sampling universe was already narrow and access </w:t>
+      </w:r>
+      <w:r>
+        <w:rPr>
+          <w:lang w:val="en-US"/>
+        </w:rPr>
+        <w:t xml:space="preserve">is </w:t>
+      </w:r>
+      <w:r>
+        <w:rPr>
+          <w:lang w:val="en-US"/>
+        </w:rPr>
+        <w:t>limited, n</w:t>
       </w:r>
       <w:commentRangeStart w:id="105"/>
       <w:commentRangeStart w:id="106"/>
@@ -6620,19 +6488,7 @@
         <w:rPr>
           <w:lang w:val="en-US"/>
         </w:rPr>
-        <w:t xml:space="preserve">o further selection </w:t>
-      </w:r>
-      <w:r>
-        <w:rPr>
-          <w:lang w:val="en-US"/>
-        </w:rPr>
-        <w:t>criteria were applied</w:t>
-      </w:r>
-      <w:r>
-        <w:rPr>
-          <w:lang w:val="en-US"/>
-        </w:rPr>
-        <w:t xml:space="preserve"> to potential participants.</w:t>
+        <w:t>o further selection criteria were applied to potential participants.</w:t>
       </w:r>
       <w:commentRangeEnd w:id="109"/>
       <w:r>
@@ -6731,19 +6587,7 @@
         <w:rPr>
           <w:lang w:val="en-US"/>
         </w:rPr>
-        <w:t xml:space="preserve"> about the participant’s role and </w:t>
-      </w:r>
-      <w:r>
-        <w:rPr>
-          <w:lang w:val="en-US"/>
-        </w:rPr>
-        <w:t>organization were noted</w:t>
-      </w:r>
-      <w:r>
-        <w:rPr>
-          <w:lang w:val="en-US"/>
-        </w:rPr>
-        <w:t xml:space="preserve"> to facilitate analysis of insights and potential limitations derived from the sample distribution. </w:t>
+        <w:t xml:space="preserve"> about the participant’s role and organization were noted to facilitate analysis of insights and potential limitations derived from the sample distribution. </w:t>
       </w:r>
       <w:r>
         <w:rPr>

</xml_diff>